<commit_message>
color coding changelog section
</commit_message>
<xml_diff>
--- a/TyrantAPICommander_Documentation_EN.docx
+++ b/TyrantAPICommander_Documentation_EN.docx
@@ -2180,6 +2180,20 @@
           <ns0:sz ns0:val="16"/>
           <ns0:szCs ns0:val="16"/>
         </ns0:rPr>
+        <ns0:t xml:space="preserve">    ├── skills_set.xml</ns0:t>
+      </ns0:r>
+    </ns0:p>
+    <ns0:p>
+      <ns0:pPr>
+        <ns0:spacing ns0:after="0" ns0:before="0"/>
+      </ns0:pPr>
+      <ns0:r>
+        <ns0:rPr>
+          <ns0:rFonts ns0:ascii="Courier New" ns0:cs="Courier New" ns0:eastAsia="Courier New" ns0:hAnsi="Courier New"/>
+          <ns0:color ns0:val="595959"/>
+          <ns0:sz ns0:val="16"/>
+          <ns0:szCs ns0:val="16"/>
+        </ns0:rPr>
         <ns0:t xml:space="preserve">    ├── achievements.xml</ns0:t>
       </ns0:r>
     </ns0:p>
@@ -2208,6 +2222,20 @@
           <ns0:sz ns0:val="16"/>
           <ns0:szCs ns0:val="16"/>
         </ns0:rPr>
+        <ns0:t xml:space="preserve">    ├── levels.xml</ns0:t>
+      </ns0:r>
+    </ns0:p>
+    <ns0:p>
+      <ns0:pPr>
+        <ns0:spacing ns0:after="0" ns0:before="0"/>
+      </ns0:pPr>
+      <ns0:r>
+        <ns0:rPr>
+          <ns0:rFonts ns0:ascii="Courier New" ns0:cs="Courier New" ns0:eastAsia="Courier New" ns0:hAnsi="Courier New"/>
+          <ns0:color ns0:val="595959"/>
+          <ns0:sz ns0:val="16"/>
+          <ns0:szCs ns0:val="16"/>
+        </ns0:rPr>
         <ns0:t xml:space="preserve">    ├── events.xml</ns0:t>
       </ns0:r>
     </ns0:p>
@@ -2222,7 +2250,7 @@
           <ns0:sz ns0:val="16"/>
           <ns0:szCs ns0:val="16"/>
         </ns0:rPr>
-        <ns0:t xml:space="preserve">    battle_events_h52.xml</ns0:t>
+        <ns0:t xml:space="preserve">    ├── battle_events_h52.xml</ns0:t>
       </ns0:r>
     </ns0:p>
     <ns0:p>
@@ -2236,7 +2264,7 @@
           <ns0:sz ns0:val="16"/>
           <ns0:szCs ns0:val="16"/>
         </ns0:rPr>
-        <ns0:t xml:space="preserve">    raids_x42.xml</ns0:t>
+        <ns0:t xml:space="preserve">    ├── raids_x42.xml</ns0:t>
       </ns0:r>
     </ns0:p>
     <ns0:p>
@@ -2250,7 +2278,7 @@
           <ns0:sz ns0:val="16"/>
           <ns0:szCs ns0:val="16"/>
         </ns0:rPr>
-        <ns0:t xml:space="preserve">    faction_wars_fp3.xml</ns0:t>
+        <ns0:t xml:space="preserve">    ├── faction_wars_fp3.xml</ns0:t>
       </ns0:r>
     </ns0:p>
     <ns0:p>
@@ -2264,7 +2292,7 @@
           <ns0:sz ns0:val="16"/>
           <ns0:szCs ns0:val="16"/>
         </ns0:rPr>
-        <ns0:t xml:space="preserve">    event_box.xml</ns0:t>
+        <ns0:t xml:space="preserve">    ├── event_box.xml</ns0:t>
       </ns0:r>
     </ns0:p>
     <ns0:p>
@@ -2278,7 +2306,7 @@
           <ns0:sz ns0:val="16"/>
           <ns0:szCs ns0:val="16"/>
         </ns0:rPr>
-        <ns0:t xml:space="preserve">    conquest.xml</ns0:t>
+        <ns0:t xml:space="preserve">    ├── conquest.xml</ns0:t>
       </ns0:r>
     </ns0:p>
     <ns0:p>
@@ -2292,7 +2320,7 @@
           <ns0:sz ns0:val="16"/>
           <ns0:szCs ns0:val="16"/>
         </ns0:rPr>
-        <ns0:t xml:space="preserve">    mini_packs_36i.xml</ns0:t>
+        <ns0:t xml:space="preserve">    ├── mini_packs_36i.xml</ns0:t>
       </ns0:r>
     </ns0:p>
     <ns0:p>
@@ -2306,7 +2334,7 @@
           <ns0:sz ns0:val="16"/>
           <ns0:szCs ns0:val="16"/>
         </ns0:rPr>
-        <ns0:t xml:space="preserve">    assetbundles5_4_2.xml</ns0:t>
+        <ns0:t xml:space="preserve">    ├── assetbundles5_4_2.xml</ns0:t>
       </ns0:r>
     </ns0:p>
     <ns0:p>
@@ -2320,7 +2348,7 @@
           <ns0:sz ns0:val="16"/>
           <ns0:szCs ns0:val="16"/>
         </ns0:rPr>
-        <ns0:t xml:space="preserve">    assetbundles4_6.xml</ns0:t>
+        <ns0:t xml:space="preserve">    ├── assetbundles4_6.xml</ns0:t>
       </ns0:r>
     </ns0:p>
     <ns0:p>
@@ -2363,6 +2391,20 @@
           <ns0:szCs ns0:val="16"/>
         </ns0:rPr>
         <ns0:t xml:space="preserve">    ├── cards_section_*.xml            ← Card database</ns0:t>
+      </ns0:r>
+    </ns0:p>
+    <ns0:p>
+      <ns0:pPr>
+        <ns0:spacing ns0:after="0" ns0:before="0"/>
+      </ns0:pPr>
+      <ns0:r>
+        <ns0:rPr>
+          <ns0:rFonts ns0:ascii="Courier New" ns0:cs="Courier New" ns0:eastAsia="Courier New" ns0:hAnsi="Courier New"/>
+          <ns0:color ns0:val="595959"/>
+          <ns0:sz ns0:val="16"/>
+          <ns0:szCs ns0:val="16"/>
+        </ns0:rPr>
+        <ns0:t xml:space="preserve">    ├── bges.txt                       ← BGE list (from tyrant_optimize repo)</ns0:t>
       </ns0:r>
     </ns0:p>
     <ns0:p>
@@ -33157,7 +33199,7 @@
                 <ns0:rFonts ns0:ascii="Arial" ns0:cs="Arial" ns0:hAnsi="Arial"/>
                 <ns0:b/>
                 <ns0:bCs/>
-                <ns0:color ns0:val="1F4E79"/>
+                <ns0:color ns0:val="375623"/>
                 <ns0:sz ns0:val="18"/>
                 <ns0:szCs ns0:val="18"/>
               </ns0:rPr>
@@ -33208,6 +33250,408 @@
               <ns0:right ns0:val="single" ns0:color="CCCCCC" ns0:sz="1"/>
             </ns0:tcBorders>
             <ns0:shd ns0:fill="E2EFDA" ns0:val="clear"/>
+            <ns0:tcMar>
+              <ns0:top ns0:type="dxa" ns0:w="80"/>
+              <ns0:left ns0:type="dxa" ns0:w="120"/>
+              <ns0:bottom ns0:type="dxa" ns0:w="80"/>
+              <ns0:right ns0:type="dxa" ns0:w="120"/>
+            </ns0:tcMar>
+          </ns0:tcPr>
+          <ns0:p>
+            <ns0:pPr>
+              <ns0:spacing ns0:after="40" ns0:before="40"/>
+            </ns0:pPr>
+            <ns0:r>
+              <ns0:rPr>
+                <ns0:rFonts ns0:ascii="Arial" ns0:cs="Arial" ns0:hAnsi="Arial"/>
+                <ns0:b/>
+                <ns0:bCs/>
+                <ns0:color ns0:val="375623"/>
+                <ns0:sz ns0:val="18"/>
+                <ns0:szCs ns0:val="18"/>
+              </ns0:rPr>
+              <ns0:t xml:space="preserve">NEW</ns0:t>
+            </ns0:r>
+          </ns0:p>
+        </ns0:tc>
+        <ns0:tc>
+          <ns0:tcPr>
+            <ns0:tcW ns0:type="dxa" ns0:w="8460"/>
+            <ns0:tcBorders>
+              <ns0:top ns0:val="single" ns0:color="CCCCCC" ns0:sz="1"/>
+              <ns0:left ns0:val="single" ns0:color="CCCCCC" ns0:sz="1"/>
+              <ns0:bottom ns0:val="single" ns0:color="CCCCCC" ns0:sz="1"/>
+              <ns0:right ns0:val="single" ns0:color="CCCCCC" ns0:sz="1"/>
+            </ns0:tcBorders>
+            <ns0:shd ns0:fill="FFFFFF" ns0:val="clear"/>
+            <ns0:tcMar>
+              <ns0:top ns0:type="dxa" ns0:w="80"/>
+              <ns0:left ns0:type="dxa" ns0:w="120"/>
+              <ns0:bottom ns0:type="dxa" ns0:w="80"/>
+              <ns0:right ns0:type="dxa" ns0:w="120"/>
+            </ns0:tcMar>
+          </ns0:tcPr>
+          <ns0:p>
+            <ns0:pPr>
+              <ns0:spacing ns0:after="40" ns0:before="40"/>
+            </ns0:pPr>
+            <ns0:r>
+              <ns0:rPr>
+                <ns0:rFonts ns0:ascii="Arial" ns0:cs="Arial" ns0:hAnsi="Arial"/>
+                <ns0:sz ns0:val="18"/>
+                <ns0:szCs ns0:val="18"/>
+              </ns0:rPr>
+              <ns0:t xml:space="preserve">Challenge analysis log export/challenge_analysis.txt — per battle: complete deck, played cards, verdict, skillcheck, enemy; detail line (copies_in_deck, first_in_hand_turn, first_played_turn, pool, kills, damage, flags, action tally); PROGRESS lines with server progress before/after (COUNTED / NOT COUNTED)</ns0:t>
+            </ns0:r>
+          </ns0:p>
+        </ns0:tc>
+      </ns0:tr>
+      <ns0:tr>
+        <ns0:tc>
+          <ns0:tcPr>
+            <ns0:tcW ns0:type="dxa" ns0:w="900"/>
+            <ns0:tcBorders>
+              <ns0:top ns0:val="single" ns0:color="CCCCCC" ns0:sz="1"/>
+              <ns0:left ns0:val="single" ns0:color="CCCCCC" ns0:sz="1"/>
+              <ns0:bottom ns0:val="single" ns0:color="CCCCCC" ns0:sz="1"/>
+              <ns0:right ns0:val="single" ns0:color="CCCCCC" ns0:sz="1"/>
+            </ns0:tcBorders>
+            <ns0:shd ns0:fill="E2EFDA" ns0:val="clear"/>
+            <ns0:tcMar>
+              <ns0:top ns0:type="dxa" ns0:w="80"/>
+              <ns0:left ns0:type="dxa" ns0:w="120"/>
+              <ns0:bottom ns0:type="dxa" ns0:w="80"/>
+              <ns0:right ns0:type="dxa" ns0:w="120"/>
+            </ns0:tcMar>
+          </ns0:tcPr>
+          <ns0:p>
+            <ns0:pPr>
+              <ns0:spacing ns0:after="40" ns0:before="40"/>
+            </ns0:pPr>
+            <ns0:r>
+              <ns0:rPr>
+                <ns0:rFonts ns0:ascii="Arial" ns0:cs="Arial" ns0:hAnsi="Arial"/>
+                <ns0:b/>
+                <ns0:bCs/>
+                <ns0:color ns0:val="375623"/>
+                <ns0:sz ns0:val="18"/>
+                <ns0:szCs ns0:val="18"/>
+              </ns0:rPr>
+              <ns0:t xml:space="preserve">NEW</ns0:t>
+            </ns0:r>
+          </ns0:p>
+        </ns0:tc>
+        <ns0:tc>
+          <ns0:tcPr>
+            <ns0:tcW ns0:type="dxa" ns0:w="8460"/>
+            <ns0:tcBorders>
+              <ns0:top ns0:val="single" ns0:color="CCCCCC" ns0:sz="1"/>
+              <ns0:left ns0:val="single" ns0:color="CCCCCC" ns0:sz="1"/>
+              <ns0:bottom ns0:val="single" ns0:color="CCCCCC" ns0:sz="1"/>
+              <ns0:right ns0:val="single" ns0:color="CCCCCC" ns0:sz="1"/>
+            </ns0:tcBorders>
+            <ns0:shd ns0:fill="FFFFFF" ns0:val="clear"/>
+            <ns0:tcMar>
+              <ns0:top ns0:type="dxa" ns0:w="80"/>
+              <ns0:left ns0:type="dxa" ns0:w="120"/>
+              <ns0:bottom ns0:type="dxa" ns0:w="80"/>
+              <ns0:right ns0:type="dxa" ns0:w="120"/>
+            </ns0:tcMar>
+          </ns0:tcPr>
+          <ns0:p>
+            <ns0:pPr>
+              <ns0:spacing ns0:after="40" ns0:before="40"/>
+            </ns0:pPr>
+            <ns0:r>
+              <ns0:rPr>
+                <ns0:rFonts ns0:ascii="Arial" ns0:cs="Arial" ns0:hAnsi="Arial"/>
+                <ns0:sz ns0:val="18"/>
+                <ns0:szCs ns0:val="18"/>
+              </ns0:rPr>
+              <ns0:t xml:space="preserve">[VERIFY] console line after the deck update — commander and cards as stored on the server</ns0:t>
+            </ns0:r>
+          </ns0:p>
+        </ns0:tc>
+      </ns0:tr>
+      <ns0:tr>
+        <ns0:tc>
+          <ns0:tcPr>
+            <ns0:tcW ns0:type="dxa" ns0:w="900"/>
+            <ns0:tcBorders>
+              <ns0:top ns0:val="single" ns0:color="CCCCCC" ns0:sz="1"/>
+              <ns0:left ns0:val="single" ns0:color="CCCCCC" ns0:sz="1"/>
+              <ns0:bottom ns0:val="single" ns0:color="CCCCCC" ns0:sz="1"/>
+              <ns0:right ns0:val="single" ns0:color="CCCCCC" ns0:sz="1"/>
+            </ns0:tcBorders>
+            <ns0:shd ns0:fill="E2EFDA" ns0:val="clear"/>
+            <ns0:tcMar>
+              <ns0:top ns0:type="dxa" ns0:w="80"/>
+              <ns0:left ns0:type="dxa" ns0:w="120"/>
+              <ns0:bottom ns0:type="dxa" ns0:w="80"/>
+              <ns0:right ns0:type="dxa" ns0:w="120"/>
+            </ns0:tcMar>
+          </ns0:tcPr>
+          <ns0:p>
+            <ns0:pPr>
+              <ns0:spacing ns0:after="40" ns0:before="40"/>
+            </ns0:pPr>
+            <ns0:r>
+              <ns0:rPr>
+                <ns0:rFonts ns0:ascii="Arial" ns0:cs="Arial" ns0:hAnsi="Arial"/>
+                <ns0:b/>
+                <ns0:bCs/>
+                <ns0:color ns0:val="375623"/>
+                <ns0:sz ns0:val="18"/>
+                <ns0:szCs ns0:val="18"/>
+              </ns0:rPr>
+              <ns0:t xml:space="preserve">NEW</ns0:t>
+            </ns0:r>
+          </ns0:p>
+        </ns0:tc>
+        <ns0:tc>
+          <ns0:tcPr>
+            <ns0:tcW ns0:type="dxa" ns0:w="8460"/>
+            <ns0:tcBorders>
+              <ns0:top ns0:val="single" ns0:color="CCCCCC" ns0:sz="1"/>
+              <ns0:left ns0:val="single" ns0:color="CCCCCC" ns0:sz="1"/>
+              <ns0:bottom ns0:val="single" ns0:color="CCCCCC" ns0:sz="1"/>
+              <ns0:right ns0:val="single" ns0:color="CCCCCC" ns0:sz="1"/>
+            </ns0:tcBorders>
+            <ns0:shd ns0:fill="FFFFFF" ns0:val="clear"/>
+            <ns0:tcMar>
+              <ns0:top ns0:type="dxa" ns0:w="80"/>
+              <ns0:left ns0:type="dxa" ns0:w="120"/>
+              <ns0:bottom ns0:type="dxa" ns0:w="80"/>
+              <ns0:right ns0:type="dxa" ns0:w="120"/>
+            </ns0:tcMar>
+          </ns0:tcPr>
+          <ns0:p>
+            <ns0:pPr>
+              <ns0:spacing ns0:after="40" ns0:before="40"/>
+            </ns0:pPr>
+            <ns0:r>
+              <ns0:rPr>
+                <ns0:rFonts ns0:ascii="Arial" ns0:cs="Arial" ns0:hAnsi="Arial"/>
+                <ns0:sz ns0:val="18"/>
+                <ns0:szCs ns0:val="18"/>
+              </ns0:rPr>
+              <ns0:t xml:space="preserve">API error log export/api_errors.log (_write_api_error_log) — network errors (every retry + final), empty responses, "please wait", failed init, mission blacklist/fallback failures, failed arena battle start; format: timestamp | account | API call | error type | detail</ns0:t>
+            </ns0:r>
+          </ns0:p>
+        </ns0:tc>
+      </ns0:tr>
+      <ns0:tr>
+        <ns0:tc>
+          <ns0:tcPr>
+            <ns0:tcW ns0:type="dxa" ns0:w="900"/>
+            <ns0:tcBorders>
+              <ns0:top ns0:val="single" ns0:color="CCCCCC" ns0:sz="1"/>
+              <ns0:left ns0:val="single" ns0:color="CCCCCC" ns0:sz="1"/>
+              <ns0:bottom ns0:val="single" ns0:color="CCCCCC" ns0:sz="1"/>
+              <ns0:right ns0:val="single" ns0:color="CCCCCC" ns0:sz="1"/>
+            </ns0:tcBorders>
+            <ns0:shd ns0:fill="E2EFDA" ns0:val="clear"/>
+            <ns0:tcMar>
+              <ns0:top ns0:type="dxa" ns0:w="80"/>
+              <ns0:left ns0:type="dxa" ns0:w="120"/>
+              <ns0:bottom ns0:type="dxa" ns0:w="80"/>
+              <ns0:right ns0:type="dxa" ns0:w="120"/>
+            </ns0:tcMar>
+          </ns0:tcPr>
+          <ns0:p>
+            <ns0:pPr>
+              <ns0:spacing ns0:after="40" ns0:before="40"/>
+            </ns0:pPr>
+            <ns0:r>
+              <ns0:rPr>
+                <ns0:rFonts ns0:ascii="Arial" ns0:cs="Arial" ns0:hAnsi="Arial"/>
+                <ns0:b/>
+                <ns0:bCs/>
+                <ns0:color ns0:val="375623"/>
+                <ns0:sz ns0:val="18"/>
+                <ns0:szCs ns0:val="18"/>
+              </ns0:rPr>
+              <ns0:t xml:space="preserve">NEW</ns0:t>
+            </ns0:r>
+          </ns0:p>
+        </ns0:tc>
+        <ns0:tc>
+          <ns0:tcPr>
+            <ns0:tcW ns0:type="dxa" ns0:w="8460"/>
+            <ns0:tcBorders>
+              <ns0:top ns0:val="single" ns0:color="CCCCCC" ns0:sz="1"/>
+              <ns0:left ns0:val="single" ns0:color="CCCCCC" ns0:sz="1"/>
+              <ns0:bottom ns0:val="single" ns0:color="CCCCCC" ns0:sz="1"/>
+              <ns0:right ns0:val="single" ns0:color="CCCCCC" ns0:sz="1"/>
+            </ns0:tcBorders>
+            <ns0:shd ns0:fill="FFFFFF" ns0:val="clear"/>
+            <ns0:tcMar>
+              <ns0:top ns0:type="dxa" ns0:w="80"/>
+              <ns0:left ns0:type="dxa" ns0:w="120"/>
+              <ns0:bottom ns0:type="dxa" ns0:w="80"/>
+              <ns0:right ns0:type="dxa" ns0:w="120"/>
+            </ns0:tcMar>
+          </ns0:tcPr>
+          <ns0:p>
+            <ns0:pPr>
+              <ns0:spacing ns0:after="40" ns0:before="40"/>
+            </ns0:pPr>
+            <ns0:r>
+              <ns0:rPr>
+                <ns0:rFonts ns0:ascii="Arial" ns0:cs="Arial" ns0:hAnsi="Arial"/>
+                <ns0:sz ns0:val="18"/>
+                <ns0:szCs ns0:val="18"/>
+              </ns0:rPr>
+              <ns0:t xml:space="preserve">outdatedIDs change log export/outdatedIDs_log.txt — manual add/remove and automatic removal of equipped cards; outdatedIDs.txt is now written atomically (.bak backup, temp file + os.replace) via _write_outdated_ids_safe</ns0:t>
+            </ns0:r>
+          </ns0:p>
+        </ns0:tc>
+      </ns0:tr>
+      <ns0:tr>
+        <ns0:tc>
+          <ns0:tcPr>
+            <ns0:tcW ns0:type="dxa" ns0:w="900"/>
+            <ns0:tcBorders>
+              <ns0:top ns0:val="single" ns0:color="CCCCCC" ns0:sz="1"/>
+              <ns0:left ns0:val="single" ns0:color="CCCCCC" ns0:sz="1"/>
+              <ns0:bottom ns0:val="single" ns0:color="CCCCCC" ns0:sz="1"/>
+              <ns0:right ns0:val="single" ns0:color="CCCCCC" ns0:sz="1"/>
+            </ns0:tcBorders>
+            <ns0:shd ns0:fill="E2EFDA" ns0:val="clear"/>
+            <ns0:tcMar>
+              <ns0:top ns0:type="dxa" ns0:w="80"/>
+              <ns0:left ns0:type="dxa" ns0:w="120"/>
+              <ns0:bottom ns0:type="dxa" ns0:w="80"/>
+              <ns0:right ns0:type="dxa" ns0:w="120"/>
+            </ns0:tcMar>
+          </ns0:tcPr>
+          <ns0:p>
+            <ns0:pPr>
+              <ns0:spacing ns0:after="40" ns0:before="40"/>
+            </ns0:pPr>
+            <ns0:r>
+              <ns0:rPr>
+                <ns0:rFonts ns0:ascii="Arial" ns0:cs="Arial" ns0:hAnsi="Arial"/>
+                <ns0:b/>
+                <ns0:bCs/>
+                <ns0:color ns0:val="375623"/>
+                <ns0:sz ns0:val="18"/>
+                <ns0:szCs ns0:val="18"/>
+              </ns0:rPr>
+              <ns0:t xml:space="preserve">NEW</ns0:t>
+            </ns0:r>
+          </ns0:p>
+        </ns0:tc>
+        <ns0:tc>
+          <ns0:tcPr>
+            <ns0:tcW ns0:type="dxa" ns0:w="8460"/>
+            <ns0:tcBorders>
+              <ns0:top ns0:val="single" ns0:color="CCCCCC" ns0:sz="1"/>
+              <ns0:left ns0:val="single" ns0:color="CCCCCC" ns0:sz="1"/>
+              <ns0:bottom ns0:val="single" ns0:color="CCCCCC" ns0:sz="1"/>
+              <ns0:right ns0:val="single" ns0:color="CCCCCC" ns0:sz="1"/>
+            </ns0:tcBorders>
+            <ns0:shd ns0:fill="FFFFFF" ns0:val="clear"/>
+            <ns0:tcMar>
+              <ns0:top ns0:type="dxa" ns0:w="80"/>
+              <ns0:left ns0:type="dxa" ns0:w="120"/>
+              <ns0:bottom ns0:type="dxa" ns0:w="80"/>
+              <ns0:right ns0:type="dxa" ns0:w="120"/>
+            </ns0:tcMar>
+          </ns0:tcPr>
+          <ns0:p>
+            <ns0:pPr>
+              <ns0:spacing ns0:after="40" ns0:before="40"/>
+            </ns0:pPr>
+            <ns0:r>
+              <ns0:rPr>
+                <ns0:rFonts ns0:ascii="Arial" ns0:cs="Arial" ns0:hAnsi="Arial"/>
+                <ns0:sz ns0:val="18"/>
+                <ns0:szCs ns0:val="18"/>
+              </ns0:rPr>
+              <ns0:t xml:space="preserve">Arena guild fallback — if only own-guild members remain as targets, their live decks are fetched (_fetch_enemy_deck_live) and pre-simmed; the best live-deck target is used unless a known-deck target scored higher</ns0:t>
+            </ns0:r>
+          </ns0:p>
+        </ns0:tc>
+      </ns0:tr>
+      <ns0:tr>
+        <ns0:tc>
+          <ns0:tcPr>
+            <ns0:tcW ns0:type="dxa" ns0:w="900"/>
+            <ns0:tcBorders>
+              <ns0:top ns0:val="single" ns0:color="CCCCCC" ns0:sz="1"/>
+              <ns0:left ns0:val="single" ns0:color="CCCCCC" ns0:sz="1"/>
+              <ns0:bottom ns0:val="single" ns0:color="CCCCCC" ns0:sz="1"/>
+              <ns0:right ns0:val="single" ns0:color="CCCCCC" ns0:sz="1"/>
+            </ns0:tcBorders>
+            <ns0:shd ns0:fill="E2EFDA" ns0:val="clear"/>
+            <ns0:tcMar>
+              <ns0:top ns0:type="dxa" ns0:w="80"/>
+              <ns0:left ns0:type="dxa" ns0:w="120"/>
+              <ns0:bottom ns0:type="dxa" ns0:w="80"/>
+              <ns0:right ns0:type="dxa" ns0:w="120"/>
+            </ns0:tcMar>
+          </ns0:tcPr>
+          <ns0:p>
+            <ns0:pPr>
+              <ns0:spacing ns0:after="40" ns0:before="40"/>
+            </ns0:pPr>
+            <ns0:r>
+              <ns0:rPr>
+                <ns0:rFonts ns0:ascii="Arial" ns0:cs="Arial" ns0:hAnsi="Arial"/>
+                <ns0:b/>
+                <ns0:bCs/>
+                <ns0:color ns0:val="375623"/>
+                <ns0:sz ns0:val="18"/>
+                <ns0:szCs ns0:val="18"/>
+              </ns0:rPr>
+              <ns0:t xml:space="preserve">NEW</ns0:t>
+            </ns0:r>
+          </ns0:p>
+        </ns0:tc>
+        <ns0:tc>
+          <ns0:tcPr>
+            <ns0:tcW ns0:type="dxa" ns0:w="8460"/>
+            <ns0:tcBorders>
+              <ns0:top ns0:val="single" ns0:color="CCCCCC" ns0:sz="1"/>
+              <ns0:left ns0:val="single" ns0:color="CCCCCC" ns0:sz="1"/>
+              <ns0:bottom ns0:val="single" ns0:color="CCCCCC" ns0:sz="1"/>
+              <ns0:right ns0:val="single" ns0:color="CCCCCC" ns0:sz="1"/>
+            </ns0:tcBorders>
+            <ns0:shd ns0:fill="FFFFFF" ns0:val="clear"/>
+            <ns0:tcMar>
+              <ns0:top ns0:type="dxa" ns0:w="80"/>
+              <ns0:left ns0:type="dxa" ns0:w="120"/>
+              <ns0:bottom ns0:type="dxa" ns0:w="80"/>
+              <ns0:right ns0:type="dxa" ns0:w="120"/>
+            </ns0:tcMar>
+          </ns0:tcPr>
+          <ns0:p>
+            <ns0:pPr>
+              <ns0:spacing ns0:after="40" ns0:before="40"/>
+            </ns0:pPr>
+            <ns0:r>
+              <ns0:rPr>
+                <ns0:rFonts ns0:ascii="Arial" ns0:cs="Arial" ns0:hAnsi="Arial"/>
+                <ns0:sz ns0:val="18"/>
+                <ns0:szCs ns0:val="18"/>
+              </ns0:rPr>
+              <ns0:t xml:space="preserve">Code map — section banners [S01]–[S24], [T01]–[T04], [M01]–[M02] and a CODE MAP in the module docstring; "# FIX:" comments mark bug fixes</ns0:t>
+            </ns0:r>
+          </ns0:p>
+        </ns0:tc>
+      </ns0:tr>
+      <ns0:tr>
+        <ns0:tc>
+          <ns0:tcPr>
+            <ns0:tcW ns0:type="dxa" ns0:w="900"/>
+            <ns0:tcBorders>
+              <ns0:top ns0:val="single" ns0:color="CCCCCC" ns0:sz="1"/>
+              <ns0:left ns0:val="single" ns0:color="CCCCCC" ns0:sz="1"/>
+              <ns0:bottom ns0:val="single" ns0:color="CCCCCC" ns0:sz="1"/>
+              <ns0:right ns0:val="single" ns0:color="CCCCCC" ns0:sz="1"/>
+            </ns0:tcBorders>
+            <ns0:shd ns0:fill="D5E8F0" ns0:val="clear"/>
             <ns0:tcMar>
               <ns0:top ns0:type="dxa" ns0:w="80"/>
               <ns0:left ns0:type="dxa" ns0:w="120"/>
@@ -33228,7 +33672,7 @@
                 <ns0:sz ns0:val="18"/>
                 <ns0:szCs ns0:val="18"/>
               </ns0:rPr>
-              <ns0:t xml:space="preserve">NEW</ns0:t>
+              <ns0:t xml:space="preserve">FIX</ns0:t>
             </ns0:r>
           </ns0:p>
         </ns0:tc>
@@ -33259,7 +33703,7 @@
                 <ns0:sz ns0:val="18"/>
                 <ns0:szCs ns0:val="18"/>
               </ns0:rPr>
-              <ns0:t xml:space="preserve">Challenge analysis log export/challenge_analysis.txt — per battle: complete deck, played cards, verdict, skillcheck, enemy; detail line (copies_in_deck, first_in_hand_turn, first_played_turn, pool, kills, damage, flags, action tally); PROGRESS lines with server progress before/after (COUNTED / NOT COUNTED)</ns0:t>
+              <ns0:t xml:space="preserve">setDeckCards success check — the commander-only comparison counted a rejected deck as success whenever the commander was unchanged (e.g. Extreme step 8). Now the returned cards are compared with the sent cards; the server result_message is logged; on mismatch the challenge deck is aborted and pvp_challenge_issues.txt is written</ns0:t>
             </ns0:r>
           </ns0:p>
         </ns0:tc>
@@ -33274,7 +33718,7 @@
               <ns0:bottom ns0:val="single" ns0:color="CCCCCC" ns0:sz="1"/>
               <ns0:right ns0:val="single" ns0:color="CCCCCC" ns0:sz="1"/>
             </ns0:tcBorders>
-            <ns0:shd ns0:fill="E2EFDA" ns0:val="clear"/>
+            <ns0:shd ns0:fill="D5E8F0" ns0:val="clear"/>
             <ns0:tcMar>
               <ns0:top ns0:type="dxa" ns0:w="80"/>
               <ns0:left ns0:type="dxa" ns0:w="120"/>
@@ -33295,7 +33739,7 @@
                 <ns0:sz ns0:val="18"/>
                 <ns0:szCs ns0:val="18"/>
               </ns0:rPr>
-              <ns0:t xml:space="preserve">NEW</ns0:t>
+              <ns0:t xml:space="preserve">FIX</ns0:t>
             </ns0:r>
           </ns0:p>
         </ns0:tc>
@@ -33326,7 +33770,7 @@
                 <ns0:sz ns0:val="18"/>
                 <ns0:szCs ns0:val="18"/>
               </ns0:rPr>
-              <ns0:t xml:space="preserve">[VERIFY] console line after the deck update — commander and cards as stored on the server</ns0:t>
+              <ns0:t xml:space="preserve">Challenge card already in the start deck (only 1 owned) was added a second time — server answered "You do not have 2 of card X" and discarded the whole deck, so the challenge deck was never active (Rhilfen, Extreme step 8, since Flourish Turbine was added to the start deck). Copies of challenge cards are now removed from the base deck first and no id is sent more often than num_owned</ns0:t>
             </ns0:r>
           </ns0:p>
         </ns0:tc>
@@ -33341,7 +33785,7 @@
               <ns0:bottom ns0:val="single" ns0:color="CCCCCC" ns0:sz="1"/>
               <ns0:right ns0:val="single" ns0:color="CCCCCC" ns0:sz="1"/>
             </ns0:tcBorders>
-            <ns0:shd ns0:fill="E2EFDA" ns0:val="clear"/>
+            <ns0:shd ns0:fill="D5E8F0" ns0:val="clear"/>
             <ns0:tcMar>
               <ns0:top ns0:type="dxa" ns0:w="80"/>
               <ns0:left ns0:type="dxa" ns0:w="120"/>
@@ -33362,7 +33806,7 @@
                 <ns0:sz ns0:val="18"/>
                 <ns0:szCs ns0:val="18"/>
               </ns0:rPr>
-              <ns0:t xml:space="preserve">NEW</ns0:t>
+              <ns0:t xml:space="preserve">FIX</ns0:t>
             </ns0:r>
           </ns0:p>
         </ns0:tc>
@@ -33393,7 +33837,7 @@
                 <ns0:sz ns0:val="18"/>
                 <ns0:szCs ns0:val="18"/>
               </ns0:rPr>
-              <ns0:t xml:space="preserve">API error log export/api_errors.log (_write_api_error_log) — network errors (every retry + final), empty responses, "please wait", failed init, mission blacklist/fallback failures, failed arena battle start; format: timestamp | account | API call | error type | detail</ns0:t>
+              <ns0:t xml:space="preserve">Pool build — per-type copy count is capped at the pool list count (a pool of different cards gets one of each; previously the first card was taken up to pool_min times); a second pass tops up additional copies when pool_min is not reached; new-copy detection uses a counter</ns0:t>
             </ns0:r>
           </ns0:p>
         </ns0:tc>
@@ -33408,7 +33852,7 @@
               <ns0:bottom ns0:val="single" ns0:color="CCCCCC" ns0:sz="1"/>
               <ns0:right ns0:val="single" ns0:color="CCCCCC" ns0:sz="1"/>
             </ns0:tcBorders>
-            <ns0:shd ns0:fill="E2EFDA" ns0:val="clear"/>
+            <ns0:shd ns0:fill="D5E8F0" ns0:val="clear"/>
             <ns0:tcMar>
               <ns0:top ns0:type="dxa" ns0:w="80"/>
               <ns0:left ns0:type="dxa" ns0:w="120"/>
@@ -33429,7 +33873,7 @@
                 <ns0:sz ns0:val="18"/>
                 <ns0:szCs ns0:val="18"/>
               </ns0:rPr>
-              <ns0:t xml:space="preserve">NEW</ns0:t>
+              <ns0:t xml:space="preserve">FIX</ns0:t>
             </ns0:r>
           </ns0:p>
         </ns0:tc>
@@ -33460,7 +33904,7 @@
                 <ns0:sz ns0:val="18"/>
                 <ns0:szCs ns0:val="18"/>
               </ns0:rPr>
-              <ns0:t xml:space="preserve">outdatedIDs change log export/outdatedIDs_log.txt — manual add/remove and automatic removal of equipped cards; outdatedIDs.txt is now written atomically (.bak backup, temp file + os.replace) via _write_outdated_ids_safe</ns0:t>
+              <ns0:t xml:space="preserve">_restore_challenge_deck — success now also requires the returned cards to match; failed restore is logged as "Deck RESTORE not applied"</ns0:t>
             </ns0:r>
           </ns0:p>
         </ns0:tc>
@@ -33475,7 +33919,7 @@
               <ns0:bottom ns0:val="single" ns0:color="CCCCCC" ns0:sz="1"/>
               <ns0:right ns0:val="single" ns0:color="CCCCCC" ns0:sz="1"/>
             </ns0:tcBorders>
-            <ns0:shd ns0:fill="E2EFDA" ns0:val="clear"/>
+            <ns0:shd ns0:fill="D5E8F0" ns0:val="clear"/>
             <ns0:tcMar>
               <ns0:top ns0:type="dxa" ns0:w="80"/>
               <ns0:left ns0:type="dxa" ns0:w="120"/>
@@ -33496,7 +33940,7 @@
                 <ns0:sz ns0:val="18"/>
                 <ns0:szCs ns0:val="18"/>
               </ns0:rPr>
-              <ns0:t xml:space="preserve">NEW</ns0:t>
+              <ns0:t xml:space="preserve">FIX</ns0:t>
             </ns0:r>
           </ns0:p>
         </ns0:tc>
@@ -33527,7 +33971,7 @@
                 <ns0:sz ns0:val="18"/>
                 <ns0:szCs ns0:val="18"/>
               </ns0:rPr>
-              <ns0:t xml:space="preserve">Arena guild fallback — if only own-guild members remain as targets, their live decks are fetched (_fetch_enemy_deck_live) and pre-simmed; the best live-deck target is used unless a known-deck target scored higher</ns0:t>
+              <ns0:t xml:space="preserve">_verify_challenge_deck — pool-only steps (no commander/required card, e.g. Extreme step 8) were skipped, so the pool check never ran; pool_min steps are now included (warning + issue log)</ns0:t>
             </ns0:r>
           </ns0:p>
         </ns0:tc>
@@ -33542,7 +33986,7 @@
               <ns0:bottom ns0:val="single" ns0:color="CCCCCC" ns0:sz="1"/>
               <ns0:right ns0:val="single" ns0:color="CCCCCC" ns0:sz="1"/>
             </ns0:tcBorders>
-            <ns0:shd ns0:fill="E2EFDA" ns0:val="clear"/>
+            <ns0:shd ns0:fill="D5E8F0" ns0:val="clear"/>
             <ns0:tcMar>
               <ns0:top ns0:type="dxa" ns0:w="80"/>
               <ns0:left ns0:type="dxa" ns0:w="120"/>
@@ -33563,7 +34007,7 @@
                 <ns0:sz ns0:val="18"/>
                 <ns0:szCs ns0:val="18"/>
               </ns0:rPr>
-              <ns0:t xml:space="preserve">NEW</ns0:t>
+              <ns0:t xml:space="preserve">FIX</ns0:t>
             </ns0:r>
           </ns0:p>
         </ns0:tc>
@@ -33594,7 +34038,7 @@
                 <ns0:sz ns0:val="18"/>
                 <ns0:szCs ns0:val="18"/>
               </ns0:rPr>
-              <ns0:t xml:space="preserve">Code map — section banners [S01]–[S24], [T01]–[T04], [M01]–[M02] and a CODE MAP in the module docstring; "# FIX:" comments mark bug fixes</ns0:t>
+              <ns0:t xml:space="preserve">initialize() — a response without user_data (server overloaded, connection dropped) silently set energy/stamina to 0 and skipped all phases; now the account is skipped with an InitIncomplete entry in api_errors.log</ns0:t>
             </ns0:r>
           </ns0:p>
         </ns0:tc>
@@ -33609,7 +34053,7 @@
               <ns0:bottom ns0:val="single" ns0:color="CCCCCC" ns0:sz="1"/>
               <ns0:right ns0:val="single" ns0:color="CCCCCC" ns0:sz="1"/>
             </ns0:tcBorders>
-            <ns0:shd ns0:fill="E2EFDA" ns0:val="clear"/>
+            <ns0:shd ns0:fill="D5E8F0" ns0:val="clear"/>
             <ns0:tcMar>
               <ns0:top ns0:type="dxa" ns0:w="80"/>
               <ns0:left ns0:type="dxa" ns0:w="120"/>
@@ -33661,7 +34105,7 @@
                 <ns0:sz ns0:val="18"/>
                 <ns0:szCs ns0:val="18"/>
               </ns0:rPr>
-              <ns0:t xml:space="preserve">setDeckCards success check — the commander-only comparison counted a rejected deck as success whenever the commander was unchanged (e.g. Extreme step 8). Now the returned cards are compared with the sent cards; the server result_message is logged; on mismatch the challenge deck is aborted and pvp_challenge_issues.txt is written</ns0:t>
+              <ns0:t xml:space="preserve">_fetch_enemy_deck_live — stale guild-member cache: on a name miss the roster is re-read once, the cache rebuilt and the lookup repeated before reporting "left guild"</ns0:t>
             </ns0:r>
           </ns0:p>
         </ns0:tc>
@@ -33676,7 +34120,7 @@
               <ns0:bottom ns0:val="single" ns0:color="CCCCCC" ns0:sz="1"/>
               <ns0:right ns0:val="single" ns0:color="CCCCCC" ns0:sz="1"/>
             </ns0:tcBorders>
-            <ns0:shd ns0:fill="E2EFDA" ns0:val="clear"/>
+            <ns0:shd ns0:fill="D5E8F0" ns0:val="clear"/>
             <ns0:tcMar>
               <ns0:top ns0:type="dxa" ns0:w="80"/>
               <ns0:left ns0:type="dxa" ns0:w="120"/>
@@ -33728,7 +34172,7 @@
                 <ns0:sz ns0:val="18"/>
                 <ns0:szCs ns0:val="18"/>
               </ns0:rPr>
-              <ns0:t xml:space="preserve">Challenge card already in the start deck (only 1 owned) was added a second time — server answered "You do not have 2 of card X" and discarded the whole deck, so the challenge deck was never active (Rhilfen, Extreme step 8, since Flourish Turbine was added to the start deck). Copies of challenge cards are now removed from the base deck first and no id is sent more often than num_owned</ns0:t>
+              <ns0:t xml:space="preserve">play_highest_mission_loop — the fallback mission is never blacklisted; repeated failures stop the session (MissionFallbackFailed in api_errors.log); blacklist output shortened to a count</ns0:t>
             </ns0:r>
           </ns0:p>
         </ns0:tc>
@@ -33743,7 +34187,7 @@
               <ns0:bottom ns0:val="single" ns0:color="CCCCCC" ns0:sz="1"/>
               <ns0:right ns0:val="single" ns0:color="CCCCCC" ns0:sz="1"/>
             </ns0:tcBorders>
-            <ns0:shd ns0:fill="E2EFDA" ns0:val="clear"/>
+            <ns0:shd ns0:fill="D5E8F0" ns0:val="clear"/>
             <ns0:tcMar>
               <ns0:top ns0:type="dxa" ns0:w="80"/>
               <ns0:left ns0:type="dxa" ns0:w="120"/>
@@ -33795,7 +34239,7 @@
                 <ns0:sz ns0:val="18"/>
                 <ns0:szCs ns0:val="18"/>
               </ns0:rPr>
-              <ns0:t xml:space="preserve">Pool build — per-type copy count is capped at the pool list count (a pool of different cards gets one of each; previously the first card was taken up to pool_min times); a second pass tops up additional copies when pool_min is not reached; new-copy detection uses a counter</ns0:t>
+              <ns0:t xml:space="preserve">interactive_menu option 95 — local import glob as _glob made _glob local for the whole function (UnboundLocalError in settings search)</ns0:t>
             </ns0:r>
           </ns0:p>
         </ns0:tc>
@@ -33810,7 +34254,7 @@
               <ns0:bottom ns0:val="single" ns0:color="CCCCCC" ns0:sz="1"/>
               <ns0:right ns0:val="single" ns0:color="CCCCCC" ns0:sz="1"/>
             </ns0:tcBorders>
-            <ns0:shd ns0:fill="E2EFDA" ns0:val="clear"/>
+            <ns0:shd ns0:fill="D5E8F0" ns0:val="clear"/>
             <ns0:tcMar>
               <ns0:top ns0:type="dxa" ns0:w="80"/>
               <ns0:left ns0:type="dxa" ns0:w="120"/>
@@ -33862,7 +34306,7 @@
                 <ns0:sz ns0:val="18"/>
                 <ns0:szCs ns0:val="18"/>
               </ns0:rPr>
-              <ns0:t xml:space="preserve">_restore_challenge_deck — success now also requires the returned cards to match; failed restore is logged as "Deck RESTORE not applied"</ns0:t>
+              <ns0:t xml:space="preserve">optimize_mission_deck — NameError on auto-detected GBGE (check of a non-existent variable removed)</ns0:t>
             </ns0:r>
           </ns0:p>
         </ns0:tc>
@@ -33877,7 +34321,7 @@
               <ns0:bottom ns0:val="single" ns0:color="CCCCCC" ns0:sz="1"/>
               <ns0:right ns0:val="single" ns0:color="CCCCCC" ns0:sz="1"/>
             </ns0:tcBorders>
-            <ns0:shd ns0:fill="E2EFDA" ns0:val="clear"/>
+            <ns0:shd ns0:fill="D5E8F0" ns0:val="clear"/>
             <ns0:tcMar>
               <ns0:top ns0:type="dxa" ns0:w="80"/>
               <ns0:left ns0:type="dxa" ns0:w="120"/>
@@ -33929,7 +34373,7 @@
                 <ns0:sz ns0:val="18"/>
                 <ns0:szCs ns0:val="18"/>
               </ns0:rPr>
-              <ns0:t xml:space="preserve">_verify_challenge_deck — pool-only steps (no commander/required card, e.g. Extreme step 8) were skipped, so the pool check never ran; pool_min steps are now included (warning + issue log)</ns0:t>
+              <ns0:t xml:space="preserve">get_player_info — "Account Age" was never shown (date.today() NameError was swallowed); now datetime.now().date()</ns0:t>
             </ns0:r>
           </ns0:p>
         </ns0:tc>
@@ -33944,7 +34388,7 @@
               <ns0:bottom ns0:val="single" ns0:color="CCCCCC" ns0:sz="1"/>
               <ns0:right ns0:val="single" ns0:color="CCCCCC" ns0:sz="1"/>
             </ns0:tcBorders>
-            <ns0:shd ns0:fill="E2EFDA" ns0:val="clear"/>
+            <ns0:shd ns0:fill="FCE4D6" ns0:val="clear"/>
             <ns0:tcMar>
               <ns0:top ns0:type="dxa" ns0:w="80"/>
               <ns0:left ns0:type="dxa" ns0:w="120"/>
@@ -33961,11 +34405,11 @@
                 <ns0:rFonts ns0:ascii="Arial" ns0:cs="Arial" ns0:hAnsi="Arial"/>
                 <ns0:b/>
                 <ns0:bCs/>
-                <ns0:color ns0:val="1F4E79"/>
-                <ns0:sz ns0:val="18"/>
-                <ns0:szCs ns0:val="18"/>
-              </ns0:rPr>
-              <ns0:t xml:space="preserve">FIX</ns0:t>
+                <ns0:color ns0:val="833C00"/>
+                <ns0:sz ns0:val="18"/>
+                <ns0:szCs ns0:val="18"/>
+              </ns0:rPr>
+              <ns0:t xml:space="preserve">CHANGE</ns0:t>
             </ns0:r>
           </ns0:p>
         </ns0:tc>
@@ -33996,7 +34440,7 @@
                 <ns0:sz ns0:val="18"/>
                 <ns0:szCs ns0:val="18"/>
               </ns0:rPr>
-              <ns0:t xml:space="preserve">initialize() — a response without user_data (server overloaded, connection dropped) silently set energy/stamina to 0 and skipped all phases; now the account is skipped with an InitIncomplete entry in api_errors.log</ns0:t>
+              <ns0:t xml:space="preserve">PROGENITOR_REQUIEM_CHALLENGES step 1 (Progenitor Reactor) — pool_min 6 → 4</ns0:t>
             </ns0:r>
           </ns0:p>
         </ns0:tc>
@@ -34011,7 +34455,7 @@
               <ns0:bottom ns0:val="single" ns0:color="CCCCCC" ns0:sz="1"/>
               <ns0:right ns0:val="single" ns0:color="CCCCCC" ns0:sz="1"/>
             </ns0:tcBorders>
-            <ns0:shd ns0:fill="E2EFDA" ns0:val="clear"/>
+            <ns0:shd ns0:fill="FCE4D6" ns0:val="clear"/>
             <ns0:tcMar>
               <ns0:top ns0:type="dxa" ns0:w="80"/>
               <ns0:left ns0:type="dxa" ns0:w="120"/>
@@ -34028,11 +34472,11 @@
                 <ns0:rFonts ns0:ascii="Arial" ns0:cs="Arial" ns0:hAnsi="Arial"/>
                 <ns0:b/>
                 <ns0:bCs/>
-                <ns0:color ns0:val="1F4E79"/>
-                <ns0:sz ns0:val="18"/>
-                <ns0:szCs ns0:val="18"/>
-              </ns0:rPr>
-              <ns0:t xml:space="preserve">FIX</ns0:t>
+                <ns0:color ns0:val="833C00"/>
+                <ns0:sz ns0:val="18"/>
+                <ns0:szCs ns0:val="18"/>
+              </ns0:rPr>
+              <ns0:t xml:space="preserve">CHANGE</ns0:t>
             </ns0:r>
           </ns0:p>
         </ns0:tc>
@@ -34063,7 +34507,7 @@
                 <ns0:sz ns0:val="18"/>
                 <ns0:szCs ns0:val="18"/>
               </ns0:rPr>
-              <ns0:t xml:space="preserve">_fetch_enemy_deck_live — stale guild-member cache: on a name miss the roster is re-read once, the cache rebuilt and the lookup repeated before reporting "left guild"</ns0:t>
+              <ns0:t xml:space="preserve">Removed ~50 lines of unreachable dead code in play_first_quest_mission_loop; 9 bare except around int() narrowed to (ValueError, TypeError) (show_events, _gw_in_active_phase)</ns0:t>
             </ns0:r>
           </ns0:p>
         </ns0:tc>
@@ -34078,7 +34522,7 @@
               <ns0:bottom ns0:val="single" ns0:color="CCCCCC" ns0:sz="1"/>
               <ns0:right ns0:val="single" ns0:color="CCCCCC" ns0:sz="1"/>
             </ns0:tcBorders>
-            <ns0:shd ns0:fill="E2EFDA" ns0:val="clear"/>
+            <ns0:shd ns0:fill="FCE4D6" ns0:val="clear"/>
             <ns0:tcMar>
               <ns0:top ns0:type="dxa" ns0:w="80"/>
               <ns0:left ns0:type="dxa" ns0:w="120"/>
@@ -34095,11 +34539,11 @@
                 <ns0:rFonts ns0:ascii="Arial" ns0:cs="Arial" ns0:hAnsi="Arial"/>
                 <ns0:b/>
                 <ns0:bCs/>
-                <ns0:color ns0:val="1F4E79"/>
-                <ns0:sz ns0:val="18"/>
-                <ns0:szCs ns0:val="18"/>
-              </ns0:rPr>
-              <ns0:t xml:space="preserve">FIX</ns0:t>
+                <ns0:color ns0:val="833C00"/>
+                <ns0:sz ns0:val="18"/>
+                <ns0:szCs ns0:val="18"/>
+              </ns0:rPr>
+              <ns0:t xml:space="preserve">CHANGE</ns0:t>
             </ns0:r>
           </ns0:p>
         </ns0:tc>
@@ -34130,7 +34574,7 @@
                 <ns0:sz ns0:val="18"/>
                 <ns0:szCs ns0:val="18"/>
               </ns0:rPr>
-              <ns0:t xml:space="preserve">play_highest_mission_loop — the fallback mission is never blacklisted; repeated failures stop the session (MissionFallbackFailed in api_errors.log); blacklist output shortened to a count</ns0:t>
+              <ns0:t xml:space="preserve">play_first keys in the challenge tables have no effect — the card order is decided by the TUO flexible sim only</ns0:t>
             </ns0:r>
           </ns0:p>
         </ns0:tc>
@@ -34145,7 +34589,7 @@
               <ns0:bottom ns0:val="single" ns0:color="CCCCCC" ns0:sz="1"/>
               <ns0:right ns0:val="single" ns0:color="CCCCCC" ns0:sz="1"/>
             </ns0:tcBorders>
-            <ns0:shd ns0:fill="E2EFDA" ns0:val="clear"/>
+            <ns0:shd ns0:fill="FCE4D6" ns0:val="clear"/>
             <ns0:tcMar>
               <ns0:top ns0:type="dxa" ns0:w="80"/>
               <ns0:left ns0:type="dxa" ns0:w="120"/>
@@ -34162,409 +34606,7 @@
                 <ns0:rFonts ns0:ascii="Arial" ns0:cs="Arial" ns0:hAnsi="Arial"/>
                 <ns0:b/>
                 <ns0:bCs/>
-                <ns0:color ns0:val="1F4E79"/>
-                <ns0:sz ns0:val="18"/>
-                <ns0:szCs ns0:val="18"/>
-              </ns0:rPr>
-              <ns0:t xml:space="preserve">FIX</ns0:t>
-            </ns0:r>
-          </ns0:p>
-        </ns0:tc>
-        <ns0:tc>
-          <ns0:tcPr>
-            <ns0:tcW ns0:type="dxa" ns0:w="8460"/>
-            <ns0:tcBorders>
-              <ns0:top ns0:val="single" ns0:color="CCCCCC" ns0:sz="1"/>
-              <ns0:left ns0:val="single" ns0:color="CCCCCC" ns0:sz="1"/>
-              <ns0:bottom ns0:val="single" ns0:color="CCCCCC" ns0:sz="1"/>
-              <ns0:right ns0:val="single" ns0:color="CCCCCC" ns0:sz="1"/>
-            </ns0:tcBorders>
-            <ns0:shd ns0:fill="FFFFFF" ns0:val="clear"/>
-            <ns0:tcMar>
-              <ns0:top ns0:type="dxa" ns0:w="80"/>
-              <ns0:left ns0:type="dxa" ns0:w="120"/>
-              <ns0:bottom ns0:type="dxa" ns0:w="80"/>
-              <ns0:right ns0:type="dxa" ns0:w="120"/>
-            </ns0:tcMar>
-          </ns0:tcPr>
-          <ns0:p>
-            <ns0:pPr>
-              <ns0:spacing ns0:after="40" ns0:before="40"/>
-            </ns0:pPr>
-            <ns0:r>
-              <ns0:rPr>
-                <ns0:rFonts ns0:ascii="Arial" ns0:cs="Arial" ns0:hAnsi="Arial"/>
-                <ns0:sz ns0:val="18"/>
-                <ns0:szCs ns0:val="18"/>
-              </ns0:rPr>
-              <ns0:t xml:space="preserve">interactive_menu option 95 — local import glob as _glob made _glob local for the whole function (UnboundLocalError in settings search)</ns0:t>
-            </ns0:r>
-          </ns0:p>
-        </ns0:tc>
-      </ns0:tr>
-      <ns0:tr>
-        <ns0:tc>
-          <ns0:tcPr>
-            <ns0:tcW ns0:type="dxa" ns0:w="900"/>
-            <ns0:tcBorders>
-              <ns0:top ns0:val="single" ns0:color="CCCCCC" ns0:sz="1"/>
-              <ns0:left ns0:val="single" ns0:color="CCCCCC" ns0:sz="1"/>
-              <ns0:bottom ns0:val="single" ns0:color="CCCCCC" ns0:sz="1"/>
-              <ns0:right ns0:val="single" ns0:color="CCCCCC" ns0:sz="1"/>
-            </ns0:tcBorders>
-            <ns0:shd ns0:fill="E2EFDA" ns0:val="clear"/>
-            <ns0:tcMar>
-              <ns0:top ns0:type="dxa" ns0:w="80"/>
-              <ns0:left ns0:type="dxa" ns0:w="120"/>
-              <ns0:bottom ns0:type="dxa" ns0:w="80"/>
-              <ns0:right ns0:type="dxa" ns0:w="120"/>
-            </ns0:tcMar>
-          </ns0:tcPr>
-          <ns0:p>
-            <ns0:pPr>
-              <ns0:spacing ns0:after="40" ns0:before="40"/>
-            </ns0:pPr>
-            <ns0:r>
-              <ns0:rPr>
-                <ns0:rFonts ns0:ascii="Arial" ns0:cs="Arial" ns0:hAnsi="Arial"/>
-                <ns0:b/>
-                <ns0:bCs/>
-                <ns0:color ns0:val="1F4E79"/>
-                <ns0:sz ns0:val="18"/>
-                <ns0:szCs ns0:val="18"/>
-              </ns0:rPr>
-              <ns0:t xml:space="preserve">FIX</ns0:t>
-            </ns0:r>
-          </ns0:p>
-        </ns0:tc>
-        <ns0:tc>
-          <ns0:tcPr>
-            <ns0:tcW ns0:type="dxa" ns0:w="8460"/>
-            <ns0:tcBorders>
-              <ns0:top ns0:val="single" ns0:color="CCCCCC" ns0:sz="1"/>
-              <ns0:left ns0:val="single" ns0:color="CCCCCC" ns0:sz="1"/>
-              <ns0:bottom ns0:val="single" ns0:color="CCCCCC" ns0:sz="1"/>
-              <ns0:right ns0:val="single" ns0:color="CCCCCC" ns0:sz="1"/>
-            </ns0:tcBorders>
-            <ns0:shd ns0:fill="FFFFFF" ns0:val="clear"/>
-            <ns0:tcMar>
-              <ns0:top ns0:type="dxa" ns0:w="80"/>
-              <ns0:left ns0:type="dxa" ns0:w="120"/>
-              <ns0:bottom ns0:type="dxa" ns0:w="80"/>
-              <ns0:right ns0:type="dxa" ns0:w="120"/>
-            </ns0:tcMar>
-          </ns0:tcPr>
-          <ns0:p>
-            <ns0:pPr>
-              <ns0:spacing ns0:after="40" ns0:before="40"/>
-            </ns0:pPr>
-            <ns0:r>
-              <ns0:rPr>
-                <ns0:rFonts ns0:ascii="Arial" ns0:cs="Arial" ns0:hAnsi="Arial"/>
-                <ns0:sz ns0:val="18"/>
-                <ns0:szCs ns0:val="18"/>
-              </ns0:rPr>
-              <ns0:t xml:space="preserve">optimize_mission_deck — NameError on auto-detected GBGE (check of a non-existent variable removed)</ns0:t>
-            </ns0:r>
-          </ns0:p>
-        </ns0:tc>
-      </ns0:tr>
-      <ns0:tr>
-        <ns0:tc>
-          <ns0:tcPr>
-            <ns0:tcW ns0:type="dxa" ns0:w="900"/>
-            <ns0:tcBorders>
-              <ns0:top ns0:val="single" ns0:color="CCCCCC" ns0:sz="1"/>
-              <ns0:left ns0:val="single" ns0:color="CCCCCC" ns0:sz="1"/>
-              <ns0:bottom ns0:val="single" ns0:color="CCCCCC" ns0:sz="1"/>
-              <ns0:right ns0:val="single" ns0:color="CCCCCC" ns0:sz="1"/>
-            </ns0:tcBorders>
-            <ns0:shd ns0:fill="E2EFDA" ns0:val="clear"/>
-            <ns0:tcMar>
-              <ns0:top ns0:type="dxa" ns0:w="80"/>
-              <ns0:left ns0:type="dxa" ns0:w="120"/>
-              <ns0:bottom ns0:type="dxa" ns0:w="80"/>
-              <ns0:right ns0:type="dxa" ns0:w="120"/>
-            </ns0:tcMar>
-          </ns0:tcPr>
-          <ns0:p>
-            <ns0:pPr>
-              <ns0:spacing ns0:after="40" ns0:before="40"/>
-            </ns0:pPr>
-            <ns0:r>
-              <ns0:rPr>
-                <ns0:rFonts ns0:ascii="Arial" ns0:cs="Arial" ns0:hAnsi="Arial"/>
-                <ns0:b/>
-                <ns0:bCs/>
-                <ns0:color ns0:val="1F4E79"/>
-                <ns0:sz ns0:val="18"/>
-                <ns0:szCs ns0:val="18"/>
-              </ns0:rPr>
-              <ns0:t xml:space="preserve">FIX</ns0:t>
-            </ns0:r>
-          </ns0:p>
-        </ns0:tc>
-        <ns0:tc>
-          <ns0:tcPr>
-            <ns0:tcW ns0:type="dxa" ns0:w="8460"/>
-            <ns0:tcBorders>
-              <ns0:top ns0:val="single" ns0:color="CCCCCC" ns0:sz="1"/>
-              <ns0:left ns0:val="single" ns0:color="CCCCCC" ns0:sz="1"/>
-              <ns0:bottom ns0:val="single" ns0:color="CCCCCC" ns0:sz="1"/>
-              <ns0:right ns0:val="single" ns0:color="CCCCCC" ns0:sz="1"/>
-            </ns0:tcBorders>
-            <ns0:shd ns0:fill="FFFFFF" ns0:val="clear"/>
-            <ns0:tcMar>
-              <ns0:top ns0:type="dxa" ns0:w="80"/>
-              <ns0:left ns0:type="dxa" ns0:w="120"/>
-              <ns0:bottom ns0:type="dxa" ns0:w="80"/>
-              <ns0:right ns0:type="dxa" ns0:w="120"/>
-            </ns0:tcMar>
-          </ns0:tcPr>
-          <ns0:p>
-            <ns0:pPr>
-              <ns0:spacing ns0:after="40" ns0:before="40"/>
-            </ns0:pPr>
-            <ns0:r>
-              <ns0:rPr>
-                <ns0:rFonts ns0:ascii="Arial" ns0:cs="Arial" ns0:hAnsi="Arial"/>
-                <ns0:sz ns0:val="18"/>
-                <ns0:szCs ns0:val="18"/>
-              </ns0:rPr>
-              <ns0:t xml:space="preserve">get_player_info — "Account Age" was never shown (date.today() NameError was swallowed); now datetime.now().date()</ns0:t>
-            </ns0:r>
-          </ns0:p>
-        </ns0:tc>
-      </ns0:tr>
-      <ns0:tr>
-        <ns0:tc>
-          <ns0:tcPr>
-            <ns0:tcW ns0:type="dxa" ns0:w="900"/>
-            <ns0:tcBorders>
-              <ns0:top ns0:val="single" ns0:color="CCCCCC" ns0:sz="1"/>
-              <ns0:left ns0:val="single" ns0:color="CCCCCC" ns0:sz="1"/>
-              <ns0:bottom ns0:val="single" ns0:color="CCCCCC" ns0:sz="1"/>
-              <ns0:right ns0:val="single" ns0:color="CCCCCC" ns0:sz="1"/>
-            </ns0:tcBorders>
-            <ns0:shd ns0:fill="FCE4D6" ns0:val="clear"/>
-            <ns0:tcMar>
-              <ns0:top ns0:type="dxa" ns0:w="80"/>
-              <ns0:left ns0:type="dxa" ns0:w="120"/>
-              <ns0:bottom ns0:type="dxa" ns0:w="80"/>
-              <ns0:right ns0:type="dxa" ns0:w="120"/>
-            </ns0:tcMar>
-          </ns0:tcPr>
-          <ns0:p>
-            <ns0:pPr>
-              <ns0:spacing ns0:after="40" ns0:before="40"/>
-            </ns0:pPr>
-            <ns0:r>
-              <ns0:rPr>
-                <ns0:rFonts ns0:ascii="Arial" ns0:cs="Arial" ns0:hAnsi="Arial"/>
-                <ns0:b/>
-                <ns0:bCs/>
-                <ns0:color ns0:val="1F4E79"/>
-                <ns0:sz ns0:val="18"/>
-                <ns0:szCs ns0:val="18"/>
-              </ns0:rPr>
-              <ns0:t xml:space="preserve">CHANGE</ns0:t>
-            </ns0:r>
-          </ns0:p>
-        </ns0:tc>
-        <ns0:tc>
-          <ns0:tcPr>
-            <ns0:tcW ns0:type="dxa" ns0:w="8460"/>
-            <ns0:tcBorders>
-              <ns0:top ns0:val="single" ns0:color="CCCCCC" ns0:sz="1"/>
-              <ns0:left ns0:val="single" ns0:color="CCCCCC" ns0:sz="1"/>
-              <ns0:bottom ns0:val="single" ns0:color="CCCCCC" ns0:sz="1"/>
-              <ns0:right ns0:val="single" ns0:color="CCCCCC" ns0:sz="1"/>
-            </ns0:tcBorders>
-            <ns0:shd ns0:fill="FFFFFF" ns0:val="clear"/>
-            <ns0:tcMar>
-              <ns0:top ns0:type="dxa" ns0:w="80"/>
-              <ns0:left ns0:type="dxa" ns0:w="120"/>
-              <ns0:bottom ns0:type="dxa" ns0:w="80"/>
-              <ns0:right ns0:type="dxa" ns0:w="120"/>
-            </ns0:tcMar>
-          </ns0:tcPr>
-          <ns0:p>
-            <ns0:pPr>
-              <ns0:spacing ns0:after="40" ns0:before="40"/>
-            </ns0:pPr>
-            <ns0:r>
-              <ns0:rPr>
-                <ns0:rFonts ns0:ascii="Arial" ns0:cs="Arial" ns0:hAnsi="Arial"/>
-                <ns0:sz ns0:val="18"/>
-                <ns0:szCs ns0:val="18"/>
-              </ns0:rPr>
-              <ns0:t xml:space="preserve">PROGENITOR_REQUIEM_CHALLENGES step 1 (Progenitor Reactor) — pool_min 6 → 4</ns0:t>
-            </ns0:r>
-          </ns0:p>
-        </ns0:tc>
-      </ns0:tr>
-      <ns0:tr>
-        <ns0:tc>
-          <ns0:tcPr>
-            <ns0:tcW ns0:type="dxa" ns0:w="900"/>
-            <ns0:tcBorders>
-              <ns0:top ns0:val="single" ns0:color="CCCCCC" ns0:sz="1"/>
-              <ns0:left ns0:val="single" ns0:color="CCCCCC" ns0:sz="1"/>
-              <ns0:bottom ns0:val="single" ns0:color="CCCCCC" ns0:sz="1"/>
-              <ns0:right ns0:val="single" ns0:color="CCCCCC" ns0:sz="1"/>
-            </ns0:tcBorders>
-            <ns0:shd ns0:fill="FCE4D6" ns0:val="clear"/>
-            <ns0:tcMar>
-              <ns0:top ns0:type="dxa" ns0:w="80"/>
-              <ns0:left ns0:type="dxa" ns0:w="120"/>
-              <ns0:bottom ns0:type="dxa" ns0:w="80"/>
-              <ns0:right ns0:type="dxa" ns0:w="120"/>
-            </ns0:tcMar>
-          </ns0:tcPr>
-          <ns0:p>
-            <ns0:pPr>
-              <ns0:spacing ns0:after="40" ns0:before="40"/>
-            </ns0:pPr>
-            <ns0:r>
-              <ns0:rPr>
-                <ns0:rFonts ns0:ascii="Arial" ns0:cs="Arial" ns0:hAnsi="Arial"/>
-                <ns0:b/>
-                <ns0:bCs/>
-                <ns0:color ns0:val="1F4E79"/>
-                <ns0:sz ns0:val="18"/>
-                <ns0:szCs ns0:val="18"/>
-              </ns0:rPr>
-              <ns0:t xml:space="preserve">CHANGE</ns0:t>
-            </ns0:r>
-          </ns0:p>
-        </ns0:tc>
-        <ns0:tc>
-          <ns0:tcPr>
-            <ns0:tcW ns0:type="dxa" ns0:w="8460"/>
-            <ns0:tcBorders>
-              <ns0:top ns0:val="single" ns0:color="CCCCCC" ns0:sz="1"/>
-              <ns0:left ns0:val="single" ns0:color="CCCCCC" ns0:sz="1"/>
-              <ns0:bottom ns0:val="single" ns0:color="CCCCCC" ns0:sz="1"/>
-              <ns0:right ns0:val="single" ns0:color="CCCCCC" ns0:sz="1"/>
-            </ns0:tcBorders>
-            <ns0:shd ns0:fill="FFFFFF" ns0:val="clear"/>
-            <ns0:tcMar>
-              <ns0:top ns0:type="dxa" ns0:w="80"/>
-              <ns0:left ns0:type="dxa" ns0:w="120"/>
-              <ns0:bottom ns0:type="dxa" ns0:w="80"/>
-              <ns0:right ns0:type="dxa" ns0:w="120"/>
-            </ns0:tcMar>
-          </ns0:tcPr>
-          <ns0:p>
-            <ns0:pPr>
-              <ns0:spacing ns0:after="40" ns0:before="40"/>
-            </ns0:pPr>
-            <ns0:r>
-              <ns0:rPr>
-                <ns0:rFonts ns0:ascii="Arial" ns0:cs="Arial" ns0:hAnsi="Arial"/>
-                <ns0:sz ns0:val="18"/>
-                <ns0:szCs ns0:val="18"/>
-              </ns0:rPr>
-              <ns0:t xml:space="preserve">Removed ~50 lines of unreachable dead code in play_first_quest_mission_loop; 9 bare except around int() narrowed to (ValueError, TypeError) (show_events, _gw_in_active_phase)</ns0:t>
-            </ns0:r>
-          </ns0:p>
-        </ns0:tc>
-      </ns0:tr>
-      <ns0:tr>
-        <ns0:tc>
-          <ns0:tcPr>
-            <ns0:tcW ns0:type="dxa" ns0:w="900"/>
-            <ns0:tcBorders>
-              <ns0:top ns0:val="single" ns0:color="CCCCCC" ns0:sz="1"/>
-              <ns0:left ns0:val="single" ns0:color="CCCCCC" ns0:sz="1"/>
-              <ns0:bottom ns0:val="single" ns0:color="CCCCCC" ns0:sz="1"/>
-              <ns0:right ns0:val="single" ns0:color="CCCCCC" ns0:sz="1"/>
-            </ns0:tcBorders>
-            <ns0:shd ns0:fill="FCE4D6" ns0:val="clear"/>
-            <ns0:tcMar>
-              <ns0:top ns0:type="dxa" ns0:w="80"/>
-              <ns0:left ns0:type="dxa" ns0:w="120"/>
-              <ns0:bottom ns0:type="dxa" ns0:w="80"/>
-              <ns0:right ns0:type="dxa" ns0:w="120"/>
-            </ns0:tcMar>
-          </ns0:tcPr>
-          <ns0:p>
-            <ns0:pPr>
-              <ns0:spacing ns0:after="40" ns0:before="40"/>
-            </ns0:pPr>
-            <ns0:r>
-              <ns0:rPr>
-                <ns0:rFonts ns0:ascii="Arial" ns0:cs="Arial" ns0:hAnsi="Arial"/>
-                <ns0:b/>
-                <ns0:bCs/>
-                <ns0:color ns0:val="1F4E79"/>
-                <ns0:sz ns0:val="18"/>
-                <ns0:szCs ns0:val="18"/>
-              </ns0:rPr>
-              <ns0:t xml:space="preserve">CHANGE</ns0:t>
-            </ns0:r>
-          </ns0:p>
-        </ns0:tc>
-        <ns0:tc>
-          <ns0:tcPr>
-            <ns0:tcW ns0:type="dxa" ns0:w="8460"/>
-            <ns0:tcBorders>
-              <ns0:top ns0:val="single" ns0:color="CCCCCC" ns0:sz="1"/>
-              <ns0:left ns0:val="single" ns0:color="CCCCCC" ns0:sz="1"/>
-              <ns0:bottom ns0:val="single" ns0:color="CCCCCC" ns0:sz="1"/>
-              <ns0:right ns0:val="single" ns0:color="CCCCCC" ns0:sz="1"/>
-            </ns0:tcBorders>
-            <ns0:shd ns0:fill="FFFFFF" ns0:val="clear"/>
-            <ns0:tcMar>
-              <ns0:top ns0:type="dxa" ns0:w="80"/>
-              <ns0:left ns0:type="dxa" ns0:w="120"/>
-              <ns0:bottom ns0:type="dxa" ns0:w="80"/>
-              <ns0:right ns0:type="dxa" ns0:w="120"/>
-            </ns0:tcMar>
-          </ns0:tcPr>
-          <ns0:p>
-            <ns0:pPr>
-              <ns0:spacing ns0:after="40" ns0:before="40"/>
-            </ns0:pPr>
-            <ns0:r>
-              <ns0:rPr>
-                <ns0:rFonts ns0:ascii="Arial" ns0:cs="Arial" ns0:hAnsi="Arial"/>
-                <ns0:sz ns0:val="18"/>
-                <ns0:szCs ns0:val="18"/>
-              </ns0:rPr>
-              <ns0:t xml:space="preserve">play_first keys in the challenge tables have no effect — the card order is decided by the TUO flexible sim only</ns0:t>
-            </ns0:r>
-          </ns0:p>
-        </ns0:tc>
-      </ns0:tr>
-      <ns0:tr>
-        <ns0:tc>
-          <ns0:tcPr>
-            <ns0:tcW ns0:type="dxa" ns0:w="900"/>
-            <ns0:tcBorders>
-              <ns0:top ns0:val="single" ns0:color="CCCCCC" ns0:sz="1"/>
-              <ns0:left ns0:val="single" ns0:color="CCCCCC" ns0:sz="1"/>
-              <ns0:bottom ns0:val="single" ns0:color="CCCCCC" ns0:sz="1"/>
-              <ns0:right ns0:val="single" ns0:color="CCCCCC" ns0:sz="1"/>
-            </ns0:tcBorders>
-            <ns0:shd ns0:fill="FCE4D6" ns0:val="clear"/>
-            <ns0:tcMar>
-              <ns0:top ns0:type="dxa" ns0:w="80"/>
-              <ns0:left ns0:type="dxa" ns0:w="120"/>
-              <ns0:bottom ns0:type="dxa" ns0:w="80"/>
-              <ns0:right ns0:type="dxa" ns0:w="120"/>
-            </ns0:tcMar>
-          </ns0:tcPr>
-          <ns0:p>
-            <ns0:pPr>
-              <ns0:spacing ns0:after="40" ns0:before="40"/>
-            </ns0:pPr>
-            <ns0:r>
-              <ns0:rPr>
-                <ns0:rFonts ns0:ascii="Arial" ns0:cs="Arial" ns0:hAnsi="Arial"/>
-                <ns0:b/>
-                <ns0:bCs/>
-                <ns0:color ns0:val="1F4E79"/>
+                <ns0:color ns0:val="833C00"/>
                 <ns0:sz ns0:val="18"/>
                 <ns0:szCs ns0:val="18"/>
               </ns0:rPr>
@@ -34651,7 +34693,7 @@
               <ns0:bottom ns0:val="single" ns0:color="CCCCCC" ns0:sz="1"/>
               <ns0:right ns0:val="single" ns0:color="CCCCCC" ns0:sz="1"/>
             </ns0:tcBorders>
-            <ns0:shd ns0:fill="E2EFDA" ns0:val="clear"/>
+            <ns0:shd ns0:fill="D5E8F0" ns0:val="clear"/>
             <ns0:tcMar>
               <ns0:top ns0:type="dxa" ns0:w="80"/>
               <ns0:left ns0:type="dxa" ns0:w="120"/>
@@ -34718,7 +34760,7 @@
               <ns0:bottom ns0:val="single" ns0:color="CCCCCC" ns0:sz="1"/>
               <ns0:right ns0:val="single" ns0:color="CCCCCC" ns0:sz="1"/>
             </ns0:tcBorders>
-            <ns0:shd ns0:fill="E2EFDA" ns0:val="clear"/>
+            <ns0:shd ns0:fill="D5E8F0" ns0:val="clear"/>
             <ns0:tcMar>
               <ns0:top ns0:type="dxa" ns0:w="80"/>
               <ns0:left ns0:type="dxa" ns0:w="120"/>
@@ -34785,7 +34827,7 @@
               <ns0:bottom ns0:val="single" ns0:color="CCCCCC" ns0:sz="1"/>
               <ns0:right ns0:val="single" ns0:color="CCCCCC" ns0:sz="1"/>
             </ns0:tcBorders>
-            <ns0:shd ns0:fill="E2EFDA" ns0:val="clear"/>
+            <ns0:shd ns0:fill="D5E8F0" ns0:val="clear"/>
             <ns0:tcMar>
               <ns0:top ns0:type="dxa" ns0:w="80"/>
               <ns0:left ns0:type="dxa" ns0:w="120"/>
@@ -34852,7 +34894,7 @@
               <ns0:bottom ns0:val="single" ns0:color="CCCCCC" ns0:sz="1"/>
               <ns0:right ns0:val="single" ns0:color="CCCCCC" ns0:sz="1"/>
             </ns0:tcBorders>
-            <ns0:shd ns0:fill="E2EFDA" ns0:val="clear"/>
+            <ns0:shd ns0:fill="D5E8F0" ns0:val="clear"/>
             <ns0:tcMar>
               <ns0:top ns0:type="dxa" ns0:w="80"/>
               <ns0:left ns0:type="dxa" ns0:w="120"/>
@@ -34919,7 +34961,7 @@
               <ns0:bottom ns0:val="single" ns0:color="CCCCCC" ns0:sz="1"/>
               <ns0:right ns0:val="single" ns0:color="CCCCCC" ns0:sz="1"/>
             </ns0:tcBorders>
-            <ns0:shd ns0:fill="E2EFDA" ns0:val="clear"/>
+            <ns0:shd ns0:fill="D5E8F0" ns0:val="clear"/>
             <ns0:tcMar>
               <ns0:top ns0:type="dxa" ns0:w="80"/>
               <ns0:left ns0:type="dxa" ns0:w="120"/>
@@ -34986,7 +35028,7 @@
               <ns0:bottom ns0:val="single" ns0:color="CCCCCC" ns0:sz="1"/>
               <ns0:right ns0:val="single" ns0:color="CCCCCC" ns0:sz="1"/>
             </ns0:tcBorders>
-            <ns0:shd ns0:fill="E2EFDA" ns0:val="clear"/>
+            <ns0:shd ns0:fill="D5E8F0" ns0:val="clear"/>
             <ns0:tcMar>
               <ns0:top ns0:type="dxa" ns0:w="80"/>
               <ns0:left ns0:type="dxa" ns0:w="120"/>
@@ -35053,7 +35095,7 @@
               <ns0:bottom ns0:val="single" ns0:color="CCCCCC" ns0:sz="1"/>
               <ns0:right ns0:val="single" ns0:color="CCCCCC" ns0:sz="1"/>
             </ns0:tcBorders>
-            <ns0:shd ns0:fill="E2EFDA" ns0:val="clear"/>
+            <ns0:shd ns0:fill="D5E8F0" ns0:val="clear"/>
             <ns0:tcMar>
               <ns0:top ns0:type="dxa" ns0:w="80"/>
               <ns0:left ns0:type="dxa" ns0:w="120"/>
@@ -35120,7 +35162,7 @@
               <ns0:bottom ns0:val="single" ns0:color="CCCCCC" ns0:sz="1"/>
               <ns0:right ns0:val="single" ns0:color="CCCCCC" ns0:sz="1"/>
             </ns0:tcBorders>
-            <ns0:shd ns0:fill="E2EFDA" ns0:val="clear"/>
+            <ns0:shd ns0:fill="D5E8F0" ns0:val="clear"/>
             <ns0:tcMar>
               <ns0:top ns0:type="dxa" ns0:w="80"/>
               <ns0:left ns0:type="dxa" ns0:w="120"/>
@@ -35241,7 +35283,7 @@
                 <ns0:rFonts ns0:ascii="Arial" ns0:cs="Arial" ns0:hAnsi="Arial"/>
                 <ns0:b/>
                 <ns0:bCs/>
-                <ns0:color ns0:val="1F4E79"/>
+                <ns0:color ns0:val="375623"/>
                 <ns0:sz ns0:val="18"/>
                 <ns0:szCs ns0:val="18"/>
               </ns0:rPr>
@@ -35277,6 +35319,676 @@
                 <ns0:szCs ns0:val="18"/>
               </ns0:rPr>
               <ns0:t xml:space="preserve">F→27 Refill Arena Stamina — buys stamina refill token; reads max_stamina from init_data with fallback 15</ns0:t>
+            </ns0:r>
+          </ns0:p>
+        </ns0:tc>
+      </ns0:tr>
+      <ns0:tr>
+        <ns0:tc>
+          <ns0:tcPr>
+            <ns0:tcW ns0:type="dxa" ns0:w="900"/>
+            <ns0:tcBorders>
+              <ns0:top ns0:val="single" ns0:color="CCCCCC" ns0:sz="1"/>
+              <ns0:left ns0:val="single" ns0:color="CCCCCC" ns0:sz="1"/>
+              <ns0:bottom ns0:val="single" ns0:color="CCCCCC" ns0:sz="1"/>
+              <ns0:right ns0:val="single" ns0:color="CCCCCC" ns0:sz="1"/>
+            </ns0:tcBorders>
+            <ns0:shd ns0:fill="E2EFDA" ns0:val="clear"/>
+            <ns0:tcMar>
+              <ns0:top ns0:type="dxa" ns0:w="80"/>
+              <ns0:left ns0:type="dxa" ns0:w="120"/>
+              <ns0:bottom ns0:type="dxa" ns0:w="80"/>
+              <ns0:right ns0:type="dxa" ns0:w="120"/>
+            </ns0:tcMar>
+          </ns0:tcPr>
+          <ns0:p>
+            <ns0:pPr>
+              <ns0:spacing ns0:after="40" ns0:before="40"/>
+            </ns0:pPr>
+            <ns0:r>
+              <ns0:rPr>
+                <ns0:rFonts ns0:ascii="Arial" ns0:cs="Arial" ns0:hAnsi="Arial"/>
+                <ns0:b/>
+                <ns0:bCs/>
+                <ns0:color ns0:val="375623"/>
+                <ns0:sz ns0:val="18"/>
+                <ns0:szCs ns0:val="18"/>
+              </ns0:rPr>
+              <ns0:t>NEW</ns0:t>
+            </ns0:r>
+          </ns0:p>
+        </ns0:tc>
+        <ns0:tc>
+          <ns0:tcPr>
+            <ns0:tcW ns0:type="dxa" ns0:w="8460"/>
+            <ns0:tcBorders>
+              <ns0:top ns0:val="single" ns0:color="CCCCCC" ns0:sz="1"/>
+              <ns0:left ns0:val="single" ns0:color="CCCCCC" ns0:sz="1"/>
+              <ns0:bottom ns0:val="single" ns0:color="CCCCCC" ns0:sz="1"/>
+              <ns0:right ns0:val="single" ns0:color="CCCCCC" ns0:sz="1"/>
+            </ns0:tcBorders>
+            <ns0:shd ns0:fill="FFFFFF" ns0:val="clear"/>
+            <ns0:tcMar>
+              <ns0:top ns0:type="dxa" ns0:w="80"/>
+              <ns0:left ns0:type="dxa" ns0:w="120"/>
+              <ns0:bottom ns0:type="dxa" ns0:w="80"/>
+              <ns0:right ns0:type="dxa" ns0:w="120"/>
+            </ns0:tcMar>
+          </ns0:tcPr>
+          <ns0:p>
+            <ns0:pPr>
+              <ns0:spacing ns0:after="40" ns0:before="40"/>
+            </ns0:pPr>
+            <ns0:r>
+              <ns0:rPr>
+                <ns0:rFonts ns0:ascii="Arial" ns0:cs="Arial" ns0:hAnsi="Arial"/>
+                <ns0:sz ns0:val="18"/>
+                <ns0:szCs ns0:val="18"/>
+              </ns0:rPr>
+              <ns0:t xml:space="preserve">F→28 Auto: Event + Quest Mission + Arena — auto-detects active event (Raid/Brawl) per loop pass from XML; GW prep-phase guard; PvP Challenge deck for Arena phase</ns0:t>
+            </ns0:r>
+          </ns0:p>
+        </ns0:tc>
+      </ns0:tr>
+      <ns0:tr>
+        <ns0:tc>
+          <ns0:tcPr>
+            <ns0:tcW ns0:type="dxa" ns0:w="900"/>
+            <ns0:tcBorders>
+              <ns0:top ns0:val="single" ns0:color="CCCCCC" ns0:sz="1"/>
+              <ns0:left ns0:val="single" ns0:color="CCCCCC" ns0:sz="1"/>
+              <ns0:bottom ns0:val="single" ns0:color="CCCCCC" ns0:sz="1"/>
+              <ns0:right ns0:val="single" ns0:color="CCCCCC" ns0:sz="1"/>
+            </ns0:tcBorders>
+            <ns0:shd ns0:fill="E2EFDA" ns0:val="clear"/>
+            <ns0:tcMar>
+              <ns0:top ns0:type="dxa" ns0:w="80"/>
+              <ns0:left ns0:type="dxa" ns0:w="120"/>
+              <ns0:bottom ns0:type="dxa" ns0:w="80"/>
+              <ns0:right ns0:type="dxa" ns0:w="120"/>
+            </ns0:tcMar>
+          </ns0:tcPr>
+          <ns0:p>
+            <ns0:pPr>
+              <ns0:spacing ns0:after="40" ns0:before="40"/>
+            </ns0:pPr>
+            <ns0:r>
+              <ns0:rPr>
+                <ns0:rFonts ns0:ascii="Arial" ns0:cs="Arial" ns0:hAnsi="Arial"/>
+                <ns0:b/>
+                <ns0:bCs/>
+                <ns0:color ns0:val="375623"/>
+                <ns0:sz ns0:val="18"/>
+                <ns0:szCs ns0:val="18"/>
+              </ns0:rPr>
+              <ns0:t>NEW</ns0:t>
+            </ns0:r>
+          </ns0:p>
+        </ns0:tc>
+        <ns0:tc>
+          <ns0:tcPr>
+            <ns0:tcW ns0:type="dxa" ns0:w="8460"/>
+            <ns0:tcBorders>
+              <ns0:top ns0:val="single" ns0:color="CCCCCC" ns0:sz="1"/>
+              <ns0:left ns0:val="single" ns0:color="CCCCCC" ns0:sz="1"/>
+              <ns0:bottom ns0:val="single" ns0:color="CCCCCC" ns0:sz="1"/>
+              <ns0:right ns0:val="single" ns0:color="CCCCCC" ns0:sz="1"/>
+            </ns0:tcBorders>
+            <ns0:shd ns0:fill="FFFFFF" ns0:val="clear"/>
+            <ns0:tcMar>
+              <ns0:top ns0:type="dxa" ns0:w="80"/>
+              <ns0:left ns0:type="dxa" ns0:w="120"/>
+              <ns0:bottom ns0:type="dxa" ns0:w="80"/>
+              <ns0:right ns0:type="dxa" ns0:w="120"/>
+            </ns0:tcMar>
+          </ns0:tcPr>
+          <ns0:p>
+            <ns0:pPr>
+              <ns0:spacing ns0:after="40" ns0:before="40"/>
+            </ns0:pPr>
+            <ns0:r>
+              <ns0:rPr>
+                <ns0:rFonts ns0:ascii="Arial" ns0:cs="Arial" ns0:hAnsi="Arial"/>
+                <ns0:sz ns0:val="18"/>
+                <ns0:szCs ns0:val="18"/>
+              </ns0:rPr>
+              <ns0:t xml:space="preserve">F→29 Auto: Event + Quest Mission + Arena (GW Pipeline) — GW phase prepended when _gw_in_active_phase() is True</ns0:t>
+            </ns0:r>
+          </ns0:p>
+        </ns0:tc>
+      </ns0:tr>
+      <ns0:tr>
+        <ns0:tc>
+          <ns0:tcPr>
+            <ns0:tcW ns0:type="dxa" ns0:w="900"/>
+            <ns0:tcBorders>
+              <ns0:top ns0:val="single" ns0:color="CCCCCC" ns0:sz="1"/>
+              <ns0:left ns0:val="single" ns0:color="CCCCCC" ns0:sz="1"/>
+              <ns0:bottom ns0:val="single" ns0:color="CCCCCC" ns0:sz="1"/>
+              <ns0:right ns0:val="single" ns0:color="CCCCCC" ns0:sz="1"/>
+            </ns0:tcBorders>
+            <ns0:shd ns0:fill="E2EFDA" ns0:val="clear"/>
+            <ns0:tcMar>
+              <ns0:top ns0:type="dxa" ns0:w="80"/>
+              <ns0:left ns0:type="dxa" ns0:w="120"/>
+              <ns0:bottom ns0:type="dxa" ns0:w="80"/>
+              <ns0:right ns0:type="dxa" ns0:w="120"/>
+            </ns0:tcMar>
+          </ns0:tcPr>
+          <ns0:p>
+            <ns0:pPr>
+              <ns0:spacing ns0:after="40" ns0:before="40"/>
+            </ns0:pPr>
+            <ns0:r>
+              <ns0:rPr>
+                <ns0:rFonts ns0:ascii="Arial" ns0:cs="Arial" ns0:hAnsi="Arial"/>
+                <ns0:b/>
+                <ns0:bCs/>
+                <ns0:color ns0:val="375623"/>
+                <ns0:sz ns0:val="18"/>
+                <ns0:szCs ns0:val="18"/>
+              </ns0:rPr>
+              <ns0:t>NEW</ns0:t>
+            </ns0:r>
+          </ns0:p>
+        </ns0:tc>
+        <ns0:tc>
+          <ns0:tcPr>
+            <ns0:tcW ns0:type="dxa" ns0:w="8460"/>
+            <ns0:tcBorders>
+              <ns0:top ns0:val="single" ns0:color="CCCCCC" ns0:sz="1"/>
+              <ns0:left ns0:val="single" ns0:color="CCCCCC" ns0:sz="1"/>
+              <ns0:bottom ns0:val="single" ns0:color="CCCCCC" ns0:sz="1"/>
+              <ns0:right ns0:val="single" ns0:color="CCCCCC" ns0:sz="1"/>
+            </ns0:tcBorders>
+            <ns0:shd ns0:fill="FFFFFF" ns0:val="clear"/>
+            <ns0:tcMar>
+              <ns0:top ns0:type="dxa" ns0:w="80"/>
+              <ns0:left ns0:type="dxa" ns0:w="120"/>
+              <ns0:bottom ns0:type="dxa" ns0:w="80"/>
+              <ns0:right ns0:type="dxa" ns0:w="120"/>
+            </ns0:tcMar>
+          </ns0:tcPr>
+          <ns0:p>
+            <ns0:pPr>
+              <ns0:spacing ns0:after="40" ns0:before="40"/>
+            </ns0:pPr>
+            <ns0:r>
+              <ns0:rPr>
+                <ns0:rFonts ns0:ascii="Arial" ns0:cs="Arial" ns0:hAnsi="Arial"/>
+                <ns0:sz ns0:val="18"/>
+                <ns0:szCs ns0:val="18"/>
+              </ns0:rPr>
+              <ns0:t xml:space="preserve">_detect_active_event_from_xml() — reads raids_x42.xml (&lt;raid&gt;) and battle_events_h52.xml (&lt;battle_event&gt;); timestamps via findtext() (child elements, not attributes); Raid checked before Brawl</ns0:t>
+            </ns0:r>
+          </ns0:p>
+        </ns0:tc>
+      </ns0:tr>
+      <ns0:tr>
+        <ns0:tc>
+          <ns0:tcPr>
+            <ns0:tcW ns0:type="dxa" ns0:w="900"/>
+            <ns0:tcBorders>
+              <ns0:top ns0:val="single" ns0:color="CCCCCC" ns0:sz="1"/>
+              <ns0:left ns0:val="single" ns0:color="CCCCCC" ns0:sz="1"/>
+              <ns0:bottom ns0:val="single" ns0:color="CCCCCC" ns0:sz="1"/>
+              <ns0:right ns0:val="single" ns0:color="CCCCCC" ns0:sz="1"/>
+            </ns0:tcBorders>
+            <ns0:shd ns0:fill="E2EFDA" ns0:val="clear"/>
+            <ns0:tcMar>
+              <ns0:top ns0:type="dxa" ns0:w="80"/>
+              <ns0:left ns0:type="dxa" ns0:w="120"/>
+              <ns0:bottom ns0:type="dxa" ns0:w="80"/>
+              <ns0:right ns0:type="dxa" ns0:w="120"/>
+            </ns0:tcMar>
+          </ns0:tcPr>
+          <ns0:p>
+            <ns0:pPr>
+              <ns0:spacing ns0:after="40" ns0:before="40"/>
+            </ns0:pPr>
+            <ns0:r>
+              <ns0:rPr>
+                <ns0:rFonts ns0:ascii="Arial" ns0:cs="Arial" ns0:hAnsi="Arial"/>
+                <ns0:b/>
+                <ns0:bCs/>
+                <ns0:color ns0:val="375623"/>
+                <ns0:sz ns0:val="18"/>
+                <ns0:szCs ns0:val="18"/>
+              </ns0:rPr>
+              <ns0:t>NEW</ns0:t>
+            </ns0:r>
+          </ns0:p>
+        </ns0:tc>
+        <ns0:tc>
+          <ns0:tcPr>
+            <ns0:tcW ns0:type="dxa" ns0:w="8460"/>
+            <ns0:tcBorders>
+              <ns0:top ns0:val="single" ns0:color="CCCCCC" ns0:sz="1"/>
+              <ns0:left ns0:val="single" ns0:color="CCCCCC" ns0:sz="1"/>
+              <ns0:bottom ns0:val="single" ns0:color="CCCCCC" ns0:sz="1"/>
+              <ns0:right ns0:val="single" ns0:color="CCCCCC" ns0:sz="1"/>
+            </ns0:tcBorders>
+            <ns0:shd ns0:fill="FFFFFF" ns0:val="clear"/>
+            <ns0:tcMar>
+              <ns0:top ns0:type="dxa" ns0:w="80"/>
+              <ns0:left ns0:type="dxa" ns0:w="120"/>
+              <ns0:bottom ns0:type="dxa" ns0:w="80"/>
+              <ns0:right ns0:type="dxa" ns0:w="120"/>
+            </ns0:tcMar>
+          </ns0:tcPr>
+          <ns0:p>
+            <ns0:pPr>
+              <ns0:spacing ns0:after="40" ns0:before="40"/>
+            </ns0:pPr>
+            <ns0:r>
+              <ns0:rPr>
+                <ns0:rFonts ns0:ascii="Arial" ns0:cs="Arial" ns0:hAnsi="Arial"/>
+                <ns0:sz ns0:val="18"/>
+                <ns0:szCs ns0:val="18"/>
+              </ns0:rPr>
+              <ns0:t xml:space="preserve">_gw_in_active_phase() — reads faction_wars_fp3.xml (&lt;faction_war&gt;); child-element timestamps</ns0:t>
+            </ns0:r>
+          </ns0:p>
+        </ns0:tc>
+      </ns0:tr>
+      <ns0:tr>
+        <ns0:tc>
+          <ns0:tcPr>
+            <ns0:tcW ns0:type="dxa" ns0:w="900"/>
+            <ns0:tcBorders>
+              <ns0:top ns0:val="single" ns0:color="CCCCCC" ns0:sz="1"/>
+              <ns0:left ns0:val="single" ns0:color="CCCCCC" ns0:sz="1"/>
+              <ns0:bottom ns0:val="single" ns0:color="CCCCCC" ns0:sz="1"/>
+              <ns0:right ns0:val="single" ns0:color="CCCCCC" ns0:sz="1"/>
+            </ns0:tcBorders>
+            <ns0:shd ns0:fill="E2EFDA" ns0:val="clear"/>
+            <ns0:tcMar>
+              <ns0:top ns0:type="dxa" ns0:w="80"/>
+              <ns0:left ns0:type="dxa" ns0:w="120"/>
+              <ns0:bottom ns0:type="dxa" ns0:w="80"/>
+              <ns0:right ns0:type="dxa" ns0:w="120"/>
+            </ns0:tcMar>
+          </ns0:tcPr>
+          <ns0:p>
+            <ns0:pPr>
+              <ns0:spacing ns0:after="40" ns0:before="40"/>
+            </ns0:pPr>
+            <ns0:r>
+              <ns0:rPr>
+                <ns0:rFonts ns0:ascii="Arial" ns0:cs="Arial" ns0:hAnsi="Arial"/>
+                <ns0:b/>
+                <ns0:bCs/>
+                <ns0:color ns0:val="375623"/>
+                <ns0:sz ns0:val="18"/>
+                <ns0:szCs ns0:val="18"/>
+              </ns0:rPr>
+              <ns0:t>NEW</ns0:t>
+            </ns0:r>
+          </ns0:p>
+        </ns0:tc>
+        <ns0:tc>
+          <ns0:tcPr>
+            <ns0:tcW ns0:type="dxa" ns0:w="8460"/>
+            <ns0:tcBorders>
+              <ns0:top ns0:val="single" ns0:color="CCCCCC" ns0:sz="1"/>
+              <ns0:left ns0:val="single" ns0:color="CCCCCC" ns0:sz="1"/>
+              <ns0:bottom ns0:val="single" ns0:color="CCCCCC" ns0:sz="1"/>
+              <ns0:right ns0:val="single" ns0:color="CCCCCC" ns0:sz="1"/>
+            </ns0:tcBorders>
+            <ns0:shd ns0:fill="FFFFFF" ns0:val="clear"/>
+            <ns0:tcMar>
+              <ns0:top ns0:type="dxa" ns0:w="80"/>
+              <ns0:left ns0:type="dxa" ns0:w="120"/>
+              <ns0:bottom ns0:type="dxa" ns0:w="80"/>
+              <ns0:right ns0:type="dxa" ns0:w="120"/>
+            </ns0:tcMar>
+          </ns0:tcPr>
+          <ns0:p>
+            <ns0:pPr>
+              <ns0:spacing ns0:after="40" ns0:before="40"/>
+            </ns0:pPr>
+            <ns0:r>
+              <ns0:rPr>
+                <ns0:rFonts ns0:ascii="Arial" ns0:cs="Arial" ns0:hAnsi="Arial"/>
+                <ns0:sz ns0:val="18"/>
+                <ns0:szCs ns0:val="18"/>
+              </ns0:rPr>
+              <ns0:t xml:space="preserve">XML downloads: battle_events_h52.xml, raids_x42.xml, faction_wars_fp3.xml, event_box.xml, conquest.xml, mini_packs_36i.xml, assetbundles5_4_2.xml, assetbundles4_6.xml</ns0:t>
+            </ns0:r>
+          </ns0:p>
+        </ns0:tc>
+      </ns0:tr>
+      <ns0:tr>
+        <ns0:tc>
+          <ns0:tcPr>
+            <ns0:tcW ns0:type="dxa" ns0:w="900"/>
+            <ns0:tcBorders>
+              <ns0:top ns0:val="single" ns0:color="CCCCCC" ns0:sz="1"/>
+              <ns0:left ns0:val="single" ns0:color="CCCCCC" ns0:sz="1"/>
+              <ns0:bottom ns0:val="single" ns0:color="CCCCCC" ns0:sz="1"/>
+              <ns0:right ns0:val="single" ns0:color="CCCCCC" ns0:sz="1"/>
+            </ns0:tcBorders>
+            <ns0:shd ns0:fill="E2EFDA" ns0:val="clear"/>
+            <ns0:tcMar>
+              <ns0:top ns0:type="dxa" ns0:w="80"/>
+              <ns0:left ns0:type="dxa" ns0:w="120"/>
+              <ns0:bottom ns0:type="dxa" ns0:w="80"/>
+              <ns0:right ns0:type="dxa" ns0:w="120"/>
+            </ns0:tcMar>
+          </ns0:tcPr>
+          <ns0:p>
+            <ns0:pPr>
+              <ns0:spacing ns0:after="40" ns0:before="40"/>
+            </ns0:pPr>
+            <ns0:r>
+              <ns0:rPr>
+                <ns0:rFonts ns0:ascii="Arial" ns0:cs="Arial" ns0:hAnsi="Arial"/>
+                <ns0:b/>
+                <ns0:bCs/>
+                <ns0:color ns0:val="375623"/>
+                <ns0:sz ns0:val="18"/>
+                <ns0:szCs ns0:val="18"/>
+              </ns0:rPr>
+              <ns0:t>NEW</ns0:t>
+            </ns0:r>
+          </ns0:p>
+        </ns0:tc>
+        <ns0:tc>
+          <ns0:tcPr>
+            <ns0:tcW ns0:type="dxa" ns0:w="8460"/>
+            <ns0:tcBorders>
+              <ns0:top ns0:val="single" ns0:color="CCCCCC" ns0:sz="1"/>
+              <ns0:left ns0:val="single" ns0:color="CCCCCC" ns0:sz="1"/>
+              <ns0:bottom ns0:val="single" ns0:color="CCCCCC" ns0:sz="1"/>
+              <ns0:right ns0:val="single" ns0:color="CCCCCC" ns0:sz="1"/>
+            </ns0:tcBorders>
+            <ns0:shd ns0:fill="FFFFFF" ns0:val="clear"/>
+            <ns0:tcMar>
+              <ns0:top ns0:type="dxa" ns0:w="80"/>
+              <ns0:left ns0:type="dxa" ns0:w="120"/>
+              <ns0:bottom ns0:type="dxa" ns0:w="80"/>
+              <ns0:right ns0:type="dxa" ns0:w="120"/>
+            </ns0:tcMar>
+          </ns0:tcPr>
+          <ns0:p>
+            <ns0:pPr>
+              <ns0:spacing ns0:after="40" ns0:before="40"/>
+            </ns0:pPr>
+            <ns0:r>
+              <ns0:rPr>
+                <ns0:rFonts ns0:ascii="Arial" ns0:cs="Arial" ns0:hAnsi="Arial"/>
+                <ns0:sz ns0:val="18"/>
+                <ns0:szCs ns0:val="18"/>
+              </ns0:rPr>
+              <ns0:t xml:space="preserve">Challenge tables: ENTER_THE_ARENA (8 steps), ORBO_UNDERGROUND (12 steps, MYTHIC_ORBO_ID=58573, pool_unique), DOMINATE_THE_ARENA (9 steps), PROGENITOR_REQUIEM (13 steps)</ns0:t>
+            </ns0:r>
+          </ns0:p>
+        </ns0:tc>
+      </ns0:tr>
+      <ns0:tr>
+        <ns0:tc>
+          <ns0:tcPr>
+            <ns0:tcW ns0:type="dxa" ns0:w="900"/>
+            <ns0:tcBorders>
+              <ns0:top ns0:val="single" ns0:color="CCCCCC" ns0:sz="1"/>
+              <ns0:left ns0:val="single" ns0:color="CCCCCC" ns0:sz="1"/>
+              <ns0:bottom ns0:val="single" ns0:color="CCCCCC" ns0:sz="1"/>
+              <ns0:right ns0:val="single" ns0:color="CCCCCC" ns0:sz="1"/>
+            </ns0:tcBorders>
+            <ns0:shd ns0:fill="E2EFDA" ns0:val="clear"/>
+            <ns0:tcMar>
+              <ns0:top ns0:type="dxa" ns0:w="80"/>
+              <ns0:left ns0:type="dxa" ns0:w="120"/>
+              <ns0:bottom ns0:type="dxa" ns0:w="80"/>
+              <ns0:right ns0:type="dxa" ns0:w="120"/>
+            </ns0:tcMar>
+          </ns0:tcPr>
+          <ns0:p>
+            <ns0:pPr>
+              <ns0:spacing ns0:after="40" ns0:before="40"/>
+            </ns0:pPr>
+            <ns0:r>
+              <ns0:rPr>
+                <ns0:rFonts ns0:ascii="Arial" ns0:cs="Arial" ns0:hAnsi="Arial"/>
+                <ns0:b/>
+                <ns0:bCs/>
+                <ns0:color ns0:val="375623"/>
+                <ns0:sz ns0:val="18"/>
+                <ns0:szCs ns0:val="18"/>
+              </ns0:rPr>
+              <ns0:t>NEW</ns0:t>
+            </ns0:r>
+          </ns0:p>
+        </ns0:tc>
+        <ns0:tc>
+          <ns0:tcPr>
+            <ns0:tcW ns0:type="dxa" ns0:w="8460"/>
+            <ns0:tcBorders>
+              <ns0:top ns0:val="single" ns0:color="CCCCCC" ns0:sz="1"/>
+              <ns0:left ns0:val="single" ns0:color="CCCCCC" ns0:sz="1"/>
+              <ns0:bottom ns0:val="single" ns0:color="CCCCCC" ns0:sz="1"/>
+              <ns0:right ns0:val="single" ns0:color="CCCCCC" ns0:sz="1"/>
+            </ns0:tcBorders>
+            <ns0:shd ns0:fill="FFFFFF" ns0:val="clear"/>
+            <ns0:tcMar>
+              <ns0:top ns0:type="dxa" ns0:w="80"/>
+              <ns0:left ns0:type="dxa" ns0:w="120"/>
+              <ns0:bottom ns0:type="dxa" ns0:w="80"/>
+              <ns0:right ns0:type="dxa" ns0:w="120"/>
+            </ns0:tcMar>
+          </ns0:tcPr>
+          <ns0:p>
+            <ns0:pPr>
+              <ns0:spacing ns0:after="40" ns0:before="40"/>
+            </ns0:pPr>
+            <ns0:r>
+              <ns0:rPr>
+                <ns0:rFonts ns0:ascii="Arial" ns0:cs="Arial" ns0:hAnsi="Arial"/>
+                <ns0:sz ns0:val="18"/>
+                <ns0:szCs ns0:val="18"/>
+              </ns0:rPr>
+              <ns0:t xml:space="preserve">_AUTO_CONFIRM_INPUT module flag — suppresses input_with_esc() and confirm_action() prompts during pipeline deck builds; works on Windows (msvcrt-based input)</ns0:t>
+            </ns0:r>
+          </ns0:p>
+        </ns0:tc>
+      </ns0:tr>
+      <ns0:tr>
+        <ns0:tc>
+          <ns0:tcPr>
+            <ns0:tcW ns0:type="dxa" ns0:w="900"/>
+            <ns0:tcBorders>
+              <ns0:top ns0:val="single" ns0:color="CCCCCC" ns0:sz="1"/>
+              <ns0:left ns0:val="single" ns0:color="CCCCCC" ns0:sz="1"/>
+              <ns0:bottom ns0:val="single" ns0:color="CCCCCC" ns0:sz="1"/>
+              <ns0:right ns0:val="single" ns0:color="CCCCCC" ns0:sz="1"/>
+            </ns0:tcBorders>
+            <ns0:shd ns0:fill="E2EFDA" ns0:val="clear"/>
+            <ns0:tcMar>
+              <ns0:top ns0:type="dxa" ns0:w="80"/>
+              <ns0:left ns0:type="dxa" ns0:w="120"/>
+              <ns0:bottom ns0:type="dxa" ns0:w="80"/>
+              <ns0:right ns0:type="dxa" ns0:w="120"/>
+            </ns0:tcMar>
+          </ns0:tcPr>
+          <ns0:p>
+            <ns0:pPr>
+              <ns0:spacing ns0:after="40" ns0:before="40"/>
+            </ns0:pPr>
+            <ns0:r>
+              <ns0:rPr>
+                <ns0:rFonts ns0:ascii="Arial" ns0:cs="Arial" ns0:hAnsi="Arial"/>
+                <ns0:b/>
+                <ns0:bCs/>
+                <ns0:color ns0:val="375623"/>
+                <ns0:sz ns0:val="18"/>
+                <ns0:szCs ns0:val="18"/>
+              </ns0:rPr>
+              <ns0:t>COMPLETE</ns0:t>
+            </ns0:r>
+          </ns0:p>
+        </ns0:tc>
+        <ns0:tc>
+          <ns0:tcPr>
+            <ns0:tcW ns0:type="dxa" ns0:w="8460"/>
+            <ns0:tcBorders>
+              <ns0:top ns0:val="single" ns0:color="CCCCCC" ns0:sz="1"/>
+              <ns0:left ns0:val="single" ns0:color="CCCCCC" ns0:sz="1"/>
+              <ns0:bottom ns0:val="single" ns0:color="CCCCCC" ns0:sz="1"/>
+              <ns0:right ns0:val="single" ns0:color="CCCCCC" ns0:sz="1"/>
+            </ns0:tcBorders>
+            <ns0:shd ns0:fill="FFFFFF" ns0:val="clear"/>
+            <ns0:tcMar>
+              <ns0:top ns0:type="dxa" ns0:w="80"/>
+              <ns0:left ns0:type="dxa" ns0:w="120"/>
+              <ns0:bottom ns0:type="dxa" ns0:w="80"/>
+              <ns0:right ns0:type="dxa" ns0:w="120"/>
+            </ns0:tcMar>
+          </ns0:tcPr>
+          <ns0:p>
+            <ns0:pPr>
+              <ns0:spacing ns0:after="40" ns0:before="40"/>
+            </ns0:pPr>
+            <ns0:r>
+              <ns0:rPr>
+                <ns0:rFonts ns0:ascii="Arial" ns0:cs="Arial" ns0:hAnsi="Arial"/>
+                <ns0:sz ns0:val="18"/>
+                <ns0:szCs ns0:val="18"/>
+              </ns0:rPr>
+              <ns0:t xml:space="preserve">EXTREME_CHALLENGES — all 28 steps with desc, pvp, commander, pool; Step 6 destroy-structure pool; Step 8 own-structure pool</ns0:t>
+            </ns0:r>
+          </ns0:p>
+        </ns0:tc>
+      </ns0:tr>
+      <ns0:tr>
+        <ns0:tc>
+          <ns0:tcPr>
+            <ns0:tcW ns0:type="dxa" ns0:w="900"/>
+            <ns0:tcBorders>
+              <ns0:top ns0:val="single" ns0:color="CCCCCC" ns0:sz="1"/>
+              <ns0:left ns0:val="single" ns0:color="CCCCCC" ns0:sz="1"/>
+              <ns0:bottom ns0:val="single" ns0:color="CCCCCC" ns0:sz="1"/>
+              <ns0:right ns0:val="single" ns0:color="CCCCCC" ns0:sz="1"/>
+            </ns0:tcBorders>
+            <ns0:shd ns0:fill="E2EFDA" ns0:val="clear"/>
+            <ns0:tcMar>
+              <ns0:top ns0:type="dxa" ns0:w="80"/>
+              <ns0:left ns0:type="dxa" ns0:w="120"/>
+              <ns0:bottom ns0:type="dxa" ns0:w="80"/>
+              <ns0:right ns0:type="dxa" ns0:w="120"/>
+            </ns0:tcMar>
+          </ns0:tcPr>
+          <ns0:p>
+            <ns0:pPr>
+              <ns0:spacing ns0:after="40" ns0:before="40"/>
+            </ns0:pPr>
+            <ns0:r>
+              <ns0:rPr>
+                <ns0:rFonts ns0:ascii="Arial" ns0:cs="Arial" ns0:hAnsi="Arial"/>
+                <ns0:b/>
+                <ns0:bCs/>
+                <ns0:color ns0:val="375623"/>
+                <ns0:sz ns0:val="18"/>
+                <ns0:szCs ns0:val="18"/>
+              </ns0:rPr>
+              <ns0:t>COMPLETE</ns0:t>
+            </ns0:r>
+          </ns0:p>
+        </ns0:tc>
+        <ns0:tc>
+          <ns0:tcPr>
+            <ns0:tcW ns0:type="dxa" ns0:w="8460"/>
+            <ns0:tcBorders>
+              <ns0:top ns0:val="single" ns0:color="CCCCCC" ns0:sz="1"/>
+              <ns0:left ns0:val="single" ns0:color="CCCCCC" ns0:sz="1"/>
+              <ns0:bottom ns0:val="single" ns0:color="CCCCCC" ns0:sz="1"/>
+              <ns0:right ns0:val="single" ns0:color="CCCCCC" ns0:sz="1"/>
+            </ns0:tcBorders>
+            <ns0:shd ns0:fill="FFFFFF" ns0:val="clear"/>
+            <ns0:tcMar>
+              <ns0:top ns0:type="dxa" ns0:w="80"/>
+              <ns0:left ns0:type="dxa" ns0:w="120"/>
+              <ns0:bottom ns0:type="dxa" ns0:w="80"/>
+              <ns0:right ns0:type="dxa" ns0:w="120"/>
+            </ns0:tcMar>
+          </ns0:tcPr>
+          <ns0:p>
+            <ns0:pPr>
+              <ns0:spacing ns0:after="40" ns0:before="40"/>
+            </ns0:pPr>
+            <ns0:r>
+              <ns0:rPr>
+                <ns0:rFonts ns0:ascii="Arial" ns0:cs="Arial" ns0:hAnsi="Arial"/>
+                <ns0:sz ns0:val="18"/>
+                <ns0:szCs ns0:val="18"/>
+              </ns0:rPr>
+              <ns0:t xml:space="preserve">MASTER_ARENA_CHALLENGES — all 8 steps with desc, pvp, faction pools</ns0:t>
+            </ns0:r>
+          </ns0:p>
+        </ns0:tc>
+      </ns0:tr>
+      <ns0:tr>
+        <ns0:tc>
+          <ns0:tcPr>
+            <ns0:tcW ns0:type="dxa" ns0:w="900"/>
+            <ns0:tcBorders>
+              <ns0:top ns0:val="single" ns0:color="CCCCCC" ns0:sz="1"/>
+              <ns0:left ns0:val="single" ns0:color="CCCCCC" ns0:sz="1"/>
+              <ns0:bottom ns0:val="single" ns0:color="CCCCCC" ns0:sz="1"/>
+              <ns0:right ns0:val="single" ns0:color="CCCCCC" ns0:sz="1"/>
+            </ns0:tcBorders>
+            <ns0:shd ns0:fill="E2EFDA" ns0:val="clear"/>
+            <ns0:tcMar>
+              <ns0:top ns0:type="dxa" ns0:w="80"/>
+              <ns0:left ns0:type="dxa" ns0:w="120"/>
+              <ns0:bottom ns0:type="dxa" ns0:w="80"/>
+              <ns0:right ns0:type="dxa" ns0:w="120"/>
+            </ns0:tcMar>
+          </ns0:tcPr>
+          <ns0:p>
+            <ns0:pPr>
+              <ns0:spacing ns0:after="40" ns0:before="40"/>
+            </ns0:pPr>
+            <ns0:r>
+              <ns0:rPr>
+                <ns0:rFonts ns0:ascii="Arial" ns0:cs="Arial" ns0:hAnsi="Arial"/>
+                <ns0:b/>
+                <ns0:bCs/>
+                <ns0:color ns0:val="375623"/>
+                <ns0:sz ns0:val="18"/>
+                <ns0:szCs ns0:val="18"/>
+              </ns0:rPr>
+              <ns0:t>COMPLETE</ns0:t>
+            </ns0:r>
+          </ns0:p>
+        </ns0:tc>
+        <ns0:tc>
+          <ns0:tcPr>
+            <ns0:tcW ns0:type="dxa" ns0:w="8460"/>
+            <ns0:tcBorders>
+              <ns0:top ns0:val="single" ns0:color="CCCCCC" ns0:sz="1"/>
+              <ns0:left ns0:val="single" ns0:color="CCCCCC" ns0:sz="1"/>
+              <ns0:bottom ns0:val="single" ns0:color="CCCCCC" ns0:sz="1"/>
+              <ns0:right ns0:val="single" ns0:color="CCCCCC" ns0:sz="1"/>
+            </ns0:tcBorders>
+            <ns0:shd ns0:fill="FFFFFF" ns0:val="clear"/>
+            <ns0:tcMar>
+              <ns0:top ns0:type="dxa" ns0:w="80"/>
+              <ns0:left ns0:type="dxa" ns0:w="120"/>
+              <ns0:bottom ns0:type="dxa" ns0:w="80"/>
+              <ns0:right ns0:type="dxa" ns0:w="120"/>
+            </ns0:tcMar>
+          </ns0:tcPr>
+          <ns0:p>
+            <ns0:pPr>
+              <ns0:spacing ns0:after="40" ns0:before="40"/>
+            </ns0:pPr>
+            <ns0:r>
+              <ns0:rPr>
+                <ns0:rFonts ns0:ascii="Arial" ns0:cs="Arial" ns0:hAnsi="Arial"/>
+                <ns0:sz ns0:val="18"/>
+                <ns0:szCs ns0:val="18"/>
+              </ns0:rPr>
+              <ns0:t xml:space="preserve">CUTLASS_CHALLENGES — all 4 steps with desc, pvp, required cards (Cutlass Jagged / Cutlass Jag)</ns0:t>
             </ns0:r>
           </ns0:p>
         </ns0:tc>
@@ -35312,7 +36024,7 @@
                 <ns0:sz ns0:val="18"/>
                 <ns0:szCs ns0:val="18"/>
               </ns0:rPr>
-              <ns0:t>NEW</ns0:t>
+              <ns0:t>LEGACY</ns0:t>
             </ns0:r>
           </ns0:p>
         </ns0:tc>
@@ -35343,7 +36055,7 @@
                 <ns0:sz ns0:val="18"/>
                 <ns0:szCs ns0:val="18"/>
               </ns0:rPr>
-              <ns0:t xml:space="preserve">F→28 Auto: Event + Quest Mission + Arena — auto-detects active event (Raid/Brawl) per loop pass from XML; GW prep-phase guard; PvP Challenge deck for Arena phase</ns0:t>
+              <ns0:t xml:space="preserve">LOYAL_CHALLENGES — marked # LEGACY (Aug 2026 one-time event)</ns0:t>
             </ns0:r>
           </ns0:p>
         </ns0:tc>
@@ -35358,7 +36070,7 @@
               <ns0:bottom ns0:val="single" ns0:color="CCCCCC" ns0:sz="1"/>
               <ns0:right ns0:val="single" ns0:color="CCCCCC" ns0:sz="1"/>
             </ns0:tcBorders>
-            <ns0:shd ns0:fill="E2EFDA" ns0:val="clear"/>
+            <ns0:shd ns0:fill="D5E8F0" ns0:val="clear"/>
             <ns0:tcMar>
               <ns0:top ns0:type="dxa" ns0:w="80"/>
               <ns0:left ns0:type="dxa" ns0:w="120"/>
@@ -35379,7 +36091,7 @@
                 <ns0:sz ns0:val="18"/>
                 <ns0:szCs ns0:val="18"/>
               </ns0:rPr>
-              <ns0:t>NEW</ns0:t>
+              <ns0:t>FIX</ns0:t>
             </ns0:r>
           </ns0:p>
         </ns0:tc>
@@ -35410,7 +36122,7 @@
                 <ns0:sz ns0:val="18"/>
                 <ns0:szCs ns0:val="18"/>
               </ns0:rPr>
-              <ns0:t xml:space="preserve">F→29 Auto: Event + Quest Mission + Arena (GW Pipeline) — GW phase prepended when _gw_in_active_phase() is True</ns0:t>
+              <ns0:t xml:space="preserve">F→17 Multi-Account GW — GW prep-phase guard; warns if faction_wars_fp3.xml shows no active battle phase</ns0:t>
             </ns0:r>
           </ns0:p>
         </ns0:tc>
@@ -35425,7 +36137,7 @@
               <ns0:bottom ns0:val="single" ns0:color="CCCCCC" ns0:sz="1"/>
               <ns0:right ns0:val="single" ns0:color="CCCCCC" ns0:sz="1"/>
             </ns0:tcBorders>
-            <ns0:shd ns0:fill="E2EFDA" ns0:val="clear"/>
+            <ns0:shd ns0:fill="D5E8F0" ns0:val="clear"/>
             <ns0:tcMar>
               <ns0:top ns0:type="dxa" ns0:w="80"/>
               <ns0:left ns0:type="dxa" ns0:w="120"/>
@@ -35446,7 +36158,7 @@
                 <ns0:sz ns0:val="18"/>
                 <ns0:szCs ns0:val="18"/>
               </ns0:rPr>
-              <ns0:t>NEW</ns0:t>
+              <ns0:t>FIX</ns0:t>
             </ns0:r>
           </ns0:p>
         </ns0:tc>
@@ -35477,7 +36189,7 @@
                 <ns0:sz ns0:val="18"/>
                 <ns0:szCs ns0:val="18"/>
               </ns0:rPr>
-              <ns0:t xml:space="preserve">_detect_active_event_from_xml() — reads raids_x42.xml (&lt;raid&gt;) and battle_events_h52.xml (&lt;battle_event&gt;); timestamps via findtext() (child elements, not attributes); Raid checked before Brawl</ns0:t>
+              <ns0:t xml:space="preserve">Event detection XML parsing — all three event XMLs use child elements not attributes; Raid (&lt;raid&gt;), Brawl (&lt;battle_event&gt;), GW (&lt;faction_war&gt;)</ns0:t>
             </ns0:r>
           </ns0:p>
         </ns0:tc>
@@ -35492,7 +36204,7 @@
               <ns0:bottom ns0:val="single" ns0:color="CCCCCC" ns0:sz="1"/>
               <ns0:right ns0:val="single" ns0:color="CCCCCC" ns0:sz="1"/>
             </ns0:tcBorders>
-            <ns0:shd ns0:fill="E2EFDA" ns0:val="clear"/>
+            <ns0:shd ns0:fill="D5E8F0" ns0:val="clear"/>
             <ns0:tcMar>
               <ns0:top ns0:type="dxa" ns0:w="80"/>
               <ns0:left ns0:type="dxa" ns0:w="120"/>
@@ -35513,7 +36225,7 @@
                 <ns0:sz ns0:val="18"/>
                 <ns0:szCs ns0:val="18"/>
               </ns0:rPr>
-              <ns0:t>NEW</ns0:t>
+              <ns0:t>FIX</ns0:t>
             </ns0:r>
           </ns0:p>
         </ns0:tc>
@@ -35544,7 +36256,7 @@
                 <ns0:sz ns0:val="18"/>
                 <ns0:szCs ns0:val="18"/>
               </ns0:rPr>
-              <ns0:t xml:space="preserve">_gw_in_active_phase() — reads faction_wars_fp3.xml (&lt;faction_war&gt;); child-element timestamps</ns0:t>
+              <ns0:t xml:space="preserve">F→28 per-loop event re-detection — event_type re-read at start of each loop pass; stale events no longer carried forward</ns0:t>
             </ns0:r>
           </ns0:p>
         </ns0:tc>
@@ -35559,7 +36271,7 @@
               <ns0:bottom ns0:val="single" ns0:color="CCCCCC" ns0:sz="1"/>
               <ns0:right ns0:val="single" ns0:color="CCCCCC" ns0:sz="1"/>
             </ns0:tcBorders>
-            <ns0:shd ns0:fill="E2EFDA" ns0:val="clear"/>
+            <ns0:shd ns0:fill="D5E8F0" ns0:val="clear"/>
             <ns0:tcMar>
               <ns0:top ns0:type="dxa" ns0:w="80"/>
               <ns0:left ns0:type="dxa" ns0:w="120"/>
@@ -35580,7 +36292,7 @@
                 <ns0:sz ns0:val="18"/>
                 <ns0:szCs ns0:val="18"/>
               </ns0:rPr>
-              <ns0:t>NEW</ns0:t>
+              <ns0:t>FIX</ns0:t>
             </ns0:r>
           </ns0:p>
         </ns0:tc>
@@ -35611,7 +36323,7 @@
                 <ns0:sz ns0:val="18"/>
                 <ns0:szCs ns0:val="18"/>
               </ns0:rPr>
-              <ns0:t xml:space="preserve">XML downloads: battle_events_h52.xml, raids_x42.xml, faction_wars_fp3.xml, event_box.xml, conquest.xml, mini_packs_36i.xml, assetbundles5_4_2.xml, assetbundles4_6.xml</ns0:t>
+              <ns0:t xml:space="preserve">Brawl always logged in pipeline (_brawl_cl = True); no prompt; activates automatically when Brawl detected</ns0:t>
             </ns0:r>
           </ns0:p>
         </ns0:tc>
@@ -35626,7 +36338,7 @@
               <ns0:bottom ns0:val="single" ns0:color="CCCCCC" ns0:sz="1"/>
               <ns0:right ns0:val="single" ns0:color="CCCCCC" ns0:sz="1"/>
             </ns0:tcBorders>
-            <ns0:shd ns0:fill="E2EFDA" ns0:val="clear"/>
+            <ns0:shd ns0:fill="D5E8F0" ns0:val="clear"/>
             <ns0:tcMar>
               <ns0:top ns0:type="dxa" ns0:w="80"/>
               <ns0:left ns0:type="dxa" ns0:w="120"/>
@@ -35647,7 +36359,7 @@
                 <ns0:sz ns0:val="18"/>
                 <ns0:szCs ns0:val="18"/>
               </ns0:rPr>
-              <ns0:t>NEW</ns0:t>
+              <ns0:t>FIX</ns0:t>
             </ns0:r>
           </ns0:p>
         </ns0:tc>
@@ -35678,7 +36390,7 @@
                 <ns0:sz ns0:val="18"/>
                 <ns0:szCs ns0:val="18"/>
               </ns0:rPr>
-              <ns0:t xml:space="preserve">Challenge tables: ENTER_THE_ARENA (8 steps), ORBO_UNDERGROUND (12 steps, MYTHIC_ORBO_ID=58573, pool_unique), DOMINATE_THE_ARENA (9 steps), PROGENITOR_REQUIEM (13 steps)</ns0:t>
+              <ns0:t xml:space="preserve">Raid drain after event end — getRaidInfo checked per account when event_type=None; leftover energy drained if battle_energy &gt; 0</ns0:t>
             </ns0:r>
           </ns0:p>
         </ns0:tc>
@@ -35693,7 +36405,7 @@
               <ns0:bottom ns0:val="single" ns0:color="CCCCCC" ns0:sz="1"/>
               <ns0:right ns0:val="single" ns0:color="CCCCCC" ns0:sz="1"/>
             </ns0:tcBorders>
-            <ns0:shd ns0:fill="E2EFDA" ns0:val="clear"/>
+            <ns0:shd ns0:fill="D5E8F0" ns0:val="clear"/>
             <ns0:tcMar>
               <ns0:top ns0:type="dxa" ns0:w="80"/>
               <ns0:left ns0:type="dxa" ns0:w="120"/>
@@ -35714,7 +36426,7 @@
                 <ns0:sz ns0:val="18"/>
                 <ns0:szCs ns0:val="18"/>
               </ns0:rPr>
-              <ns0:t>NEW</ns0:t>
+              <ns0:t>FIX</ns0:t>
             </ns0:r>
           </ns0:p>
         </ns0:tc>
@@ -35745,7 +36457,7 @@
                 <ns0:sz ns0:val="18"/>
                 <ns0:szCs ns0:val="18"/>
               </ns0:rPr>
-              <ns0:t xml:space="preserve">_AUTO_CONFIRM_INPUT module flag — suppresses input_with_esc() and confirm_action() prompts during pipeline deck builds; works on Windows (msvcrt-based input)</ns0:t>
+              <ns0:t xml:space="preserve">play_raid_loop(silent=True) in pipeline — suppresses start prompt</ns0:t>
             </ns0:r>
           </ns0:p>
         </ns0:tc>
@@ -35760,7 +36472,7 @@
               <ns0:bottom ns0:val="single" ns0:color="CCCCCC" ns0:sz="1"/>
               <ns0:right ns0:val="single" ns0:color="CCCCCC" ns0:sz="1"/>
             </ns0:tcBorders>
-            <ns0:shd ns0:fill="E2EFDA" ns0:val="clear"/>
+            <ns0:shd ns0:fill="D5E8F0" ns0:val="clear"/>
             <ns0:tcMar>
               <ns0:top ns0:type="dxa" ns0:w="80"/>
               <ns0:left ns0:type="dxa" ns0:w="120"/>
@@ -35781,7 +36493,7 @@
                 <ns0:sz ns0:val="18"/>
                 <ns0:szCs ns0:val="18"/>
               </ns0:rPr>
-              <ns0:t>COMPLETE</ns0:t>
+              <ns0:t>FIX</ns0:t>
             </ns0:r>
           </ns0:p>
         </ns0:tc>
@@ -35812,7 +36524,7 @@
                 <ns0:sz ns0:val="18"/>
                 <ns0:szCs ns0:val="18"/>
               </ns0:rPr>
-              <ns0:t xml:space="preserve">EXTREME_CHALLENGES — all 28 steps with desc, pvp, commander, pool; Step 6 destroy-structure pool; Step 8 own-structure pool</ns0:t>
+              <ns0:t xml:space="preserve">BGE override: Overcharged → Overload all in _api_bge_to_tuo() explicit map</ns0:t>
             </ns0:r>
           </ns0:p>
         </ns0:tc>
@@ -35827,7 +36539,7 @@
               <ns0:bottom ns0:val="single" ns0:color="CCCCCC" ns0:sz="1"/>
               <ns0:right ns0:val="single" ns0:color="CCCCCC" ns0:sz="1"/>
             </ns0:tcBorders>
-            <ns0:shd ns0:fill="E2EFDA" ns0:val="clear"/>
+            <ns0:shd ns0:fill="D5E8F0" ns0:val="clear"/>
             <ns0:tcMar>
               <ns0:top ns0:type="dxa" ns0:w="80"/>
               <ns0:left ns0:type="dxa" ns0:w="120"/>
@@ -35848,7 +36560,7 @@
                 <ns0:sz ns0:val="18"/>
                 <ns0:szCs ns0:val="18"/>
               </ns0:rPr>
-              <ns0:t>COMPLETE</ns0:t>
+              <ns0:t>FIX</ns0:t>
             </ns0:r>
           </ns0:p>
         </ns0:tc>
@@ -35879,7 +36591,7 @@
                 <ns0:sz ns0:val="18"/>
                 <ns0:szCs ns0:val="18"/>
               </ns0:rPr>
-              <ns0:t xml:space="preserve">MASTER_ARENA_CHALLENGES — all 8 steps with desc, pvp, faction pools</ns0:t>
+              <ns0:t xml:space="preserve">Issues log renamed: loyal_challenge_issues.txt → pvp_challenge_issues.txt</ns0:t>
             </ns0:r>
           </ns0:p>
         </ns0:tc>
@@ -35894,7 +36606,7 @@
               <ns0:bottom ns0:val="single" ns0:color="CCCCCC" ns0:sz="1"/>
               <ns0:right ns0:val="single" ns0:color="CCCCCC" ns0:sz="1"/>
             </ns0:tcBorders>
-            <ns0:shd ns0:fill="E2EFDA" ns0:val="clear"/>
+            <ns0:shd ns0:fill="D5E8F0" ns0:val="clear"/>
             <ns0:tcMar>
               <ns0:top ns0:type="dxa" ns0:w="80"/>
               <ns0:left ns0:type="dxa" ns0:w="120"/>
@@ -35915,7 +36627,7 @@
                 <ns0:sz ns0:val="18"/>
                 <ns0:szCs ns0:val="18"/>
               </ns0:rPr>
-              <ns0:t>COMPLETE</ns0:t>
+              <ns0:t>FIX</ns0:t>
             </ns0:r>
           </ns0:p>
         </ns0:tc>
@@ -35946,7 +36658,7 @@
                 <ns0:sz ns0:val="18"/>
                 <ns0:szCs ns0:val="18"/>
               </ns0:rPr>
-              <ns0:t xml:space="preserve">CUTLASS_CHALLENGES — all 4 steps with desc, pvp, required cards (Cutlass Jagged / Cutlass Jag)</ns0:t>
+              <ns0:t xml:space="preserve">Duplicate menu entry "14. Refill Arena Stamina" in single-account section removed</ns0:t>
             </ns0:r>
           </ns0:p>
         </ns0:tc>
@@ -35961,7 +36673,7 @@
               <ns0:bottom ns0:val="single" ns0:color="CCCCCC" ns0:sz="1"/>
               <ns0:right ns0:val="single" ns0:color="CCCCCC" ns0:sz="1"/>
             </ns0:tcBorders>
-            <ns0:shd ns0:fill="E2EFDA" ns0:val="clear"/>
+            <ns0:shd ns0:fill="D5E8F0" ns0:val="clear"/>
             <ns0:tcMar>
               <ns0:top ns0:type="dxa" ns0:w="80"/>
               <ns0:left ns0:type="dxa" ns0:w="120"/>
@@ -35982,7 +36694,7 @@
                 <ns0:sz ns0:val="18"/>
                 <ns0:szCs ns0:val="18"/>
               </ns0:rPr>
-              <ns0:t>LEGACY</ns0:t>
+              <ns0:t>FIX</ns0:t>
             </ns0:r>
           </ns0:p>
         </ns0:tc>
@@ -36013,7 +36725,7 @@
                 <ns0:sz ns0:val="18"/>
                 <ns0:szCs ns0:val="18"/>
               </ns0:rPr>
-              <ns0:t xml:space="preserve">LOYAL_CHALLENGES — marked # LEGACY (Aug 2026 one-time event)</ns0:t>
+              <ns0:t xml:space="preserve">Helper methods reconstructed after file corruption: _collect_settings_files(), _load_setting(), _select_account_range()</ns0:t>
             </ns0:r>
           </ns0:p>
         </ns0:tc>
@@ -36028,7 +36740,7 @@
               <ns0:bottom ns0:val="single" ns0:color="CCCCCC" ns0:sz="1"/>
               <ns0:right ns0:val="single" ns0:color="CCCCCC" ns0:sz="1"/>
             </ns0:tcBorders>
-            <ns0:shd ns0:fill="E2EFDA" ns0:val="clear"/>
+            <ns0:shd ns0:fill="D5E8F0" ns0:val="clear"/>
             <ns0:tcMar>
               <ns0:top ns0:type="dxa" ns0:w="80"/>
               <ns0:left ns0:type="dxa" ns0:w="120"/>
@@ -36080,7 +36792,7 @@
                 <ns0:sz ns0:val="18"/>
                 <ns0:szCs ns0:val="18"/>
               </ns0:rPr>
-              <ns0:t xml:space="preserve">F→17 Multi-Account GW — GW prep-phase guard; warns if faction_wars_fp3.xml shows no active battle phase</ns0:t>
+              <ns0:t xml:space="preserve">claim_event_rewards docstring: claimGuildwarRewards → claimFactionWarRewards</ns0:t>
             </ns0:r>
           </ns0:p>
         </ns0:tc>
@@ -36095,677 +36807,7 @@
               <ns0:bottom ns0:val="single" ns0:color="CCCCCC" ns0:sz="1"/>
               <ns0:right ns0:val="single" ns0:color="CCCCCC" ns0:sz="1"/>
             </ns0:tcBorders>
-            <ns0:shd ns0:fill="E2EFDA" ns0:val="clear"/>
-            <ns0:tcMar>
-              <ns0:top ns0:type="dxa" ns0:w="80"/>
-              <ns0:left ns0:type="dxa" ns0:w="120"/>
-              <ns0:bottom ns0:type="dxa" ns0:w="80"/>
-              <ns0:right ns0:type="dxa" ns0:w="120"/>
-            </ns0:tcMar>
-          </ns0:tcPr>
-          <ns0:p>
-            <ns0:pPr>
-              <ns0:spacing ns0:after="40" ns0:before="40"/>
-            </ns0:pPr>
-            <ns0:r>
-              <ns0:rPr>
-                <ns0:rFonts ns0:ascii="Arial" ns0:cs="Arial" ns0:hAnsi="Arial"/>
-                <ns0:b/>
-                <ns0:bCs/>
-                <ns0:color ns0:val="1F4E79"/>
-                <ns0:sz ns0:val="18"/>
-                <ns0:szCs ns0:val="18"/>
-              </ns0:rPr>
-              <ns0:t>FIX</ns0:t>
-            </ns0:r>
-          </ns0:p>
-        </ns0:tc>
-        <ns0:tc>
-          <ns0:tcPr>
-            <ns0:tcW ns0:type="dxa" ns0:w="8460"/>
-            <ns0:tcBorders>
-              <ns0:top ns0:val="single" ns0:color="CCCCCC" ns0:sz="1"/>
-              <ns0:left ns0:val="single" ns0:color="CCCCCC" ns0:sz="1"/>
-              <ns0:bottom ns0:val="single" ns0:color="CCCCCC" ns0:sz="1"/>
-              <ns0:right ns0:val="single" ns0:color="CCCCCC" ns0:sz="1"/>
-            </ns0:tcBorders>
-            <ns0:shd ns0:fill="FFFFFF" ns0:val="clear"/>
-            <ns0:tcMar>
-              <ns0:top ns0:type="dxa" ns0:w="80"/>
-              <ns0:left ns0:type="dxa" ns0:w="120"/>
-              <ns0:bottom ns0:type="dxa" ns0:w="80"/>
-              <ns0:right ns0:type="dxa" ns0:w="120"/>
-            </ns0:tcMar>
-          </ns0:tcPr>
-          <ns0:p>
-            <ns0:pPr>
-              <ns0:spacing ns0:after="40" ns0:before="40"/>
-            </ns0:pPr>
-            <ns0:r>
-              <ns0:rPr>
-                <ns0:rFonts ns0:ascii="Arial" ns0:cs="Arial" ns0:hAnsi="Arial"/>
-                <ns0:sz ns0:val="18"/>
-                <ns0:szCs ns0:val="18"/>
-              </ns0:rPr>
-              <ns0:t xml:space="preserve">Event detection XML parsing — all three event XMLs use child elements not attributes; Raid (&lt;raid&gt;), Brawl (&lt;battle_event&gt;), GW (&lt;faction_war&gt;)</ns0:t>
-            </ns0:r>
-          </ns0:p>
-        </ns0:tc>
-      </ns0:tr>
-      <ns0:tr>
-        <ns0:tc>
-          <ns0:tcPr>
-            <ns0:tcW ns0:type="dxa" ns0:w="900"/>
-            <ns0:tcBorders>
-              <ns0:top ns0:val="single" ns0:color="CCCCCC" ns0:sz="1"/>
-              <ns0:left ns0:val="single" ns0:color="CCCCCC" ns0:sz="1"/>
-              <ns0:bottom ns0:val="single" ns0:color="CCCCCC" ns0:sz="1"/>
-              <ns0:right ns0:val="single" ns0:color="CCCCCC" ns0:sz="1"/>
-            </ns0:tcBorders>
-            <ns0:shd ns0:fill="E2EFDA" ns0:val="clear"/>
-            <ns0:tcMar>
-              <ns0:top ns0:type="dxa" ns0:w="80"/>
-              <ns0:left ns0:type="dxa" ns0:w="120"/>
-              <ns0:bottom ns0:type="dxa" ns0:w="80"/>
-              <ns0:right ns0:type="dxa" ns0:w="120"/>
-            </ns0:tcMar>
-          </ns0:tcPr>
-          <ns0:p>
-            <ns0:pPr>
-              <ns0:spacing ns0:after="40" ns0:before="40"/>
-            </ns0:pPr>
-            <ns0:r>
-              <ns0:rPr>
-                <ns0:rFonts ns0:ascii="Arial" ns0:cs="Arial" ns0:hAnsi="Arial"/>
-                <ns0:b/>
-                <ns0:bCs/>
-                <ns0:color ns0:val="1F4E79"/>
-                <ns0:sz ns0:val="18"/>
-                <ns0:szCs ns0:val="18"/>
-              </ns0:rPr>
-              <ns0:t>FIX</ns0:t>
-            </ns0:r>
-          </ns0:p>
-        </ns0:tc>
-        <ns0:tc>
-          <ns0:tcPr>
-            <ns0:tcW ns0:type="dxa" ns0:w="8460"/>
-            <ns0:tcBorders>
-              <ns0:top ns0:val="single" ns0:color="CCCCCC" ns0:sz="1"/>
-              <ns0:left ns0:val="single" ns0:color="CCCCCC" ns0:sz="1"/>
-              <ns0:bottom ns0:val="single" ns0:color="CCCCCC" ns0:sz="1"/>
-              <ns0:right ns0:val="single" ns0:color="CCCCCC" ns0:sz="1"/>
-            </ns0:tcBorders>
-            <ns0:shd ns0:fill="FFFFFF" ns0:val="clear"/>
-            <ns0:tcMar>
-              <ns0:top ns0:type="dxa" ns0:w="80"/>
-              <ns0:left ns0:type="dxa" ns0:w="120"/>
-              <ns0:bottom ns0:type="dxa" ns0:w="80"/>
-              <ns0:right ns0:type="dxa" ns0:w="120"/>
-            </ns0:tcMar>
-          </ns0:tcPr>
-          <ns0:p>
-            <ns0:pPr>
-              <ns0:spacing ns0:after="40" ns0:before="40"/>
-            </ns0:pPr>
-            <ns0:r>
-              <ns0:rPr>
-                <ns0:rFonts ns0:ascii="Arial" ns0:cs="Arial" ns0:hAnsi="Arial"/>
-                <ns0:sz ns0:val="18"/>
-                <ns0:szCs ns0:val="18"/>
-              </ns0:rPr>
-              <ns0:t xml:space="preserve">F→28 per-loop event re-detection — event_type re-read at start of each loop pass; stale events no longer carried forward</ns0:t>
-            </ns0:r>
-          </ns0:p>
-        </ns0:tc>
-      </ns0:tr>
-      <ns0:tr>
-        <ns0:tc>
-          <ns0:tcPr>
-            <ns0:tcW ns0:type="dxa" ns0:w="900"/>
-            <ns0:tcBorders>
-              <ns0:top ns0:val="single" ns0:color="CCCCCC" ns0:sz="1"/>
-              <ns0:left ns0:val="single" ns0:color="CCCCCC" ns0:sz="1"/>
-              <ns0:bottom ns0:val="single" ns0:color="CCCCCC" ns0:sz="1"/>
-              <ns0:right ns0:val="single" ns0:color="CCCCCC" ns0:sz="1"/>
-            </ns0:tcBorders>
-            <ns0:shd ns0:fill="E2EFDA" ns0:val="clear"/>
-            <ns0:tcMar>
-              <ns0:top ns0:type="dxa" ns0:w="80"/>
-              <ns0:left ns0:type="dxa" ns0:w="120"/>
-              <ns0:bottom ns0:type="dxa" ns0:w="80"/>
-              <ns0:right ns0:type="dxa" ns0:w="120"/>
-            </ns0:tcMar>
-          </ns0:tcPr>
-          <ns0:p>
-            <ns0:pPr>
-              <ns0:spacing ns0:after="40" ns0:before="40"/>
-            </ns0:pPr>
-            <ns0:r>
-              <ns0:rPr>
-                <ns0:rFonts ns0:ascii="Arial" ns0:cs="Arial" ns0:hAnsi="Arial"/>
-                <ns0:b/>
-                <ns0:bCs/>
-                <ns0:color ns0:val="1F4E79"/>
-                <ns0:sz ns0:val="18"/>
-                <ns0:szCs ns0:val="18"/>
-              </ns0:rPr>
-              <ns0:t>FIX</ns0:t>
-            </ns0:r>
-          </ns0:p>
-        </ns0:tc>
-        <ns0:tc>
-          <ns0:tcPr>
-            <ns0:tcW ns0:type="dxa" ns0:w="8460"/>
-            <ns0:tcBorders>
-              <ns0:top ns0:val="single" ns0:color="CCCCCC" ns0:sz="1"/>
-              <ns0:left ns0:val="single" ns0:color="CCCCCC" ns0:sz="1"/>
-              <ns0:bottom ns0:val="single" ns0:color="CCCCCC" ns0:sz="1"/>
-              <ns0:right ns0:val="single" ns0:color="CCCCCC" ns0:sz="1"/>
-            </ns0:tcBorders>
-            <ns0:shd ns0:fill="FFFFFF" ns0:val="clear"/>
-            <ns0:tcMar>
-              <ns0:top ns0:type="dxa" ns0:w="80"/>
-              <ns0:left ns0:type="dxa" ns0:w="120"/>
-              <ns0:bottom ns0:type="dxa" ns0:w="80"/>
-              <ns0:right ns0:type="dxa" ns0:w="120"/>
-            </ns0:tcMar>
-          </ns0:tcPr>
-          <ns0:p>
-            <ns0:pPr>
-              <ns0:spacing ns0:after="40" ns0:before="40"/>
-            </ns0:pPr>
-            <ns0:r>
-              <ns0:rPr>
-                <ns0:rFonts ns0:ascii="Arial" ns0:cs="Arial" ns0:hAnsi="Arial"/>
-                <ns0:sz ns0:val="18"/>
-                <ns0:szCs ns0:val="18"/>
-              </ns0:rPr>
-              <ns0:t xml:space="preserve">Brawl always logged in pipeline (_brawl_cl = True); no prompt; activates automatically when Brawl detected</ns0:t>
-            </ns0:r>
-          </ns0:p>
-        </ns0:tc>
-      </ns0:tr>
-      <ns0:tr>
-        <ns0:tc>
-          <ns0:tcPr>
-            <ns0:tcW ns0:type="dxa" ns0:w="900"/>
-            <ns0:tcBorders>
-              <ns0:top ns0:val="single" ns0:color="CCCCCC" ns0:sz="1"/>
-              <ns0:left ns0:val="single" ns0:color="CCCCCC" ns0:sz="1"/>
-              <ns0:bottom ns0:val="single" ns0:color="CCCCCC" ns0:sz="1"/>
-              <ns0:right ns0:val="single" ns0:color="CCCCCC" ns0:sz="1"/>
-            </ns0:tcBorders>
-            <ns0:shd ns0:fill="E2EFDA" ns0:val="clear"/>
-            <ns0:tcMar>
-              <ns0:top ns0:type="dxa" ns0:w="80"/>
-              <ns0:left ns0:type="dxa" ns0:w="120"/>
-              <ns0:bottom ns0:type="dxa" ns0:w="80"/>
-              <ns0:right ns0:type="dxa" ns0:w="120"/>
-            </ns0:tcMar>
-          </ns0:tcPr>
-          <ns0:p>
-            <ns0:pPr>
-              <ns0:spacing ns0:after="40" ns0:before="40"/>
-            </ns0:pPr>
-            <ns0:r>
-              <ns0:rPr>
-                <ns0:rFonts ns0:ascii="Arial" ns0:cs="Arial" ns0:hAnsi="Arial"/>
-                <ns0:b/>
-                <ns0:bCs/>
-                <ns0:color ns0:val="1F4E79"/>
-                <ns0:sz ns0:val="18"/>
-                <ns0:szCs ns0:val="18"/>
-              </ns0:rPr>
-              <ns0:t>FIX</ns0:t>
-            </ns0:r>
-          </ns0:p>
-        </ns0:tc>
-        <ns0:tc>
-          <ns0:tcPr>
-            <ns0:tcW ns0:type="dxa" ns0:w="8460"/>
-            <ns0:tcBorders>
-              <ns0:top ns0:val="single" ns0:color="CCCCCC" ns0:sz="1"/>
-              <ns0:left ns0:val="single" ns0:color="CCCCCC" ns0:sz="1"/>
-              <ns0:bottom ns0:val="single" ns0:color="CCCCCC" ns0:sz="1"/>
-              <ns0:right ns0:val="single" ns0:color="CCCCCC" ns0:sz="1"/>
-            </ns0:tcBorders>
-            <ns0:shd ns0:fill="FFFFFF" ns0:val="clear"/>
-            <ns0:tcMar>
-              <ns0:top ns0:type="dxa" ns0:w="80"/>
-              <ns0:left ns0:type="dxa" ns0:w="120"/>
-              <ns0:bottom ns0:type="dxa" ns0:w="80"/>
-              <ns0:right ns0:type="dxa" ns0:w="120"/>
-            </ns0:tcMar>
-          </ns0:tcPr>
-          <ns0:p>
-            <ns0:pPr>
-              <ns0:spacing ns0:after="40" ns0:before="40"/>
-            </ns0:pPr>
-            <ns0:r>
-              <ns0:rPr>
-                <ns0:rFonts ns0:ascii="Arial" ns0:cs="Arial" ns0:hAnsi="Arial"/>
-                <ns0:sz ns0:val="18"/>
-                <ns0:szCs ns0:val="18"/>
-              </ns0:rPr>
-              <ns0:t xml:space="preserve">Raid drain after event end — getRaidInfo checked per account when event_type=None; leftover energy drained if battle_energy &gt; 0</ns0:t>
-            </ns0:r>
-          </ns0:p>
-        </ns0:tc>
-      </ns0:tr>
-      <ns0:tr>
-        <ns0:tc>
-          <ns0:tcPr>
-            <ns0:tcW ns0:type="dxa" ns0:w="900"/>
-            <ns0:tcBorders>
-              <ns0:top ns0:val="single" ns0:color="CCCCCC" ns0:sz="1"/>
-              <ns0:left ns0:val="single" ns0:color="CCCCCC" ns0:sz="1"/>
-              <ns0:bottom ns0:val="single" ns0:color="CCCCCC" ns0:sz="1"/>
-              <ns0:right ns0:val="single" ns0:color="CCCCCC" ns0:sz="1"/>
-            </ns0:tcBorders>
-            <ns0:shd ns0:fill="E2EFDA" ns0:val="clear"/>
-            <ns0:tcMar>
-              <ns0:top ns0:type="dxa" ns0:w="80"/>
-              <ns0:left ns0:type="dxa" ns0:w="120"/>
-              <ns0:bottom ns0:type="dxa" ns0:w="80"/>
-              <ns0:right ns0:type="dxa" ns0:w="120"/>
-            </ns0:tcMar>
-          </ns0:tcPr>
-          <ns0:p>
-            <ns0:pPr>
-              <ns0:spacing ns0:after="40" ns0:before="40"/>
-            </ns0:pPr>
-            <ns0:r>
-              <ns0:rPr>
-                <ns0:rFonts ns0:ascii="Arial" ns0:cs="Arial" ns0:hAnsi="Arial"/>
-                <ns0:b/>
-                <ns0:bCs/>
-                <ns0:color ns0:val="1F4E79"/>
-                <ns0:sz ns0:val="18"/>
-                <ns0:szCs ns0:val="18"/>
-              </ns0:rPr>
-              <ns0:t>FIX</ns0:t>
-            </ns0:r>
-          </ns0:p>
-        </ns0:tc>
-        <ns0:tc>
-          <ns0:tcPr>
-            <ns0:tcW ns0:type="dxa" ns0:w="8460"/>
-            <ns0:tcBorders>
-              <ns0:top ns0:val="single" ns0:color="CCCCCC" ns0:sz="1"/>
-              <ns0:left ns0:val="single" ns0:color="CCCCCC" ns0:sz="1"/>
-              <ns0:bottom ns0:val="single" ns0:color="CCCCCC" ns0:sz="1"/>
-              <ns0:right ns0:val="single" ns0:color="CCCCCC" ns0:sz="1"/>
-            </ns0:tcBorders>
-            <ns0:shd ns0:fill="FFFFFF" ns0:val="clear"/>
-            <ns0:tcMar>
-              <ns0:top ns0:type="dxa" ns0:w="80"/>
-              <ns0:left ns0:type="dxa" ns0:w="120"/>
-              <ns0:bottom ns0:type="dxa" ns0:w="80"/>
-              <ns0:right ns0:type="dxa" ns0:w="120"/>
-            </ns0:tcMar>
-          </ns0:tcPr>
-          <ns0:p>
-            <ns0:pPr>
-              <ns0:spacing ns0:after="40" ns0:before="40"/>
-            </ns0:pPr>
-            <ns0:r>
-              <ns0:rPr>
-                <ns0:rFonts ns0:ascii="Arial" ns0:cs="Arial" ns0:hAnsi="Arial"/>
-                <ns0:sz ns0:val="18"/>
-                <ns0:szCs ns0:val="18"/>
-              </ns0:rPr>
-              <ns0:t xml:space="preserve">play_raid_loop(silent=True) in pipeline — suppresses start prompt</ns0:t>
-            </ns0:r>
-          </ns0:p>
-        </ns0:tc>
-      </ns0:tr>
-      <ns0:tr>
-        <ns0:tc>
-          <ns0:tcPr>
-            <ns0:tcW ns0:type="dxa" ns0:w="900"/>
-            <ns0:tcBorders>
-              <ns0:top ns0:val="single" ns0:color="CCCCCC" ns0:sz="1"/>
-              <ns0:left ns0:val="single" ns0:color="CCCCCC" ns0:sz="1"/>
-              <ns0:bottom ns0:val="single" ns0:color="CCCCCC" ns0:sz="1"/>
-              <ns0:right ns0:val="single" ns0:color="CCCCCC" ns0:sz="1"/>
-            </ns0:tcBorders>
-            <ns0:shd ns0:fill="E2EFDA" ns0:val="clear"/>
-            <ns0:tcMar>
-              <ns0:top ns0:type="dxa" ns0:w="80"/>
-              <ns0:left ns0:type="dxa" ns0:w="120"/>
-              <ns0:bottom ns0:type="dxa" ns0:w="80"/>
-              <ns0:right ns0:type="dxa" ns0:w="120"/>
-            </ns0:tcMar>
-          </ns0:tcPr>
-          <ns0:p>
-            <ns0:pPr>
-              <ns0:spacing ns0:after="40" ns0:before="40"/>
-            </ns0:pPr>
-            <ns0:r>
-              <ns0:rPr>
-                <ns0:rFonts ns0:ascii="Arial" ns0:cs="Arial" ns0:hAnsi="Arial"/>
-                <ns0:b/>
-                <ns0:bCs/>
-                <ns0:color ns0:val="1F4E79"/>
-                <ns0:sz ns0:val="18"/>
-                <ns0:szCs ns0:val="18"/>
-              </ns0:rPr>
-              <ns0:t>FIX</ns0:t>
-            </ns0:r>
-          </ns0:p>
-        </ns0:tc>
-        <ns0:tc>
-          <ns0:tcPr>
-            <ns0:tcW ns0:type="dxa" ns0:w="8460"/>
-            <ns0:tcBorders>
-              <ns0:top ns0:val="single" ns0:color="CCCCCC" ns0:sz="1"/>
-              <ns0:left ns0:val="single" ns0:color="CCCCCC" ns0:sz="1"/>
-              <ns0:bottom ns0:val="single" ns0:color="CCCCCC" ns0:sz="1"/>
-              <ns0:right ns0:val="single" ns0:color="CCCCCC" ns0:sz="1"/>
-            </ns0:tcBorders>
-            <ns0:shd ns0:fill="FFFFFF" ns0:val="clear"/>
-            <ns0:tcMar>
-              <ns0:top ns0:type="dxa" ns0:w="80"/>
-              <ns0:left ns0:type="dxa" ns0:w="120"/>
-              <ns0:bottom ns0:type="dxa" ns0:w="80"/>
-              <ns0:right ns0:type="dxa" ns0:w="120"/>
-            </ns0:tcMar>
-          </ns0:tcPr>
-          <ns0:p>
-            <ns0:pPr>
-              <ns0:spacing ns0:after="40" ns0:before="40"/>
-            </ns0:pPr>
-            <ns0:r>
-              <ns0:rPr>
-                <ns0:rFonts ns0:ascii="Arial" ns0:cs="Arial" ns0:hAnsi="Arial"/>
-                <ns0:sz ns0:val="18"/>
-                <ns0:szCs ns0:val="18"/>
-              </ns0:rPr>
-              <ns0:t xml:space="preserve">BGE override: Overcharged → Overload all in _api_bge_to_tuo() explicit map</ns0:t>
-            </ns0:r>
-          </ns0:p>
-        </ns0:tc>
-      </ns0:tr>
-      <ns0:tr>
-        <ns0:tc>
-          <ns0:tcPr>
-            <ns0:tcW ns0:type="dxa" ns0:w="900"/>
-            <ns0:tcBorders>
-              <ns0:top ns0:val="single" ns0:color="CCCCCC" ns0:sz="1"/>
-              <ns0:left ns0:val="single" ns0:color="CCCCCC" ns0:sz="1"/>
-              <ns0:bottom ns0:val="single" ns0:color="CCCCCC" ns0:sz="1"/>
-              <ns0:right ns0:val="single" ns0:color="CCCCCC" ns0:sz="1"/>
-            </ns0:tcBorders>
-            <ns0:shd ns0:fill="E2EFDA" ns0:val="clear"/>
-            <ns0:tcMar>
-              <ns0:top ns0:type="dxa" ns0:w="80"/>
-              <ns0:left ns0:type="dxa" ns0:w="120"/>
-              <ns0:bottom ns0:type="dxa" ns0:w="80"/>
-              <ns0:right ns0:type="dxa" ns0:w="120"/>
-            </ns0:tcMar>
-          </ns0:tcPr>
-          <ns0:p>
-            <ns0:pPr>
-              <ns0:spacing ns0:after="40" ns0:before="40"/>
-            </ns0:pPr>
-            <ns0:r>
-              <ns0:rPr>
-                <ns0:rFonts ns0:ascii="Arial" ns0:cs="Arial" ns0:hAnsi="Arial"/>
-                <ns0:b/>
-                <ns0:bCs/>
-                <ns0:color ns0:val="1F4E79"/>
-                <ns0:sz ns0:val="18"/>
-                <ns0:szCs ns0:val="18"/>
-              </ns0:rPr>
-              <ns0:t>FIX</ns0:t>
-            </ns0:r>
-          </ns0:p>
-        </ns0:tc>
-        <ns0:tc>
-          <ns0:tcPr>
-            <ns0:tcW ns0:type="dxa" ns0:w="8460"/>
-            <ns0:tcBorders>
-              <ns0:top ns0:val="single" ns0:color="CCCCCC" ns0:sz="1"/>
-              <ns0:left ns0:val="single" ns0:color="CCCCCC" ns0:sz="1"/>
-              <ns0:bottom ns0:val="single" ns0:color="CCCCCC" ns0:sz="1"/>
-              <ns0:right ns0:val="single" ns0:color="CCCCCC" ns0:sz="1"/>
-            </ns0:tcBorders>
-            <ns0:shd ns0:fill="FFFFFF" ns0:val="clear"/>
-            <ns0:tcMar>
-              <ns0:top ns0:type="dxa" ns0:w="80"/>
-              <ns0:left ns0:type="dxa" ns0:w="120"/>
-              <ns0:bottom ns0:type="dxa" ns0:w="80"/>
-              <ns0:right ns0:type="dxa" ns0:w="120"/>
-            </ns0:tcMar>
-          </ns0:tcPr>
-          <ns0:p>
-            <ns0:pPr>
-              <ns0:spacing ns0:after="40" ns0:before="40"/>
-            </ns0:pPr>
-            <ns0:r>
-              <ns0:rPr>
-                <ns0:rFonts ns0:ascii="Arial" ns0:cs="Arial" ns0:hAnsi="Arial"/>
-                <ns0:sz ns0:val="18"/>
-                <ns0:szCs ns0:val="18"/>
-              </ns0:rPr>
-              <ns0:t xml:space="preserve">Issues log renamed: loyal_challenge_issues.txt → pvp_challenge_issues.txt</ns0:t>
-            </ns0:r>
-          </ns0:p>
-        </ns0:tc>
-      </ns0:tr>
-      <ns0:tr>
-        <ns0:tc>
-          <ns0:tcPr>
-            <ns0:tcW ns0:type="dxa" ns0:w="900"/>
-            <ns0:tcBorders>
-              <ns0:top ns0:val="single" ns0:color="CCCCCC" ns0:sz="1"/>
-              <ns0:left ns0:val="single" ns0:color="CCCCCC" ns0:sz="1"/>
-              <ns0:bottom ns0:val="single" ns0:color="CCCCCC" ns0:sz="1"/>
-              <ns0:right ns0:val="single" ns0:color="CCCCCC" ns0:sz="1"/>
-            </ns0:tcBorders>
-            <ns0:shd ns0:fill="E2EFDA" ns0:val="clear"/>
-            <ns0:tcMar>
-              <ns0:top ns0:type="dxa" ns0:w="80"/>
-              <ns0:left ns0:type="dxa" ns0:w="120"/>
-              <ns0:bottom ns0:type="dxa" ns0:w="80"/>
-              <ns0:right ns0:type="dxa" ns0:w="120"/>
-            </ns0:tcMar>
-          </ns0:tcPr>
-          <ns0:p>
-            <ns0:pPr>
-              <ns0:spacing ns0:after="40" ns0:before="40"/>
-            </ns0:pPr>
-            <ns0:r>
-              <ns0:rPr>
-                <ns0:rFonts ns0:ascii="Arial" ns0:cs="Arial" ns0:hAnsi="Arial"/>
-                <ns0:b/>
-                <ns0:bCs/>
-                <ns0:color ns0:val="1F4E79"/>
-                <ns0:sz ns0:val="18"/>
-                <ns0:szCs ns0:val="18"/>
-              </ns0:rPr>
-              <ns0:t>FIX</ns0:t>
-            </ns0:r>
-          </ns0:p>
-        </ns0:tc>
-        <ns0:tc>
-          <ns0:tcPr>
-            <ns0:tcW ns0:type="dxa" ns0:w="8460"/>
-            <ns0:tcBorders>
-              <ns0:top ns0:val="single" ns0:color="CCCCCC" ns0:sz="1"/>
-              <ns0:left ns0:val="single" ns0:color="CCCCCC" ns0:sz="1"/>
-              <ns0:bottom ns0:val="single" ns0:color="CCCCCC" ns0:sz="1"/>
-              <ns0:right ns0:val="single" ns0:color="CCCCCC" ns0:sz="1"/>
-            </ns0:tcBorders>
-            <ns0:shd ns0:fill="FFFFFF" ns0:val="clear"/>
-            <ns0:tcMar>
-              <ns0:top ns0:type="dxa" ns0:w="80"/>
-              <ns0:left ns0:type="dxa" ns0:w="120"/>
-              <ns0:bottom ns0:type="dxa" ns0:w="80"/>
-              <ns0:right ns0:type="dxa" ns0:w="120"/>
-            </ns0:tcMar>
-          </ns0:tcPr>
-          <ns0:p>
-            <ns0:pPr>
-              <ns0:spacing ns0:after="40" ns0:before="40"/>
-            </ns0:pPr>
-            <ns0:r>
-              <ns0:rPr>
-                <ns0:rFonts ns0:ascii="Arial" ns0:cs="Arial" ns0:hAnsi="Arial"/>
-                <ns0:sz ns0:val="18"/>
-                <ns0:szCs ns0:val="18"/>
-              </ns0:rPr>
-              <ns0:t xml:space="preserve">Duplicate menu entry "14. Refill Arena Stamina" in single-account section removed</ns0:t>
-            </ns0:r>
-          </ns0:p>
-        </ns0:tc>
-      </ns0:tr>
-      <ns0:tr>
-        <ns0:tc>
-          <ns0:tcPr>
-            <ns0:tcW ns0:type="dxa" ns0:w="900"/>
-            <ns0:tcBorders>
-              <ns0:top ns0:val="single" ns0:color="CCCCCC" ns0:sz="1"/>
-              <ns0:left ns0:val="single" ns0:color="CCCCCC" ns0:sz="1"/>
-              <ns0:bottom ns0:val="single" ns0:color="CCCCCC" ns0:sz="1"/>
-              <ns0:right ns0:val="single" ns0:color="CCCCCC" ns0:sz="1"/>
-            </ns0:tcBorders>
-            <ns0:shd ns0:fill="E2EFDA" ns0:val="clear"/>
-            <ns0:tcMar>
-              <ns0:top ns0:type="dxa" ns0:w="80"/>
-              <ns0:left ns0:type="dxa" ns0:w="120"/>
-              <ns0:bottom ns0:type="dxa" ns0:w="80"/>
-              <ns0:right ns0:type="dxa" ns0:w="120"/>
-            </ns0:tcMar>
-          </ns0:tcPr>
-          <ns0:p>
-            <ns0:pPr>
-              <ns0:spacing ns0:after="40" ns0:before="40"/>
-            </ns0:pPr>
-            <ns0:r>
-              <ns0:rPr>
-                <ns0:rFonts ns0:ascii="Arial" ns0:cs="Arial" ns0:hAnsi="Arial"/>
-                <ns0:b/>
-                <ns0:bCs/>
-                <ns0:color ns0:val="1F4E79"/>
-                <ns0:sz ns0:val="18"/>
-                <ns0:szCs ns0:val="18"/>
-              </ns0:rPr>
-              <ns0:t>FIX</ns0:t>
-            </ns0:r>
-          </ns0:p>
-        </ns0:tc>
-        <ns0:tc>
-          <ns0:tcPr>
-            <ns0:tcW ns0:type="dxa" ns0:w="8460"/>
-            <ns0:tcBorders>
-              <ns0:top ns0:val="single" ns0:color="CCCCCC" ns0:sz="1"/>
-              <ns0:left ns0:val="single" ns0:color="CCCCCC" ns0:sz="1"/>
-              <ns0:bottom ns0:val="single" ns0:color="CCCCCC" ns0:sz="1"/>
-              <ns0:right ns0:val="single" ns0:color="CCCCCC" ns0:sz="1"/>
-            </ns0:tcBorders>
-            <ns0:shd ns0:fill="FFFFFF" ns0:val="clear"/>
-            <ns0:tcMar>
-              <ns0:top ns0:type="dxa" ns0:w="80"/>
-              <ns0:left ns0:type="dxa" ns0:w="120"/>
-              <ns0:bottom ns0:type="dxa" ns0:w="80"/>
-              <ns0:right ns0:type="dxa" ns0:w="120"/>
-            </ns0:tcMar>
-          </ns0:tcPr>
-          <ns0:p>
-            <ns0:pPr>
-              <ns0:spacing ns0:after="40" ns0:before="40"/>
-            </ns0:pPr>
-            <ns0:r>
-              <ns0:rPr>
-                <ns0:rFonts ns0:ascii="Arial" ns0:cs="Arial" ns0:hAnsi="Arial"/>
-                <ns0:sz ns0:val="18"/>
-                <ns0:szCs ns0:val="18"/>
-              </ns0:rPr>
-              <ns0:t xml:space="preserve">Helper methods reconstructed after file corruption: _collect_settings_files(), _load_setting(), _select_account_range()</ns0:t>
-            </ns0:r>
-          </ns0:p>
-        </ns0:tc>
-      </ns0:tr>
-      <ns0:tr>
-        <ns0:tc>
-          <ns0:tcPr>
-            <ns0:tcW ns0:type="dxa" ns0:w="900"/>
-            <ns0:tcBorders>
-              <ns0:top ns0:val="single" ns0:color="CCCCCC" ns0:sz="1"/>
-              <ns0:left ns0:val="single" ns0:color="CCCCCC" ns0:sz="1"/>
-              <ns0:bottom ns0:val="single" ns0:color="CCCCCC" ns0:sz="1"/>
-              <ns0:right ns0:val="single" ns0:color="CCCCCC" ns0:sz="1"/>
-            </ns0:tcBorders>
-            <ns0:shd ns0:fill="E2EFDA" ns0:val="clear"/>
-            <ns0:tcMar>
-              <ns0:top ns0:type="dxa" ns0:w="80"/>
-              <ns0:left ns0:type="dxa" ns0:w="120"/>
-              <ns0:bottom ns0:type="dxa" ns0:w="80"/>
-              <ns0:right ns0:type="dxa" ns0:w="120"/>
-            </ns0:tcMar>
-          </ns0:tcPr>
-          <ns0:p>
-            <ns0:pPr>
-              <ns0:spacing ns0:after="40" ns0:before="40"/>
-            </ns0:pPr>
-            <ns0:r>
-              <ns0:rPr>
-                <ns0:rFonts ns0:ascii="Arial" ns0:cs="Arial" ns0:hAnsi="Arial"/>
-                <ns0:b/>
-                <ns0:bCs/>
-                <ns0:color ns0:val="1F4E79"/>
-                <ns0:sz ns0:val="18"/>
-                <ns0:szCs ns0:val="18"/>
-              </ns0:rPr>
-              <ns0:t>FIX</ns0:t>
-            </ns0:r>
-          </ns0:p>
-        </ns0:tc>
-        <ns0:tc>
-          <ns0:tcPr>
-            <ns0:tcW ns0:type="dxa" ns0:w="8460"/>
-            <ns0:tcBorders>
-              <ns0:top ns0:val="single" ns0:color="CCCCCC" ns0:sz="1"/>
-              <ns0:left ns0:val="single" ns0:color="CCCCCC" ns0:sz="1"/>
-              <ns0:bottom ns0:val="single" ns0:color="CCCCCC" ns0:sz="1"/>
-              <ns0:right ns0:val="single" ns0:color="CCCCCC" ns0:sz="1"/>
-            </ns0:tcBorders>
-            <ns0:shd ns0:fill="FFFFFF" ns0:val="clear"/>
-            <ns0:tcMar>
-              <ns0:top ns0:type="dxa" ns0:w="80"/>
-              <ns0:left ns0:type="dxa" ns0:w="120"/>
-              <ns0:bottom ns0:type="dxa" ns0:w="80"/>
-              <ns0:right ns0:type="dxa" ns0:w="120"/>
-            </ns0:tcMar>
-          </ns0:tcPr>
-          <ns0:p>
-            <ns0:pPr>
-              <ns0:spacing ns0:after="40" ns0:before="40"/>
-            </ns0:pPr>
-            <ns0:r>
-              <ns0:rPr>
-                <ns0:rFonts ns0:ascii="Arial" ns0:cs="Arial" ns0:hAnsi="Arial"/>
-                <ns0:sz ns0:val="18"/>
-                <ns0:szCs ns0:val="18"/>
-              </ns0:rPr>
-              <ns0:t xml:space="preserve">claim_event_rewards docstring: claimGuildwarRewards → claimFactionWarRewards</ns0:t>
-            </ns0:r>
-          </ns0:p>
-        </ns0:tc>
-      </ns0:tr>
-      <ns0:tr>
-        <ns0:tc>
-          <ns0:tcPr>
-            <ns0:tcW ns0:type="dxa" ns0:w="900"/>
-            <ns0:tcBorders>
-              <ns0:top ns0:val="single" ns0:color="CCCCCC" ns0:sz="1"/>
-              <ns0:left ns0:val="single" ns0:color="CCCCCC" ns0:sz="1"/>
-              <ns0:bottom ns0:val="single" ns0:color="CCCCCC" ns0:sz="1"/>
-              <ns0:right ns0:val="single" ns0:color="CCCCCC" ns0:sz="1"/>
-            </ns0:tcBorders>
-            <ns0:shd ns0:fill="E2EFDA" ns0:val="clear"/>
+            <ns0:shd ns0:fill="D5E8F0" ns0:val="clear"/>
             <ns0:tcMar>
               <ns0:top ns0:type="dxa" ns0:w="80"/>
               <ns0:left ns0:type="dxa" ns0:w="120"/>
@@ -36886,7 +36928,7 @@
                 <ns0:rFonts ns0:ascii="Arial" ns0:cs="Arial" ns0:hAnsi="Arial"/>
                 <ns0:b/>
                 <ns0:bCs/>
-                <ns0:color ns0:val="1F4E79"/>
+                <ns0:color ns0:val="375623"/>
                 <ns0:sz ns0:val="18"/>
                 <ns0:szCs ns0:val="18"/>
               </ns0:rPr>
@@ -36937,6 +36979,140 @@
               <ns0:right ns0:val="single" ns0:color="CCCCCC" ns0:sz="1"/>
             </ns0:tcBorders>
             <ns0:shd ns0:fill="E2EFDA" ns0:val="clear"/>
+            <ns0:tcMar>
+              <ns0:top ns0:type="dxa" ns0:w="80"/>
+              <ns0:left ns0:type="dxa" ns0:w="120"/>
+              <ns0:bottom ns0:type="dxa" ns0:w="80"/>
+              <ns0:right ns0:type="dxa" ns0:w="120"/>
+            </ns0:tcMar>
+          </ns0:tcPr>
+          <ns0:p>
+            <ns0:pPr>
+              <ns0:spacing ns0:after="40" ns0:before="40"/>
+            </ns0:pPr>
+            <ns0:r>
+              <ns0:rPr>
+                <ns0:rFonts ns0:ascii="Arial" ns0:cs="Arial" ns0:hAnsi="Arial"/>
+                <ns0:b/>
+                <ns0:bCs/>
+                <ns0:color ns0:val="375623"/>
+                <ns0:sz ns0:val="18"/>
+                <ns0:szCs ns0:val="18"/>
+              </ns0:rPr>
+              <ns0:t>NEW</ns0:t>
+            </ns0:r>
+          </ns0:p>
+        </ns0:tc>
+        <ns0:tc>
+          <ns0:tcPr>
+            <ns0:tcW ns0:type="dxa" ns0:w="8460"/>
+            <ns0:tcBorders>
+              <ns0:top ns0:val="single" ns0:color="CCCCCC" ns0:sz="1"/>
+              <ns0:left ns0:val="single" ns0:color="CCCCCC" ns0:sz="1"/>
+              <ns0:bottom ns0:val="single" ns0:color="CCCCCC" ns0:sz="1"/>
+              <ns0:right ns0:val="single" ns0:color="CCCCCC" ns0:sz="1"/>
+            </ns0:tcBorders>
+            <ns0:shd ns0:fill="FFFFFF" ns0:val="clear"/>
+            <ns0:tcMar>
+              <ns0:top ns0:type="dxa" ns0:w="80"/>
+              <ns0:left ns0:type="dxa" ns0:w="120"/>
+              <ns0:bottom ns0:type="dxa" ns0:w="80"/>
+              <ns0:right ns0:type="dxa" ns0:w="120"/>
+            </ns0:tcMar>
+          </ns0:tcPr>
+          <ns0:p>
+            <ns0:pPr>
+              <ns0:spacing ns0:after="40" ns0:before="40"/>
+            </ns0:pPr>
+            <ns0:r>
+              <ns0:rPr>
+                <ns0:rFonts ns0:ascii="Arial" ns0:cs="Arial" ns0:hAnsi="Arial"/>
+                <ns0:sz ns0:val="18"/>
+                <ns0:szCs ns0:val="18"/>
+              </ns0:rPr>
+              <ns0:t xml:space="preserve">battleground_effects.xml and updates.xml added to required data files (F→1).</ns0:t>
+            </ns0:r>
+          </ns0:p>
+        </ns0:tc>
+      </ns0:tr>
+      <ns0:tr>
+        <ns0:tc>
+          <ns0:tcPr>
+            <ns0:tcW ns0:type="dxa" ns0:w="900"/>
+            <ns0:tcBorders>
+              <ns0:top ns0:val="single" ns0:color="CCCCCC" ns0:sz="1"/>
+              <ns0:left ns0:val="single" ns0:color="CCCCCC" ns0:sz="1"/>
+              <ns0:bottom ns0:val="single" ns0:color="CCCCCC" ns0:sz="1"/>
+              <ns0:right ns0:val="single" ns0:color="CCCCCC" ns0:sz="1"/>
+            </ns0:tcBorders>
+            <ns0:shd ns0:fill="E2EFDA" ns0:val="clear"/>
+            <ns0:tcMar>
+              <ns0:top ns0:type="dxa" ns0:w="80"/>
+              <ns0:left ns0:type="dxa" ns0:w="120"/>
+              <ns0:bottom ns0:type="dxa" ns0:w="80"/>
+              <ns0:right ns0:type="dxa" ns0:w="120"/>
+            </ns0:tcMar>
+          </ns0:tcPr>
+          <ns0:p>
+            <ns0:pPr>
+              <ns0:spacing ns0:after="40" ns0:before="40"/>
+            </ns0:pPr>
+            <ns0:r>
+              <ns0:rPr>
+                <ns0:rFonts ns0:ascii="Arial" ns0:cs="Arial" ns0:hAnsi="Arial"/>
+                <ns0:b/>
+                <ns0:bCs/>
+                <ns0:color ns0:val="375623"/>
+                <ns0:sz ns0:val="18"/>
+                <ns0:szCs ns0:val="18"/>
+              </ns0:rPr>
+              <ns0:t>NEW</ns0:t>
+            </ns0:r>
+          </ns0:p>
+        </ns0:tc>
+        <ns0:tc>
+          <ns0:tcPr>
+            <ns0:tcW ns0:type="dxa" ns0:w="8460"/>
+            <ns0:tcBorders>
+              <ns0:top ns0:val="single" ns0:color="CCCCCC" ns0:sz="1"/>
+              <ns0:left ns0:val="single" ns0:color="CCCCCC" ns0:sz="1"/>
+              <ns0:bottom ns0:val="single" ns0:color="CCCCCC" ns0:sz="1"/>
+              <ns0:right ns0:val="single" ns0:color="CCCCCC" ns0:sz="1"/>
+            </ns0:tcBorders>
+            <ns0:shd ns0:fill="FFFFFF" ns0:val="clear"/>
+            <ns0:tcMar>
+              <ns0:top ns0:type="dxa" ns0:w="80"/>
+              <ns0:left ns0:type="dxa" ns0:w="120"/>
+              <ns0:bottom ns0:type="dxa" ns0:w="80"/>
+              <ns0:right ns0:type="dxa" ns0:w="120"/>
+            </ns0:tcMar>
+          </ns0:tcPr>
+          <ns0:p>
+            <ns0:pPr>
+              <ns0:spacing ns0:after="40" ns0:before="40"/>
+            </ns0:pPr>
+            <ns0:r>
+              <ns0:rPr>
+                <ns0:rFonts ns0:ascii="Arial" ns0:cs="Arial" ns0:hAnsi="Arial"/>
+                <ns0:sz ns0:val="18"/>
+                <ns0:szCs ns0:val="18"/>
+              </ns0:rPr>
+              <ns0:t xml:space="preserve">Crackdown → Crackdown 2 override in _api_bge_to_tuo().</ns0:t>
+            </ns0:r>
+          </ns0:p>
+        </ns0:tc>
+      </ns0:tr>
+      <ns0:tr>
+        <ns0:tc>
+          <ns0:tcPr>
+            <ns0:tcW ns0:type="dxa" ns0:w="900"/>
+            <ns0:tcBorders>
+              <ns0:top ns0:val="single" ns0:color="CCCCCC" ns0:sz="1"/>
+              <ns0:left ns0:val="single" ns0:color="CCCCCC" ns0:sz="1"/>
+              <ns0:bottom ns0:val="single" ns0:color="CCCCCC" ns0:sz="1"/>
+              <ns0:right ns0:val="single" ns0:color="CCCCCC" ns0:sz="1"/>
+            </ns0:tcBorders>
+            <ns0:shd ns0:fill="D5E8F0" ns0:val="clear"/>
             <ns0:tcMar>
               <ns0:top ns0:type="dxa" ns0:w="80"/>
               <ns0:left ns0:type="dxa" ns0:w="120"/>
@@ -36957,7 +37133,7 @@
                 <ns0:sz ns0:val="18"/>
                 <ns0:szCs ns0:val="18"/>
               </ns0:rPr>
-              <ns0:t>NEW</ns0:t>
+              <ns0:t>FIX</ns0:t>
             </ns0:r>
           </ns0:p>
         </ns0:tc>
@@ -36988,7 +37164,7 @@
                 <ns0:sz ns0:val="18"/>
                 <ns0:szCs ns0:val="18"/>
               </ns0:rPr>
-              <ns0:t xml:space="preserve">battleground_effects.xml and updates.xml added to required data files (F→1).</ns0:t>
+              <ns0:t xml:space="preserve">Brawl structure/summon UID assignment — dynamic name-matching against own_states/enemy_states; correctly handles infinite summon chains (Kozel the Deathless, Industry of Eden).</ns0:t>
             </ns0:r>
           </ns0:p>
         </ns0:tc>
@@ -37003,7 +37179,7 @@
               <ns0:bottom ns0:val="single" ns0:color="CCCCCC" ns0:sz="1"/>
               <ns0:right ns0:val="single" ns0:color="CCCCCC" ns0:sz="1"/>
             </ns0:tcBorders>
-            <ns0:shd ns0:fill="E2EFDA" ns0:val="clear"/>
+            <ns0:shd ns0:fill="D5E8F0" ns0:val="clear"/>
             <ns0:tcMar>
               <ns0:top ns0:type="dxa" ns0:w="80"/>
               <ns0:left ns0:type="dxa" ns0:w="120"/>
@@ -37024,7 +37200,7 @@
                 <ns0:sz ns0:val="18"/>
                 <ns0:szCs ns0:val="18"/>
               </ns0:rPr>
-              <ns0:t>NEW</ns0:t>
+              <ns0:t>FIX</ns0:t>
             </ns0:r>
           </ns0:p>
         </ns0:tc>
@@ -37055,7 +37231,7 @@
                 <ns0:sz ns0:val="18"/>
                 <ns0:szCs ns0:val="18"/>
               </ns0:rPr>
-              <ns0:t xml:space="preserve">Crackdown → Crackdown 2 override in _api_bge_to_tuo().</ns0:t>
+              <ns0:t xml:space="preserve">Guild Brawl detected as regular Brawl for energy tracking (same energy source; score differs).</ns0:t>
             </ns0:r>
           </ns0:p>
         </ns0:tc>
@@ -37122,7 +37298,7 @@
                 <ns0:sz ns0:val="18"/>
                 <ns0:szCs ns0:val="18"/>
               </ns0:rPr>
-              <ns0:t xml:space="preserve">Brawl structure/summon UID assignment — dynamic name-matching against own_states/enemy_states; correctly handles infinite summon chains (Kozel the Deathless, Industry of Eden).</ns0:t>
+              <ns0:t xml:space="preserve">Brawl start_time check — brawl not active before start_time; 3 detection points fixed.</ns0:t>
             </ns0:r>
           </ns0:p>
         </ns0:tc>
@@ -37189,7 +37365,7 @@
                 <ns0:sz ns0:val="18"/>
                 <ns0:szCs ns0:val="18"/>
               </ns0:rPr>
-              <ns0:t xml:space="preserve">Guild Brawl detected as regular Brawl for energy tracking (same energy source; score differs).</ns0:t>
+              <ns0:t xml:space="preserve">Brawl NameError: _brawl_card_states → _cl_card_states in live_sim_brawl.</ns0:t>
             </ns0:r>
           </ns0:p>
         </ns0:tc>
@@ -37256,7 +37432,7 @@
                 <ns0:sz ns0:val="18"/>
                 <ns0:szCs ns0:val="18"/>
               </ns0:rPr>
-              <ns0:t xml:space="preserve">Brawl start_time check — brawl not active before start_time; 3 detection points fixed.</ns0:t>
+              <ns0:t xml:space="preserve">Challenge fallback — Extreme PVP correctly used when Loyal is completed; F→24 uses same priority logic.</ns0:t>
             </ns0:r>
           </ns0:p>
         </ns0:tc>
@@ -37323,7 +37499,7 @@
                 <ns0:sz ns0:val="18"/>
                 <ns0:szCs ns0:val="18"/>
               </ns0:rPr>
-              <ns0:t xml:space="preserve">Brawl NameError: _brawl_card_states → _cl_card_states in live_sim_brawl.</ns0:t>
+              <ns0:t xml:space="preserve">Extreme PVP Challenge — deck selection by sub-challenge name (type-9), not linear step; parallel quest strands; type-9 filter accepts only names from EXTREME_CHALLENGES.</ns0:t>
             </ns0:r>
           </ns0:p>
         </ns0:tc>
@@ -37390,7 +37566,7 @@
                 <ns0:sz ns0:val="18"/>
                 <ns0:szCs ns0:val="18"/>
               </ns0:rPr>
-              <ns0:t xml:space="preserve">Challenge fallback — Extreme PVP correctly used when Loyal is completed; F→24 uses same priority logic.</ns0:t>
+              <ns0:t xml:space="preserve">Loyal Dominion (16) → Loyal Dominion to match API name.</ns0:t>
             </ns0:r>
           </ns0:p>
         </ns0:tc>
@@ -37457,7 +37633,7 @@
                 <ns0:sz ns0:val="18"/>
                 <ns0:szCs ns0:val="18"/>
               </ns0:rPr>
-              <ns0:t xml:space="preserve">Extreme PVP Challenge — deck selection by sub-challenge name (type-9), not linear step; parallel quest strands; type-9 filter accepts only names from EXTREME_CHALLENGES.</ns0:t>
+              <ns0:t xml:space="preserve">Commander auto-build for Loyal Challenge — checks inventory, builds via build_card(id) if not owned.</ns0:t>
             </ns0:r>
           </ns0:p>
         </ns0:tc>
@@ -37524,7 +37700,7 @@
                 <ns0:sz ns0:val="18"/>
                 <ns0:szCs ns0:val="18"/>
               </ns0:rPr>
-              <ns0:t xml:space="preserve">Loyal Dominion (16) → Loyal Dominion to match API name.</ns0:t>
+              <ns0:t xml:space="preserve">play_first override removed — TUO decides card order.</ns0:t>
             </ns0:r>
           </ns0:p>
         </ns0:tc>
@@ -37591,7 +37767,7 @@
                 <ns0:sz ns0:val="18"/>
                 <ns0:szCs ns0:val="18"/>
               </ns0:rPr>
-              <ns0:t xml:space="preserve">Commander auto-build for Loyal Challenge — checks inventory, builds via build_card(id) if not owned.</ns0:t>
+              <ns0:t xml:space="preserve">mimic_skill — real state flags not overwritten; trigger field metadata only; Mimic fires as normal activation.</ns0:t>
             </ns0:r>
           </ns0:p>
         </ns0:tc>
@@ -37658,7 +37834,7 @@
                 <ns0:sz ns0:val="18"/>
                 <ns0:szCs ns0:val="18"/>
               </ns0:rPr>
-              <ns0:t xml:space="preserve">play_first override removed — TUO decides card order.</ns0:t>
+              <ns0:t xml:space="preserve">sim.cpp — enhance_sabotage → Skill::sabotage; enhance_besiege → Skill::mortar.</ns0:t>
             </ns0:r>
           </ns0:p>
         </ns0:tc>
@@ -37725,7 +37901,7 @@
                 <ns0:sz ns0:val="18"/>
                 <ns0:szCs ns0:val="18"/>
               </ns0:rPr>
-              <ns0:t xml:space="preserve">mimic_skill — real state flags not overwritten; trigger field metadata only; Mimic fires as normal activation.</ns0:t>
+              <ns0:t xml:space="preserve">check_combat_log — enemy:hand uid 1-10 detection before deck-name matching; mimic_skill in _acs_to_flag_set for structure disambiguation.</ns0:t>
             </ns0:r>
           </ns0:p>
         </ns0:tc>
@@ -37740,7 +37916,7 @@
               <ns0:bottom ns0:val="single" ns0:color="CCCCCC" ns0:sz="1"/>
               <ns0:right ns0:val="single" ns0:color="CCCCCC" ns0:sz="1"/>
             </ns0:tcBorders>
-            <ns0:shd ns0:fill="D5E8F0" ns0:val="clear"/>
+            <ns0:shd ns0:fill="FCE4D6" ns0:val="clear"/>
             <ns0:tcMar>
               <ns0:top ns0:type="dxa" ns0:w="80"/>
               <ns0:left ns0:type="dxa" ns0:w="120"/>
@@ -37757,11 +37933,11 @@
                 <ns0:rFonts ns0:ascii="Arial" ns0:cs="Arial" ns0:hAnsi="Arial"/>
                 <ns0:b/>
                 <ns0:bCs/>
-                <ns0:color ns0:val="1F4E79"/>
-                <ns0:sz ns0:val="18"/>
-                <ns0:szCs ns0:val="18"/>
-              </ns0:rPr>
-              <ns0:t>FIX</ns0:t>
+                <ns0:color ns0:val="833C00"/>
+                <ns0:sz ns0:val="18"/>
+                <ns0:szCs ns0:val="18"/>
+              </ns0:rPr>
+              <ns0:t>CHANGE</ns0:t>
             </ns0:r>
           </ns0:p>
         </ns0:tc>
@@ -37792,7 +37968,7 @@
                 <ns0:sz ns0:val="18"/>
                 <ns0:szCs ns0:val="18"/>
               </ns0:rPr>
-              <ns0:t xml:space="preserve">sim.cpp — enhance_sabotage → Skill::sabotage; enhance_besiege → Skill::mortar.</ns0:t>
+              <ns0:t xml:space="preserve">Combat log field snapshot — removed barrier, attack_boost, corrosion, flurry_countdown, max_hp, hp_pct; logs now contain only uid, card_id, name, hp.</ns0:t>
             </ns0:r>
           </ns0:p>
         </ns0:tc>
@@ -37807,7 +37983,7 @@
               <ns0:bottom ns0:val="single" ns0:color="CCCCCC" ns0:sz="1"/>
               <ns0:right ns0:val="single" ns0:color="CCCCCC" ns0:sz="1"/>
             </ns0:tcBorders>
-            <ns0:shd ns0:fill="D5E8F0" ns0:val="clear"/>
+            <ns0:shd ns0:fill="E2EFDA" ns0:val="clear"/>
             <ns0:tcMar>
               <ns0:top ns0:type="dxa" ns0:w="80"/>
               <ns0:left ns0:type="dxa" ns0:w="120"/>
@@ -37824,141 +38000,7 @@
                 <ns0:rFonts ns0:ascii="Arial" ns0:cs="Arial" ns0:hAnsi="Arial"/>
                 <ns0:b/>
                 <ns0:bCs/>
-                <ns0:color ns0:val="1F4E79"/>
-                <ns0:sz ns0:val="18"/>
-                <ns0:szCs ns0:val="18"/>
-              </ns0:rPr>
-              <ns0:t>FIX</ns0:t>
-            </ns0:r>
-          </ns0:p>
-        </ns0:tc>
-        <ns0:tc>
-          <ns0:tcPr>
-            <ns0:tcW ns0:type="dxa" ns0:w="8460"/>
-            <ns0:tcBorders>
-              <ns0:top ns0:val="single" ns0:color="CCCCCC" ns0:sz="1"/>
-              <ns0:left ns0:val="single" ns0:color="CCCCCC" ns0:sz="1"/>
-              <ns0:bottom ns0:val="single" ns0:color="CCCCCC" ns0:sz="1"/>
-              <ns0:right ns0:val="single" ns0:color="CCCCCC" ns0:sz="1"/>
-            </ns0:tcBorders>
-            <ns0:shd ns0:fill="FFFFFF" ns0:val="clear"/>
-            <ns0:tcMar>
-              <ns0:top ns0:type="dxa" ns0:w="80"/>
-              <ns0:left ns0:type="dxa" ns0:w="120"/>
-              <ns0:bottom ns0:type="dxa" ns0:w="80"/>
-              <ns0:right ns0:type="dxa" ns0:w="120"/>
-            </ns0:tcMar>
-          </ns0:tcPr>
-          <ns0:p>
-            <ns0:pPr>
-              <ns0:spacing ns0:after="40" ns0:before="40"/>
-            </ns0:pPr>
-            <ns0:r>
-              <ns0:rPr>
-                <ns0:rFonts ns0:ascii="Arial" ns0:cs="Arial" ns0:hAnsi="Arial"/>
-                <ns0:sz ns0:val="18"/>
-                <ns0:szCs ns0:val="18"/>
-              </ns0:rPr>
-              <ns0:t xml:space="preserve">check_combat_log — enemy:hand uid 1-10 detection before deck-name matching; mimic_skill in _acs_to_flag_set for structure disambiguation.</ns0:t>
-            </ns0:r>
-          </ns0:p>
-        </ns0:tc>
-      </ns0:tr>
-      <ns0:tr>
-        <ns0:tc>
-          <ns0:tcPr>
-            <ns0:tcW ns0:type="dxa" ns0:w="900"/>
-            <ns0:tcBorders>
-              <ns0:top ns0:val="single" ns0:color="CCCCCC" ns0:sz="1"/>
-              <ns0:left ns0:val="single" ns0:color="CCCCCC" ns0:sz="1"/>
-              <ns0:bottom ns0:val="single" ns0:color="CCCCCC" ns0:sz="1"/>
-              <ns0:right ns0:val="single" ns0:color="CCCCCC" ns0:sz="1"/>
-            </ns0:tcBorders>
-            <ns0:shd ns0:fill="FCE4D6" ns0:val="clear"/>
-            <ns0:tcMar>
-              <ns0:top ns0:type="dxa" ns0:w="80"/>
-              <ns0:left ns0:type="dxa" ns0:w="120"/>
-              <ns0:bottom ns0:type="dxa" ns0:w="80"/>
-              <ns0:right ns0:type="dxa" ns0:w="120"/>
-            </ns0:tcMar>
-          </ns0:tcPr>
-          <ns0:p>
-            <ns0:pPr>
-              <ns0:spacing ns0:after="40" ns0:before="40"/>
-            </ns0:pPr>
-            <ns0:r>
-              <ns0:rPr>
-                <ns0:rFonts ns0:ascii="Arial" ns0:cs="Arial" ns0:hAnsi="Arial"/>
-                <ns0:b/>
-                <ns0:bCs/>
-                <ns0:color ns0:val="1F4E79"/>
-                <ns0:sz ns0:val="18"/>
-                <ns0:szCs ns0:val="18"/>
-              </ns0:rPr>
-              <ns0:t>CHANGE</ns0:t>
-            </ns0:r>
-          </ns0:p>
-        </ns0:tc>
-        <ns0:tc>
-          <ns0:tcPr>
-            <ns0:tcW ns0:type="dxa" ns0:w="8460"/>
-            <ns0:tcBorders>
-              <ns0:top ns0:val="single" ns0:color="CCCCCC" ns0:sz="1"/>
-              <ns0:left ns0:val="single" ns0:color="CCCCCC" ns0:sz="1"/>
-              <ns0:bottom ns0:val="single" ns0:color="CCCCCC" ns0:sz="1"/>
-              <ns0:right ns0:val="single" ns0:color="CCCCCC" ns0:sz="1"/>
-            </ns0:tcBorders>
-            <ns0:shd ns0:fill="FFFFFF" ns0:val="clear"/>
-            <ns0:tcMar>
-              <ns0:top ns0:type="dxa" ns0:w="80"/>
-              <ns0:left ns0:type="dxa" ns0:w="120"/>
-              <ns0:bottom ns0:type="dxa" ns0:w="80"/>
-              <ns0:right ns0:type="dxa" ns0:w="120"/>
-            </ns0:tcMar>
-          </ns0:tcPr>
-          <ns0:p>
-            <ns0:pPr>
-              <ns0:spacing ns0:after="40" ns0:before="40"/>
-            </ns0:pPr>
-            <ns0:r>
-              <ns0:rPr>
-                <ns0:rFonts ns0:ascii="Arial" ns0:cs="Arial" ns0:hAnsi="Arial"/>
-                <ns0:sz ns0:val="18"/>
-                <ns0:szCs ns0:val="18"/>
-              </ns0:rPr>
-              <ns0:t xml:space="preserve">Combat log field snapshot — removed barrier, attack_boost, corrosion, flurry_countdown, max_hp, hp_pct; logs now contain only uid, card_id, name, hp.</ns0:t>
-            </ns0:r>
-          </ns0:p>
-        </ns0:tc>
-      </ns0:tr>
-      <ns0:tr>
-        <ns0:tc>
-          <ns0:tcPr>
-            <ns0:tcW ns0:type="dxa" ns0:w="900"/>
-            <ns0:tcBorders>
-              <ns0:top ns0:val="single" ns0:color="CCCCCC" ns0:sz="1"/>
-              <ns0:left ns0:val="single" ns0:color="CCCCCC" ns0:sz="1"/>
-              <ns0:bottom ns0:val="single" ns0:color="CCCCCC" ns0:sz="1"/>
-              <ns0:right ns0:val="single" ns0:color="CCCCCC" ns0:sz="1"/>
-            </ns0:tcBorders>
-            <ns0:shd ns0:fill="E2EFDA" ns0:val="clear"/>
-            <ns0:tcMar>
-              <ns0:top ns0:type="dxa" ns0:w="80"/>
-              <ns0:left ns0:type="dxa" ns0:w="120"/>
-              <ns0:bottom ns0:type="dxa" ns0:w="80"/>
-              <ns0:right ns0:type="dxa" ns0:w="120"/>
-            </ns0:tcMar>
-          </ns0:tcPr>
-          <ns0:p>
-            <ns0:pPr>
-              <ns0:spacing ns0:after="40" ns0:before="40"/>
-            </ns0:pPr>
-            <ns0:r>
-              <ns0:rPr>
-                <ns0:rFonts ns0:ascii="Arial" ns0:cs="Arial" ns0:hAnsi="Arial"/>
-                <ns0:b/>
-                <ns0:bCs/>
-                <ns0:color ns0:val="1F4E79"/>
+                <ns0:color ns0:val="375623"/>
                 <ns0:sz ns0:val="18"/>
                 <ns0:szCs ns0:val="18"/>
               </ns0:rPr>
@@ -42246,6 +42288,73 @@
               <ns0:bottom ns0:val="single" ns0:color="CCCCCC" ns0:sz="1"/>
               <ns0:right ns0:val="single" ns0:color="CCCCCC" ns0:sz="1"/>
             </ns0:tcBorders>
+            <ns0:shd ns0:fill="E2EFDA" ns0:val="clear"/>
+            <ns0:tcMar>
+              <ns0:top ns0:type="dxa" ns0:w="80"/>
+              <ns0:left ns0:type="dxa" ns0:w="120"/>
+              <ns0:bottom ns0:type="dxa" ns0:w="80"/>
+              <ns0:right ns0:type="dxa" ns0:w="120"/>
+            </ns0:tcMar>
+          </ns0:tcPr>
+          <ns0:p>
+            <ns0:pPr>
+              <ns0:spacing ns0:after="40" ns0:before="40"/>
+            </ns0:pPr>
+            <ns0:r>
+              <ns0:rPr>
+                <ns0:rFonts ns0:ascii="Arial" ns0:cs="Arial" ns0:eastAsia="Arial" ns0:hAnsi="Arial"/>
+                <ns0:b/>
+                <ns0:bCs/>
+                <ns0:color ns0:val="375623"/>
+                <ns0:sz ns0:val="18"/>
+                <ns0:szCs ns0:val="18"/>
+              </ns0:rPr>
+              <ns0:t>NEW</ns0:t>
+            </ns0:r>
+          </ns0:p>
+        </ns0:tc>
+        <ns0:tc>
+          <ns0:tcPr>
+            <ns0:tcW ns0:type="dxa" ns0:w="8460"/>
+            <ns0:tcBorders>
+              <ns0:top ns0:val="single" ns0:color="CCCCCC" ns0:sz="1"/>
+              <ns0:left ns0:val="single" ns0:color="CCCCCC" ns0:sz="1"/>
+              <ns0:bottom ns0:val="single" ns0:color="CCCCCC" ns0:sz="1"/>
+              <ns0:right ns0:val="single" ns0:color="CCCCCC" ns0:sz="1"/>
+            </ns0:tcBorders>
+            <ns0:shd ns0:fill="FFFFFF" ns0:val="clear"/>
+            <ns0:tcMar>
+              <ns0:top ns0:type="dxa" ns0:w="80"/>
+              <ns0:left ns0:type="dxa" ns0:w="120"/>
+              <ns0:bottom ns0:type="dxa" ns0:w="80"/>
+              <ns0:right ns0:type="dxa" ns0:w="120"/>
+            </ns0:tcMar>
+          </ns0:tcPr>
+          <ns0:p>
+            <ns0:pPr>
+              <ns0:spacing ns0:after="40" ns0:before="40"/>
+            </ns0:pPr>
+            <ns0:r>
+              <ns0:rPr>
+                <ns0:rFonts ns0:ascii="Arial" ns0:cs="Arial" ns0:eastAsia="Arial" ns0:hAnsi="Arial"/>
+                <ns0:sz ns0:val="18"/>
+                <ns0:szCs ns0:val="18"/>
+              </ns0:rPr>
+              <ns0:t>Active Events (Option 2) — Placement Brawl Display — Placement Brawls (event name contains "placement") now shown with dedicated layout: icon 🎯, single energy bar "Energy: X/25 used" (no Current/Regen/Wasted lines), info line "Placement Brawl – guild score sets GW start position". Leaderboard always shown as guild leaderboard. Own guild ⭐ marker now uses user_data.faction_id as fallback when player dict lacks faction_id.</ns0:t>
+            </ns0:r>
+          </ns0:p>
+        </ns0:tc>
+      </ns0:tr>
+      <ns0:tr>
+        <ns0:tc>
+          <ns0:tcPr>
+            <ns0:tcW ns0:type="dxa" ns0:w="900"/>
+            <ns0:tcBorders>
+              <ns0:top ns0:val="single" ns0:color="CCCCCC" ns0:sz="1"/>
+              <ns0:left ns0:val="single" ns0:color="CCCCCC" ns0:sz="1"/>
+              <ns0:bottom ns0:val="single" ns0:color="CCCCCC" ns0:sz="1"/>
+              <ns0:right ns0:val="single" ns0:color="CCCCCC" ns0:sz="1"/>
+            </ns0:tcBorders>
             <ns0:shd ns0:fill="D5E8F0" ns0:val="clear"/>
             <ns0:tcMar>
               <ns0:top ns0:type="dxa" ns0:w="80"/>
@@ -42267,7 +42376,7 @@
                 <ns0:sz ns0:val="18"/>
                 <ns0:szCs ns0:val="18"/>
               </ns0:rPr>
-              <ns0:t>NEW</ns0:t>
+              <ns0:t>FIX</ns0:t>
             </ns0:r>
           </ns0:p>
         </ns0:tc>
@@ -42298,7 +42407,7 @@
                 <ns0:sz ns0:val="18"/>
                 <ns0:szCs ns0:val="18"/>
               </ns0:rPr>
-              <ns0:t>Active Events (Option 2) — Placement Brawl Display — Placement Brawls (event name contains "placement") now shown with dedicated layout: icon 🎯, single energy bar "Energy: X/25 used" (no Current/Regen/Wasted lines), info line "Placement Brawl – guild score sets GW start position". Leaderboard always shown as guild leaderboard. Own guild ⭐ marker now uses user_data.faction_id as fallback when player dict lacks faction_id.</ns0:t>
+              <ns0:t>Claim Event Rewards — Wrong Endpoint — Guild War rewards endpoint was incorrectly named claimGuildwarRewards. Corrected to claimFactionWarRewards (confirmed from HAR capture). All-accounts claim now works for Guild War.</ns0:t>
             </ns0:r>
           </ns0:p>
         </ns0:tc>
@@ -42365,7 +42474,7 @@
                 <ns0:sz ns0:val="18"/>
                 <ns0:szCs ns0:val="18"/>
               </ns0:rPr>
-              <ns0:t>Claim Event Rewards — Wrong Endpoint — Guild War rewards endpoint was incorrectly named claimGuildwarRewards. Corrected to claimFactionWarRewards (confirmed from HAR capture). All-accounts claim now works for Guild War.</ns0:t>
+              <ns0:t>Guild War Summary (F → 23) — Multiple NameErrors — _os/_glob aliases replaced with os/glob; import glob as _glob added as module-level alias; CSS now loaded from generate_war_html.py at runtime via importlib with minimal fallback; JS_INLINE promoted to TyrantCommander class constant (was local variable in guild_war_tracker only); import datetime as _dt added to generate_war_summary local imports.</ns0:t>
             </ns0:r>
           </ns0:p>
         </ns0:tc>
@@ -42380,7 +42489,7 @@
               <ns0:bottom ns0:val="single" ns0:color="CCCCCC" ns0:sz="1"/>
               <ns0:right ns0:val="single" ns0:color="CCCCCC" ns0:sz="1"/>
             </ns0:tcBorders>
-            <ns0:shd ns0:fill="D5E8F0" ns0:val="clear"/>
+            <ns0:shd ns0:fill="FCE4D6" ns0:val="clear"/>
             <ns0:tcMar>
               <ns0:top ns0:type="dxa" ns0:w="80"/>
               <ns0:left ns0:type="dxa" ns0:w="120"/>
@@ -42397,74 +42506,7 @@
                 <ns0:rFonts ns0:ascii="Arial" ns0:cs="Arial" ns0:eastAsia="Arial" ns0:hAnsi="Arial"/>
                 <ns0:b/>
                 <ns0:bCs/>
-                <ns0:color ns0:val="1F4E79"/>
-                <ns0:sz ns0:val="18"/>
-                <ns0:szCs ns0:val="18"/>
-              </ns0:rPr>
-              <ns0:t>FIX</ns0:t>
-            </ns0:r>
-          </ns0:p>
-        </ns0:tc>
-        <ns0:tc>
-          <ns0:tcPr>
-            <ns0:tcW ns0:type="dxa" ns0:w="8460"/>
-            <ns0:tcBorders>
-              <ns0:top ns0:val="single" ns0:color="CCCCCC" ns0:sz="1"/>
-              <ns0:left ns0:val="single" ns0:color="CCCCCC" ns0:sz="1"/>
-              <ns0:bottom ns0:val="single" ns0:color="CCCCCC" ns0:sz="1"/>
-              <ns0:right ns0:val="single" ns0:color="CCCCCC" ns0:sz="1"/>
-            </ns0:tcBorders>
-            <ns0:shd ns0:fill="FFFFFF" ns0:val="clear"/>
-            <ns0:tcMar>
-              <ns0:top ns0:type="dxa" ns0:w="80"/>
-              <ns0:left ns0:type="dxa" ns0:w="120"/>
-              <ns0:bottom ns0:type="dxa" ns0:w="80"/>
-              <ns0:right ns0:type="dxa" ns0:w="120"/>
-            </ns0:tcMar>
-          </ns0:tcPr>
-          <ns0:p>
-            <ns0:pPr>
-              <ns0:spacing ns0:after="40" ns0:before="40"/>
-            </ns0:pPr>
-            <ns0:r>
-              <ns0:rPr>
-                <ns0:rFonts ns0:ascii="Arial" ns0:cs="Arial" ns0:eastAsia="Arial" ns0:hAnsi="Arial"/>
-                <ns0:sz ns0:val="18"/>
-                <ns0:szCs ns0:val="18"/>
-              </ns0:rPr>
-              <ns0:t>Guild War Summary (F → 23) — Multiple NameErrors — _os/_glob aliases replaced with os/glob; import glob as _glob added as module-level alias; CSS now loaded from generate_war_html.py at runtime via importlib with minimal fallback; JS_INLINE promoted to TyrantCommander class constant (was local variable in guild_war_tracker only); import datetime as _dt added to generate_war_summary local imports.</ns0:t>
-            </ns0:r>
-          </ns0:p>
-        </ns0:tc>
-      </ns0:tr>
-      <ns0:tr>
-        <ns0:tc>
-          <ns0:tcPr>
-            <ns0:tcW ns0:type="dxa" ns0:w="900"/>
-            <ns0:tcBorders>
-              <ns0:top ns0:val="single" ns0:color="CCCCCC" ns0:sz="1"/>
-              <ns0:left ns0:val="single" ns0:color="CCCCCC" ns0:sz="1"/>
-              <ns0:bottom ns0:val="single" ns0:color="CCCCCC" ns0:sz="1"/>
-              <ns0:right ns0:val="single" ns0:color="CCCCCC" ns0:sz="1"/>
-            </ns0:tcBorders>
-            <ns0:shd ns0:fill="D5E8F0" ns0:val="clear"/>
-            <ns0:tcMar>
-              <ns0:top ns0:type="dxa" ns0:w="80"/>
-              <ns0:left ns0:type="dxa" ns0:w="120"/>
-              <ns0:bottom ns0:type="dxa" ns0:w="80"/>
-              <ns0:right ns0:type="dxa" ns0:w="120"/>
-            </ns0:tcMar>
-          </ns0:tcPr>
-          <ns0:p>
-            <ns0:pPr>
-              <ns0:spacing ns0:after="40" ns0:before="40"/>
-            </ns0:pPr>
-            <ns0:r>
-              <ns0:rPr>
-                <ns0:rFonts ns0:ascii="Arial" ns0:cs="Arial" ns0:eastAsia="Arial" ns0:hAnsi="Arial"/>
-                <ns0:b/>
-                <ns0:bCs/>
-                <ns0:color ns0:val="1F4E79"/>
+                <ns0:color ns0:val="833C00"/>
                 <ns0:sz ns0:val="18"/>
                 <ns0:szCs ns0:val="18"/>
               </ns0:rPr>

</xml_diff>